<commit_message>
Completed Week 6 and Week 7 practical tasks with log book update
</commit_message>
<xml_diff>
--- a/log book-Advanced web.docx
+++ b/log book-Advanced web.docx
@@ -5369,8 +5369,1495 @@
           <w:rFonts w:ascii="Times New Roman" w:hAnsi="Times New Roman"/>
         </w:rPr>
       </w:pPr>
+      <w:r>
+        <w:rPr>
+          <w:rFonts w:ascii="Times New Roman" w:hAnsi="Times New Roman"/>
+        </w:rPr>
+        <w:t xml:space="preserve"> </w:t>
+      </w:r>
+    </w:p>
+    <w:p>
+      <w:pPr>
+        <w:spacing w:after="100" w:afterAutospacing="1"/>
+        <w:outlineLvl w:val="1"/>
+        <w:rPr>
+          <w:rFonts w:ascii="Times New Roman" w:hAnsi="Times New Roman"/>
+          <w:b/>
+          <w:bCs/>
+          <w:sz w:val="28"/>
+          <w:szCs w:val="28"/>
+        </w:rPr>
+      </w:pPr>
+      <w:r>
+        <w:rPr>
+          <w:rFonts w:ascii="Times New Roman" w:hAnsi="Times New Roman"/>
+          <w:b/>
+          <w:bCs/>
+          <w:sz w:val="28"/>
+          <w:szCs w:val="28"/>
+        </w:rPr>
+        <w:t>Week 6: Database Integration and CRUD Operations</w:t>
+      </w:r>
+    </w:p>
+    <w:p>
+      <w:pPr>
+        <w:spacing w:after="100" w:afterAutospacing="1"/>
+        <w:outlineLvl w:val="1"/>
+        <w:rPr>
+          <w:rFonts w:ascii="Times New Roman" w:hAnsi="Times New Roman"/>
+          <w:b/>
+          <w:bCs/>
+          <w:kern w:val="0"/>
+        </w:rPr>
+      </w:pPr>
+      <w:r>
+        <w:rPr>
+          <w:rFonts w:ascii="Times New Roman" w:hAnsi="Times New Roman"/>
+          <w:b/>
+          <w:bCs/>
+          <w:kern w:val="0"/>
+        </w:rPr>
+        <w:lastRenderedPageBreak/>
+        <w:t>Create</w:t>
+      </w:r>
+    </w:p>
+    <w:p>
+      <w:pPr>
+        <w:rPr>
+          <w:rFonts w:ascii="Times New Roman" w:hAnsi="Times New Roman"/>
+        </w:rPr>
+      </w:pPr>
+      <w:r>
+        <w:rPr>
+          <w:rFonts w:ascii="Times New Roman" w:hAnsi="Times New Roman"/>
+        </w:rPr>
+        <w:drawing>
+          <wp:inline distT="0" distB="0" distL="0" distR="0" wp14:anchorId="49A9DD8D" wp14:editId="403B10E9">
+            <wp:extent cx="5943600" cy="2026920"/>
+            <wp:effectExtent l="0" t="0" r="0" b="0"/>
+            <wp:docPr id="13" name="Picture 13"/>
+            <wp:cNvGraphicFramePr>
+              <a:graphicFrameLocks xmlns:a="http://schemas.openxmlformats.org/drawingml/2006/main" noChangeAspect="1"/>
+            </wp:cNvGraphicFramePr>
+            <a:graphic xmlns:a="http://schemas.openxmlformats.org/drawingml/2006/main">
+              <a:graphicData uri="http://schemas.openxmlformats.org/drawingml/2006/picture">
+                <pic:pic xmlns:pic="http://schemas.openxmlformats.org/drawingml/2006/picture">
+                  <pic:nvPicPr>
+                    <pic:cNvPr id="1" name=""/>
+                    <pic:cNvPicPr/>
+                  </pic:nvPicPr>
+                  <pic:blipFill>
+                    <a:blip r:embed="rId34"/>
+                    <a:stretch>
+                      <a:fillRect/>
+                    </a:stretch>
+                  </pic:blipFill>
+                  <pic:spPr>
+                    <a:xfrm>
+                      <a:off x="0" y="0"/>
+                      <a:ext cx="5943600" cy="2026920"/>
+                    </a:xfrm>
+                    <a:prstGeom prst="rect">
+                      <a:avLst/>
+                    </a:prstGeom>
+                  </pic:spPr>
+                </pic:pic>
+              </a:graphicData>
+            </a:graphic>
+          </wp:inline>
+        </w:drawing>
+      </w:r>
+    </w:p>
+    <w:p>
+      <w:pPr>
+        <w:rPr>
+          <w:rFonts w:ascii="Times New Roman" w:hAnsi="Times New Roman"/>
+          <w:b/>
+        </w:rPr>
+      </w:pPr>
+      <w:r>
+        <w:rPr>
+          <w:rFonts w:ascii="Times New Roman" w:hAnsi="Times New Roman"/>
+          <w:b/>
+        </w:rPr>
+        <w:t>Read</w:t>
+      </w:r>
+    </w:p>
+    <w:p>
+      <w:pPr>
+        <w:rPr>
+          <w:rFonts w:ascii="Times New Roman" w:hAnsi="Times New Roman"/>
+        </w:rPr>
+      </w:pPr>
+      <w:r>
+        <w:rPr>
+          <w:rFonts w:ascii="Times New Roman" w:hAnsi="Times New Roman"/>
+        </w:rPr>
+        <w:drawing>
+          <wp:inline distT="0" distB="0" distL="0" distR="0" wp14:anchorId="614616B7" wp14:editId="1575320C">
+            <wp:extent cx="5943600" cy="1214755"/>
+            <wp:effectExtent l="0" t="0" r="0" b="4445"/>
+            <wp:docPr id="15" name="Picture 15"/>
+            <wp:cNvGraphicFramePr>
+              <a:graphicFrameLocks xmlns:a="http://schemas.openxmlformats.org/drawingml/2006/main" noChangeAspect="1"/>
+            </wp:cNvGraphicFramePr>
+            <a:graphic xmlns:a="http://schemas.openxmlformats.org/drawingml/2006/main">
+              <a:graphicData uri="http://schemas.openxmlformats.org/drawingml/2006/picture">
+                <pic:pic xmlns:pic="http://schemas.openxmlformats.org/drawingml/2006/picture">
+                  <pic:nvPicPr>
+                    <pic:cNvPr id="1" name=""/>
+                    <pic:cNvPicPr/>
+                  </pic:nvPicPr>
+                  <pic:blipFill>
+                    <a:blip r:embed="rId35"/>
+                    <a:stretch>
+                      <a:fillRect/>
+                    </a:stretch>
+                  </pic:blipFill>
+                  <pic:spPr>
+                    <a:xfrm>
+                      <a:off x="0" y="0"/>
+                      <a:ext cx="5943600" cy="1214755"/>
+                    </a:xfrm>
+                    <a:prstGeom prst="rect">
+                      <a:avLst/>
+                    </a:prstGeom>
+                  </pic:spPr>
+                </pic:pic>
+              </a:graphicData>
+            </a:graphic>
+          </wp:inline>
+        </w:drawing>
+      </w:r>
+    </w:p>
+    <w:p>
+      <w:pPr>
+        <w:rPr>
+          <w:rFonts w:ascii="Times New Roman" w:hAnsi="Times New Roman"/>
+          <w:b/>
+        </w:rPr>
+      </w:pPr>
+      <w:r>
+        <w:rPr>
+          <w:rFonts w:ascii="Times New Roman" w:hAnsi="Times New Roman"/>
+          <w:b/>
+        </w:rPr>
+        <w:t>Update</w:t>
+      </w:r>
+    </w:p>
+    <w:p>
+      <w:pPr>
+        <w:rPr>
+          <w:rFonts w:ascii="Times New Roman" w:hAnsi="Times New Roman"/>
+        </w:rPr>
+      </w:pPr>
+      <w:r>
+        <w:rPr>
+          <w:rFonts w:ascii="Times New Roman" w:hAnsi="Times New Roman"/>
+        </w:rPr>
+        <w:drawing>
+          <wp:inline distT="0" distB="0" distL="0" distR="0" wp14:anchorId="5914873A" wp14:editId="7E5A264F">
+            <wp:extent cx="3858163" cy="3010320"/>
+            <wp:effectExtent l="0" t="0" r="9525" b="0"/>
+            <wp:docPr id="19" name="Picture 19"/>
+            <wp:cNvGraphicFramePr>
+              <a:graphicFrameLocks xmlns:a="http://schemas.openxmlformats.org/drawingml/2006/main" noChangeAspect="1"/>
+            </wp:cNvGraphicFramePr>
+            <a:graphic xmlns:a="http://schemas.openxmlformats.org/drawingml/2006/main">
+              <a:graphicData uri="http://schemas.openxmlformats.org/drawingml/2006/picture">
+                <pic:pic xmlns:pic="http://schemas.openxmlformats.org/drawingml/2006/picture">
+                  <pic:nvPicPr>
+                    <pic:cNvPr id="1" name=""/>
+                    <pic:cNvPicPr/>
+                  </pic:nvPicPr>
+                  <pic:blipFill>
+                    <a:blip r:embed="rId36"/>
+                    <a:stretch>
+                      <a:fillRect/>
+                    </a:stretch>
+                  </pic:blipFill>
+                  <pic:spPr>
+                    <a:xfrm>
+                      <a:off x="0" y="0"/>
+                      <a:ext cx="3858163" cy="3010320"/>
+                    </a:xfrm>
+                    <a:prstGeom prst="rect">
+                      <a:avLst/>
+                    </a:prstGeom>
+                  </pic:spPr>
+                </pic:pic>
+              </a:graphicData>
+            </a:graphic>
+          </wp:inline>
+        </w:drawing>
+      </w:r>
+    </w:p>
+    <w:p>
+      <w:pPr>
+        <w:rPr>
+          <w:rFonts w:ascii="Times New Roman" w:hAnsi="Times New Roman"/>
+          <w:b/>
+        </w:rPr>
+      </w:pPr>
+      <w:r>
+        <w:rPr>
+          <w:rFonts w:ascii="Times New Roman" w:hAnsi="Times New Roman"/>
+          <w:b/>
+        </w:rPr>
+        <w:t>Delete</w:t>
+      </w:r>
+    </w:p>
+    <w:p>
+      <w:pPr>
+        <w:rPr>
+          <w:rFonts w:ascii="Times New Roman" w:hAnsi="Times New Roman"/>
+        </w:rPr>
+      </w:pPr>
+      <w:r>
+        <w:rPr>
+          <w:rFonts w:ascii="Times New Roman" w:hAnsi="Times New Roman"/>
+        </w:rPr>
+        <w:lastRenderedPageBreak/>
+        <w:drawing>
+          <wp:anchor distT="0" distB="0" distL="114300" distR="114300" simplePos="0" relativeHeight="251658240" behindDoc="0" locked="0" layoutInCell="1" allowOverlap="1" wp14:anchorId="6B0912AD">
+            <wp:simplePos x="914400" y="914400"/>
+            <wp:positionH relativeFrom="column">
+              <wp:align>left</wp:align>
+            </wp:positionH>
+            <wp:positionV relativeFrom="paragraph">
+              <wp:align>top</wp:align>
+            </wp:positionV>
+            <wp:extent cx="4448796" cy="2152950"/>
+            <wp:effectExtent l="0" t="0" r="9525" b="0"/>
+            <wp:wrapSquare wrapText="bothSides"/>
+            <wp:docPr id="23" name="Picture 23"/>
+            <wp:cNvGraphicFramePr>
+              <a:graphicFrameLocks xmlns:a="http://schemas.openxmlformats.org/drawingml/2006/main" noChangeAspect="1"/>
+            </wp:cNvGraphicFramePr>
+            <a:graphic xmlns:a="http://schemas.openxmlformats.org/drawingml/2006/main">
+              <a:graphicData uri="http://schemas.openxmlformats.org/drawingml/2006/picture">
+                <pic:pic xmlns:pic="http://schemas.openxmlformats.org/drawingml/2006/picture">
+                  <pic:nvPicPr>
+                    <pic:cNvPr id="1" name=""/>
+                    <pic:cNvPicPr/>
+                  </pic:nvPicPr>
+                  <pic:blipFill>
+                    <a:blip r:embed="rId37">
+                      <a:extLst>
+                        <a:ext uri="{28A0092B-C50C-407E-A947-70E740481C1C}">
+                          <a14:useLocalDpi xmlns:a14="http://schemas.microsoft.com/office/drawing/2010/main" val="0"/>
+                        </a:ext>
+                      </a:extLst>
+                    </a:blip>
+                    <a:stretch>
+                      <a:fillRect/>
+                    </a:stretch>
+                  </pic:blipFill>
+                  <pic:spPr>
+                    <a:xfrm>
+                      <a:off x="0" y="0"/>
+                      <a:ext cx="4448796" cy="2152950"/>
+                    </a:xfrm>
+                    <a:prstGeom prst="rect">
+                      <a:avLst/>
+                    </a:prstGeom>
+                  </pic:spPr>
+                </pic:pic>
+              </a:graphicData>
+            </a:graphic>
+          </wp:anchor>
+        </w:drawing>
+      </w:r>
+      <w:r>
+        <w:rPr>
+          <w:rFonts w:ascii="Times New Roman" w:hAnsi="Times New Roman"/>
+        </w:rPr>
+        <w:br w:type="textWrapping" w:clear="all"/>
+      </w:r>
+    </w:p>
+    <w:p>
+      <w:pPr>
+        <w:rPr>
+          <w:rFonts w:ascii="Times New Roman" w:hAnsi="Times New Roman"/>
+          <w:b/>
+        </w:rPr>
+      </w:pPr>
+      <w:r>
+        <w:rPr>
+          <w:rFonts w:ascii="Times New Roman" w:hAnsi="Times New Roman"/>
+          <w:b/>
+        </w:rPr>
+        <w:t>Student Reflection</w:t>
+      </w:r>
+    </w:p>
+    <w:p>
+      <w:pPr>
+        <w:spacing w:after="100" w:afterAutospacing="1"/>
+        <w:rPr>
+          <w:rFonts w:ascii="Times New Roman" w:hAnsi="Times New Roman"/>
+          <w:kern w:val="0"/>
+        </w:rPr>
+      </w:pPr>
+      <w:r>
+        <w:rPr>
+          <w:rFonts w:ascii="Times New Roman" w:hAnsi="Times New Roman"/>
+        </w:rPr>
+        <w:t>Develop</w:t>
+      </w:r>
+      <w:r>
+        <w:rPr>
+          <w:rFonts w:ascii="Times New Roman" w:hAnsi="Times New Roman"/>
+        </w:rPr>
+        <w:t>ed</w:t>
+      </w:r>
+      <w:r>
+        <w:rPr>
+          <w:rFonts w:ascii="Times New Roman" w:hAnsi="Times New Roman"/>
+        </w:rPr>
+        <w:t xml:space="preserve"> a mini Student Management System that can:</w:t>
+      </w:r>
+    </w:p>
+    <w:p>
+      <w:pPr>
+        <w:numPr>
+          <w:ilvl w:val="0"/>
+          <w:numId w:val="2"/>
+        </w:numPr>
+        <w:tabs>
+          <w:tab w:val="left" w:pos="720"/>
+        </w:tabs>
+        <w:spacing w:after="100" w:afterAutospacing="1" w:line="256" w:lineRule="auto"/>
+        <w:rPr>
+          <w:rFonts w:ascii="Times New Roman" w:hAnsi="Times New Roman"/>
+        </w:rPr>
+      </w:pPr>
+      <w:r>
+        <w:rPr>
+          <w:rFonts w:ascii="Times New Roman" w:hAnsi="Times New Roman"/>
+        </w:rPr>
+        <w:t>Add students</w:t>
+      </w:r>
+    </w:p>
+    <w:p>
+      <w:pPr>
+        <w:numPr>
+          <w:ilvl w:val="0"/>
+          <w:numId w:val="2"/>
+        </w:numPr>
+        <w:tabs>
+          <w:tab w:val="left" w:pos="720"/>
+        </w:tabs>
+        <w:spacing w:after="100" w:afterAutospacing="1" w:line="256" w:lineRule="auto"/>
+        <w:rPr>
+          <w:rFonts w:ascii="Times New Roman" w:hAnsi="Times New Roman"/>
+        </w:rPr>
+      </w:pPr>
+      <w:r>
+        <w:rPr>
+          <w:rFonts w:ascii="Times New Roman" w:hAnsi="Times New Roman"/>
+        </w:rPr>
+        <w:t>View students</w:t>
+      </w:r>
+    </w:p>
+    <w:p>
+      <w:pPr>
+        <w:numPr>
+          <w:ilvl w:val="0"/>
+          <w:numId w:val="2"/>
+        </w:numPr>
+        <w:tabs>
+          <w:tab w:val="left" w:pos="720"/>
+        </w:tabs>
+        <w:spacing w:after="100" w:afterAutospacing="1" w:line="256" w:lineRule="auto"/>
+        <w:rPr>
+          <w:rFonts w:ascii="Times New Roman" w:hAnsi="Times New Roman"/>
+        </w:rPr>
+      </w:pPr>
+      <w:r>
+        <w:rPr>
+          <w:rFonts w:ascii="Times New Roman" w:hAnsi="Times New Roman"/>
+        </w:rPr>
+        <w:t>Edit student information</w:t>
+      </w:r>
+    </w:p>
+    <w:p>
+      <w:pPr>
+        <w:numPr>
+          <w:ilvl w:val="0"/>
+          <w:numId w:val="2"/>
+        </w:numPr>
+        <w:tabs>
+          <w:tab w:val="left" w:pos="720"/>
+        </w:tabs>
+        <w:spacing w:after="100" w:afterAutospacing="1" w:line="256" w:lineRule="auto"/>
+        <w:rPr>
+          <w:rFonts w:ascii="Times New Roman" w:hAnsi="Times New Roman"/>
+        </w:rPr>
+      </w:pPr>
+      <w:r>
+        <w:rPr>
+          <w:rFonts w:ascii="Times New Roman" w:hAnsi="Times New Roman"/>
+        </w:rPr>
+        <w:t>Delete students</w:t>
+      </w:r>
+    </w:p>
+    <w:p>
+      <w:pPr>
+        <w:rPr>
+          <w:rFonts w:ascii="Times New Roman" w:hAnsi="Times New Roman"/>
+          <w:b/>
+        </w:rPr>
+      </w:pPr>
+    </w:p>
+    <w:p>
+      <w:pPr>
+        <w:spacing w:after="100" w:afterAutospacing="1"/>
+        <w:outlineLvl w:val="0"/>
+        <w:rPr>
+          <w:rFonts w:ascii="Times New Roman" w:hAnsi="Times New Roman"/>
+          <w:b/>
+          <w:bCs/>
+          <w:kern w:val="36"/>
+          <w:sz w:val="28"/>
+          <w:szCs w:val="28"/>
+        </w:rPr>
+      </w:pPr>
+      <w:r>
+        <w:rPr>
+          <w:rFonts w:ascii="Times New Roman" w:hAnsi="Times New Roman"/>
+          <w:b/>
+          <w:bCs/>
+          <w:kern w:val="36"/>
+          <w:sz w:val="28"/>
+          <w:szCs w:val="28"/>
+        </w:rPr>
+        <w:t>Week 7: User Authentication and Session Management</w:t>
+      </w:r>
+    </w:p>
+    <w:p>
+      <w:pPr>
+        <w:spacing w:after="100" w:afterAutospacing="1"/>
+        <w:outlineLvl w:val="0"/>
+        <w:rPr>
+          <w:rFonts w:ascii="Times New Roman" w:hAnsi="Times New Roman"/>
+          <w:b/>
+          <w:bCs/>
+          <w:kern w:val="36"/>
+          <w:sz w:val="28"/>
+          <w:szCs w:val="28"/>
+        </w:rPr>
+      </w:pPr>
+      <w:r>
+        <w:rPr>
+          <w:rFonts w:ascii="Times New Roman" w:hAnsi="Times New Roman"/>
+          <w:b/>
+          <w:bCs/>
+          <w:kern w:val="36"/>
+          <w:sz w:val="28"/>
+          <w:szCs w:val="28"/>
+        </w:rPr>
+        <w:t>Practical Task 1</w:t>
+      </w:r>
+    </w:p>
+    <w:p>
+      <w:pPr>
+        <w:spacing w:after="100" w:afterAutospacing="1"/>
+        <w:outlineLvl w:val="1"/>
+        <w:rPr>
+          <w:rFonts w:ascii="Times New Roman" w:hAnsi="Times New Roman"/>
+          <w:b/>
+          <w:bCs/>
+          <w:sz w:val="28"/>
+          <w:szCs w:val="28"/>
+        </w:rPr>
+      </w:pPr>
+      <w:r>
+        <w:rPr>
+          <w:rFonts w:ascii="Times New Roman" w:hAnsi="Times New Roman"/>
+          <w:b/>
+          <w:bCs/>
+          <w:sz w:val="28"/>
+          <w:szCs w:val="28"/>
+        </w:rPr>
+        <w:t>Student Portal Login System</w:t>
+      </w:r>
+    </w:p>
+    <w:p>
+      <w:pPr>
+        <w:spacing w:after="100" w:afterAutospacing="1"/>
+        <w:outlineLvl w:val="1"/>
+        <w:rPr>
+          <w:rFonts w:ascii="Times New Roman" w:hAnsi="Times New Roman"/>
+          <w:b/>
+          <w:bCs/>
+          <w:kern w:val="0"/>
+          <w:sz w:val="36"/>
+          <w:szCs w:val="36"/>
+        </w:rPr>
+      </w:pPr>
+    </w:p>
+    <w:p>
+      <w:pPr>
+        <w:spacing w:after="100" w:afterAutospacing="1"/>
+        <w:outlineLvl w:val="0"/>
+        <w:rPr>
+          <w:rFonts w:ascii="Times New Roman" w:hAnsi="Times New Roman"/>
+          <w:b/>
+          <w:bCs/>
+          <w:kern w:val="36"/>
+          <w:sz w:val="28"/>
+          <w:szCs w:val="28"/>
+        </w:rPr>
+      </w:pPr>
+      <w:r>
+        <w:rPr>
+          <w:rFonts w:ascii="Times New Roman" w:hAnsi="Times New Roman"/>
+          <w:b/>
+          <w:bCs/>
+          <w:kern w:val="36"/>
+          <w:sz w:val="28"/>
+          <w:szCs w:val="28"/>
+        </w:rPr>
+        <w:t>Register</w:t>
+      </w:r>
+      <w:r>
+        <w:rPr>
+          <w:rFonts w:ascii="Times New Roman" w:hAnsi="Times New Roman"/>
+          <w:b/>
+          <w:bCs/>
+          <w:kern w:val="36"/>
+          <w:sz w:val="28"/>
+          <w:szCs w:val="28"/>
+        </w:rPr>
+        <w:t xml:space="preserve"> Page</w:t>
+      </w:r>
+    </w:p>
+    <w:p>
+      <w:pPr>
+        <w:spacing w:after="100" w:afterAutospacing="1"/>
+        <w:outlineLvl w:val="0"/>
+        <w:rPr>
+          <w:rFonts w:ascii="Times New Roman" w:hAnsi="Times New Roman"/>
+          <w:b/>
+          <w:bCs/>
+          <w:kern w:val="36"/>
+          <w:sz w:val="28"/>
+          <w:szCs w:val="28"/>
+        </w:rPr>
+      </w:pPr>
+      <w:r>
+        <w:rPr>
+          <w:rFonts w:ascii="Times New Roman" w:hAnsi="Times New Roman"/>
+          <w:b/>
+          <w:bCs/>
+          <w:kern w:val="36"/>
+          <w:sz w:val="28"/>
+          <w:szCs w:val="28"/>
+        </w:rPr>
+        <w:lastRenderedPageBreak/>
+        <w:drawing>
+          <wp:inline distT="0" distB="0" distL="0" distR="0" wp14:anchorId="0B1198BC" wp14:editId="189099C0">
+            <wp:extent cx="5943600" cy="3127375"/>
+            <wp:effectExtent l="0" t="0" r="0" b="0"/>
+            <wp:docPr id="34" name="Picture 34"/>
+            <wp:cNvGraphicFramePr>
+              <a:graphicFrameLocks xmlns:a="http://schemas.openxmlformats.org/drawingml/2006/main" noChangeAspect="1"/>
+            </wp:cNvGraphicFramePr>
+            <a:graphic xmlns:a="http://schemas.openxmlformats.org/drawingml/2006/main">
+              <a:graphicData uri="http://schemas.openxmlformats.org/drawingml/2006/picture">
+                <pic:pic xmlns:pic="http://schemas.openxmlformats.org/drawingml/2006/picture">
+                  <pic:nvPicPr>
+                    <pic:cNvPr id="1" name=""/>
+                    <pic:cNvPicPr/>
+                  </pic:nvPicPr>
+                  <pic:blipFill>
+                    <a:blip r:embed="rId38"/>
+                    <a:stretch>
+                      <a:fillRect/>
+                    </a:stretch>
+                  </pic:blipFill>
+                  <pic:spPr>
+                    <a:xfrm>
+                      <a:off x="0" y="0"/>
+                      <a:ext cx="5943600" cy="3127375"/>
+                    </a:xfrm>
+                    <a:prstGeom prst="rect">
+                      <a:avLst/>
+                    </a:prstGeom>
+                  </pic:spPr>
+                </pic:pic>
+              </a:graphicData>
+            </a:graphic>
+          </wp:inline>
+        </w:drawing>
+      </w:r>
+    </w:p>
+    <w:p>
+      <w:pPr>
+        <w:rPr>
+          <w:rFonts w:ascii="Times New Roman" w:hAnsi="Times New Roman"/>
+          <w:b/>
+        </w:rPr>
+      </w:pPr>
+      <w:r>
+        <w:rPr>
+          <w:rFonts w:ascii="Times New Roman" w:hAnsi="Times New Roman"/>
+          <w:b/>
+        </w:rPr>
+        <w:t xml:space="preserve">Login </w:t>
+      </w:r>
+      <w:r>
+        <w:rPr>
+          <w:rFonts w:ascii="Times New Roman" w:hAnsi="Times New Roman"/>
+          <w:b/>
+        </w:rPr>
+        <w:t>page</w:t>
+      </w:r>
+    </w:p>
+    <w:p>
+      <w:pPr>
+        <w:rPr>
+          <w:rFonts w:ascii="Times New Roman" w:hAnsi="Times New Roman"/>
+          <w:b/>
+        </w:rPr>
+      </w:pPr>
+      <w:r>
+        <w:rPr>
+          <w:rFonts w:ascii="Times New Roman" w:hAnsi="Times New Roman"/>
+          <w:b/>
+        </w:rPr>
+        <w:drawing>
+          <wp:inline distT="0" distB="0" distL="0" distR="0" wp14:anchorId="2B7063CD" wp14:editId="3CA86A17">
+            <wp:extent cx="5943600" cy="3215640"/>
+            <wp:effectExtent l="0" t="0" r="0" b="3810"/>
+            <wp:docPr id="35" name="Picture 35"/>
+            <wp:cNvGraphicFramePr>
+              <a:graphicFrameLocks xmlns:a="http://schemas.openxmlformats.org/drawingml/2006/main" noChangeAspect="1"/>
+            </wp:cNvGraphicFramePr>
+            <a:graphic xmlns:a="http://schemas.openxmlformats.org/drawingml/2006/main">
+              <a:graphicData uri="http://schemas.openxmlformats.org/drawingml/2006/picture">
+                <pic:pic xmlns:pic="http://schemas.openxmlformats.org/drawingml/2006/picture">
+                  <pic:nvPicPr>
+                    <pic:cNvPr id="1" name=""/>
+                    <pic:cNvPicPr/>
+                  </pic:nvPicPr>
+                  <pic:blipFill>
+                    <a:blip r:embed="rId39"/>
+                    <a:stretch>
+                      <a:fillRect/>
+                    </a:stretch>
+                  </pic:blipFill>
+                  <pic:spPr>
+                    <a:xfrm>
+                      <a:off x="0" y="0"/>
+                      <a:ext cx="5943600" cy="3215640"/>
+                    </a:xfrm>
+                    <a:prstGeom prst="rect">
+                      <a:avLst/>
+                    </a:prstGeom>
+                  </pic:spPr>
+                </pic:pic>
+              </a:graphicData>
+            </a:graphic>
+          </wp:inline>
+        </w:drawing>
+      </w:r>
+    </w:p>
+    <w:p>
+      <w:pPr>
+        <w:rPr>
+          <w:rFonts w:ascii="Times New Roman" w:hAnsi="Times New Roman"/>
+          <w:b/>
+        </w:rPr>
+      </w:pPr>
+      <w:r>
+        <w:rPr>
+          <w:rFonts w:ascii="Times New Roman" w:hAnsi="Times New Roman"/>
+          <w:b/>
+        </w:rPr>
+        <w:t>Dashboard</w:t>
+      </w:r>
+    </w:p>
+    <w:p>
+      <w:pPr>
+        <w:rPr>
+          <w:rFonts w:ascii="Times New Roman" w:hAnsi="Times New Roman"/>
+          <w:b/>
+        </w:rPr>
+      </w:pPr>
+      <w:r>
+        <w:rPr>
+          <w:rFonts w:ascii="Times New Roman" w:hAnsi="Times New Roman"/>
+          <w:b/>
+        </w:rPr>
+        <w:lastRenderedPageBreak/>
+        <w:drawing>
+          <wp:inline distT="0" distB="0" distL="0" distR="0" wp14:anchorId="6786AD44" wp14:editId="77E9AEB5">
+            <wp:extent cx="5943600" cy="2973705"/>
+            <wp:effectExtent l="0" t="0" r="0" b="0"/>
+            <wp:docPr id="37" name="Picture 37"/>
+            <wp:cNvGraphicFramePr>
+              <a:graphicFrameLocks xmlns:a="http://schemas.openxmlformats.org/drawingml/2006/main" noChangeAspect="1"/>
+            </wp:cNvGraphicFramePr>
+            <a:graphic xmlns:a="http://schemas.openxmlformats.org/drawingml/2006/main">
+              <a:graphicData uri="http://schemas.openxmlformats.org/drawingml/2006/picture">
+                <pic:pic xmlns:pic="http://schemas.openxmlformats.org/drawingml/2006/picture">
+                  <pic:nvPicPr>
+                    <pic:cNvPr id="1" name=""/>
+                    <pic:cNvPicPr/>
+                  </pic:nvPicPr>
+                  <pic:blipFill>
+                    <a:blip r:embed="rId40"/>
+                    <a:stretch>
+                      <a:fillRect/>
+                    </a:stretch>
+                  </pic:blipFill>
+                  <pic:spPr>
+                    <a:xfrm>
+                      <a:off x="0" y="0"/>
+                      <a:ext cx="5943600" cy="2973705"/>
+                    </a:xfrm>
+                    <a:prstGeom prst="rect">
+                      <a:avLst/>
+                    </a:prstGeom>
+                  </pic:spPr>
+                </pic:pic>
+              </a:graphicData>
+            </a:graphic>
+          </wp:inline>
+        </w:drawing>
+      </w:r>
+    </w:p>
+    <w:p>
+      <w:pPr>
+        <w:rPr>
+          <w:rFonts w:ascii="Times New Roman" w:hAnsi="Times New Roman"/>
+          <w:b/>
+        </w:rPr>
+      </w:pPr>
+      <w:r>
+        <w:rPr>
+          <w:rFonts w:ascii="Times New Roman" w:hAnsi="Times New Roman"/>
+          <w:b/>
+        </w:rPr>
+        <w:t>Logout page</w:t>
+      </w:r>
+    </w:p>
+    <w:p>
+      <w:pPr>
+        <w:rPr>
+          <w:rFonts w:ascii="Times New Roman" w:hAnsi="Times New Roman"/>
+          <w:b/>
+        </w:rPr>
+      </w:pPr>
+      <w:r>
+        <w:rPr>
+          <w:rFonts w:ascii="Times New Roman" w:hAnsi="Times New Roman"/>
+          <w:b/>
+          <w:bCs/>
+          <w:kern w:val="36"/>
+          <w:sz w:val="28"/>
+          <w:szCs w:val="28"/>
+        </w:rPr>
+        <w:drawing>
+          <wp:inline distT="0" distB="0" distL="0" distR="0" wp14:anchorId="55002F3C" wp14:editId="0320F821">
+            <wp:extent cx="5389233" cy="2105247"/>
+            <wp:effectExtent l="0" t="0" r="2540" b="0"/>
+            <wp:docPr id="38" name="Picture 38"/>
+            <wp:cNvGraphicFramePr>
+              <a:graphicFrameLocks xmlns:a="http://schemas.openxmlformats.org/drawingml/2006/main" noChangeAspect="1"/>
+            </wp:cNvGraphicFramePr>
+            <a:graphic xmlns:a="http://schemas.openxmlformats.org/drawingml/2006/main">
+              <a:graphicData uri="http://schemas.openxmlformats.org/drawingml/2006/picture">
+                <pic:pic xmlns:pic="http://schemas.openxmlformats.org/drawingml/2006/picture">
+                  <pic:nvPicPr>
+                    <pic:cNvPr id="1" name=""/>
+                    <pic:cNvPicPr/>
+                  </pic:nvPicPr>
+                  <pic:blipFill>
+                    <a:blip r:embed="rId41"/>
+                    <a:stretch>
+                      <a:fillRect/>
+                    </a:stretch>
+                  </pic:blipFill>
+                  <pic:spPr>
+                    <a:xfrm>
+                      <a:off x="0" y="0"/>
+                      <a:ext cx="5411611" cy="2113989"/>
+                    </a:xfrm>
+                    <a:prstGeom prst="rect">
+                      <a:avLst/>
+                    </a:prstGeom>
+                  </pic:spPr>
+                </pic:pic>
+              </a:graphicData>
+            </a:graphic>
+          </wp:inline>
+        </w:drawing>
+      </w:r>
+    </w:p>
+    <w:p>
+      <w:pPr>
+        <w:rPr>
+          <w:rFonts w:ascii="Times New Roman" w:hAnsi="Times New Roman"/>
+          <w:b/>
+        </w:rPr>
+      </w:pPr>
+      <w:r>
+        <w:rPr>
+          <w:rFonts w:ascii="Times New Roman" w:hAnsi="Times New Roman"/>
+          <w:b/>
+        </w:rPr>
+        <w:t>Student Reflection</w:t>
+      </w:r>
+    </w:p>
+    <w:p>
+      <w:pPr>
+        <w:spacing w:after="100" w:afterAutospacing="1"/>
+        <w:rPr>
+          <w:rFonts w:ascii="Times New Roman" w:hAnsi="Times New Roman"/>
+          <w:kern w:val="0"/>
+        </w:rPr>
+      </w:pPr>
+      <w:r>
+        <w:rPr>
+          <w:rFonts w:ascii="Times New Roman" w:hAnsi="Times New Roman"/>
+        </w:rPr>
+        <w:t>Develop</w:t>
+      </w:r>
+      <w:r>
+        <w:rPr>
+          <w:rFonts w:ascii="Times New Roman" w:hAnsi="Times New Roman"/>
+        </w:rPr>
+        <w:t>ed</w:t>
+      </w:r>
+      <w:r>
+        <w:rPr>
+          <w:rFonts w:ascii="Times New Roman" w:hAnsi="Times New Roman"/>
+        </w:rPr>
+        <w:t xml:space="preserve"> a system that includes:</w:t>
+      </w:r>
+    </w:p>
+    <w:p>
+      <w:pPr>
+        <w:numPr>
+          <w:ilvl w:val="0"/>
+          <w:numId w:val="3"/>
+        </w:numPr>
+        <w:tabs>
+          <w:tab w:val="left" w:pos="720"/>
+        </w:tabs>
+        <w:spacing w:after="100" w:afterAutospacing="1" w:line="256" w:lineRule="auto"/>
+        <w:rPr>
+          <w:rFonts w:ascii="Times New Roman" w:hAnsi="Times New Roman"/>
+        </w:rPr>
+      </w:pPr>
+      <w:r>
+        <w:rPr>
+          <w:rFonts w:ascii="Times New Roman" w:hAnsi="Times New Roman"/>
+        </w:rPr>
+        <w:t>User Registration</w:t>
+      </w:r>
+    </w:p>
+    <w:p>
+      <w:pPr>
+        <w:numPr>
+          <w:ilvl w:val="0"/>
+          <w:numId w:val="3"/>
+        </w:numPr>
+        <w:tabs>
+          <w:tab w:val="left" w:pos="720"/>
+        </w:tabs>
+        <w:spacing w:after="100" w:afterAutospacing="1" w:line="256" w:lineRule="auto"/>
+        <w:rPr>
+          <w:rFonts w:ascii="Times New Roman" w:hAnsi="Times New Roman"/>
+        </w:rPr>
+      </w:pPr>
+      <w:r>
+        <w:rPr>
+          <w:rFonts w:ascii="Times New Roman" w:hAnsi="Times New Roman"/>
+        </w:rPr>
+        <w:t>Login</w:t>
+      </w:r>
+    </w:p>
+    <w:p>
+      <w:pPr>
+        <w:numPr>
+          <w:ilvl w:val="0"/>
+          <w:numId w:val="3"/>
+        </w:numPr>
+        <w:tabs>
+          <w:tab w:val="left" w:pos="720"/>
+        </w:tabs>
+        <w:spacing w:after="100" w:afterAutospacing="1" w:line="256" w:lineRule="auto"/>
+        <w:rPr>
+          <w:rFonts w:ascii="Times New Roman" w:hAnsi="Times New Roman"/>
+        </w:rPr>
+      </w:pPr>
+      <w:r>
+        <w:rPr>
+          <w:rFonts w:ascii="Times New Roman" w:hAnsi="Times New Roman"/>
+        </w:rPr>
+        <w:t>Dashboard</w:t>
+      </w:r>
+    </w:p>
+    <w:p>
+      <w:pPr>
+        <w:numPr>
+          <w:ilvl w:val="0"/>
+          <w:numId w:val="3"/>
+        </w:numPr>
+        <w:tabs>
+          <w:tab w:val="left" w:pos="720"/>
+        </w:tabs>
+        <w:spacing w:after="100" w:afterAutospacing="1" w:line="256" w:lineRule="auto"/>
+        <w:rPr>
+          <w:rFonts w:ascii="Times New Roman" w:hAnsi="Times New Roman"/>
+        </w:rPr>
+      </w:pPr>
+      <w:r>
+        <w:rPr>
+          <w:rFonts w:ascii="Times New Roman" w:hAnsi="Times New Roman"/>
+        </w:rPr>
+        <w:t>Logout</w:t>
+      </w:r>
+    </w:p>
+    <w:p>
+      <w:pPr>
+        <w:pStyle w:val="ListParagraph"/>
+        <w:spacing w:after="100" w:afterAutospacing="1"/>
+        <w:outlineLvl w:val="0"/>
+        <w:rPr>
+          <w:rFonts w:ascii="Times New Roman" w:hAnsi="Times New Roman"/>
+          <w:b/>
+          <w:bCs/>
+          <w:kern w:val="36"/>
+          <w:sz w:val="28"/>
+          <w:szCs w:val="28"/>
+        </w:rPr>
+      </w:pPr>
+      <w:r>
+        <w:rPr>
+          <w:rFonts w:ascii="Times New Roman" w:hAnsi="Times New Roman"/>
+          <w:b/>
+          <w:bCs/>
+          <w:kern w:val="36"/>
+          <w:sz w:val="28"/>
+          <w:szCs w:val="28"/>
+        </w:rPr>
+        <w:t>Practical Task 2</w:t>
+      </w:r>
+    </w:p>
+    <w:p>
+      <w:pPr>
+        <w:pStyle w:val="ListParagraph"/>
+        <w:spacing w:after="100" w:afterAutospacing="1"/>
+        <w:outlineLvl w:val="1"/>
+        <w:rPr>
+          <w:rFonts w:ascii="Times New Roman" w:hAnsi="Times New Roman"/>
+          <w:b/>
+          <w:bCs/>
+          <w:kern w:val="0"/>
+        </w:rPr>
+      </w:pPr>
+      <w:r>
+        <w:rPr>
+          <w:rFonts w:ascii="Times New Roman" w:hAnsi="Times New Roman"/>
+          <w:b/>
+          <w:bCs/>
+        </w:rPr>
+        <w:t>Employee Por</w:t>
+      </w:r>
+      <w:r>
+        <w:rPr>
+          <w:rFonts w:ascii="Times New Roman" w:hAnsi="Times New Roman"/>
+          <w:b/>
+          <w:bCs/>
+        </w:rPr>
+        <w:t>tal</w:t>
+      </w:r>
+    </w:p>
+    <w:p>
+      <w:pPr>
+        <w:rPr>
+          <w:rFonts w:ascii="Times New Roman" w:hAnsi="Times New Roman"/>
+          <w:b/>
+        </w:rPr>
+      </w:pPr>
+      <w:r>
+        <w:rPr>
+          <w:rFonts w:ascii="Times New Roman" w:hAnsi="Times New Roman"/>
+          <w:b/>
+        </w:rPr>
+        <w:lastRenderedPageBreak/>
+        <w:t xml:space="preserve">Register page </w:t>
+      </w:r>
+    </w:p>
+    <w:p>
+      <w:pPr>
+        <w:rPr>
+          <w:rFonts w:ascii="Times New Roman" w:hAnsi="Times New Roman"/>
+          <w:b/>
+        </w:rPr>
+      </w:pPr>
+      <w:r>
+        <w:rPr>
+          <w:rFonts w:ascii="Times New Roman" w:hAnsi="Times New Roman"/>
+          <w:b/>
+        </w:rPr>
+        <w:drawing>
+          <wp:inline distT="0" distB="0" distL="0" distR="0" wp14:anchorId="75F8C5E1" wp14:editId="2B59CF09">
+            <wp:extent cx="5943600" cy="3362960"/>
+            <wp:effectExtent l="0" t="0" r="0" b="8890"/>
+            <wp:docPr id="41" name="Picture 41"/>
+            <wp:cNvGraphicFramePr>
+              <a:graphicFrameLocks xmlns:a="http://schemas.openxmlformats.org/drawingml/2006/main" noChangeAspect="1"/>
+            </wp:cNvGraphicFramePr>
+            <a:graphic xmlns:a="http://schemas.openxmlformats.org/drawingml/2006/main">
+              <a:graphicData uri="http://schemas.openxmlformats.org/drawingml/2006/picture">
+                <pic:pic xmlns:pic="http://schemas.openxmlformats.org/drawingml/2006/picture">
+                  <pic:nvPicPr>
+                    <pic:cNvPr id="1" name=""/>
+                    <pic:cNvPicPr/>
+                  </pic:nvPicPr>
+                  <pic:blipFill>
+                    <a:blip r:embed="rId42"/>
+                    <a:stretch>
+                      <a:fillRect/>
+                    </a:stretch>
+                  </pic:blipFill>
+                  <pic:spPr>
+                    <a:xfrm>
+                      <a:off x="0" y="0"/>
+                      <a:ext cx="5943600" cy="3362960"/>
+                    </a:xfrm>
+                    <a:prstGeom prst="rect">
+                      <a:avLst/>
+                    </a:prstGeom>
+                  </pic:spPr>
+                </pic:pic>
+              </a:graphicData>
+            </a:graphic>
+          </wp:inline>
+        </w:drawing>
+      </w:r>
+    </w:p>
+    <w:p>
+      <w:pPr>
+        <w:rPr>
+          <w:rFonts w:ascii="Times New Roman" w:hAnsi="Times New Roman"/>
+          <w:b/>
+        </w:rPr>
+      </w:pPr>
+      <w:r>
+        <w:rPr>
+          <w:rFonts w:ascii="Times New Roman" w:hAnsi="Times New Roman"/>
+          <w:b/>
+        </w:rPr>
+        <w:t>Login page</w:t>
+      </w:r>
+    </w:p>
+    <w:p>
+      <w:pPr>
+        <w:rPr>
+          <w:rFonts w:ascii="Times New Roman" w:hAnsi="Times New Roman"/>
+          <w:b/>
+        </w:rPr>
+      </w:pPr>
+    </w:p>
+    <w:p>
+      <w:pPr>
+        <w:rPr>
+          <w:rFonts w:ascii="Times New Roman" w:hAnsi="Times New Roman"/>
+          <w:b/>
+        </w:rPr>
+      </w:pPr>
+      <w:r>
+        <w:rPr>
+          <w:rFonts w:ascii="Times New Roman" w:hAnsi="Times New Roman"/>
+          <w:b/>
+        </w:rPr>
+        <w:drawing>
+          <wp:inline distT="0" distB="0" distL="0" distR="0" wp14:anchorId="31721207" wp14:editId="002A6226">
+            <wp:extent cx="5943600" cy="2969895"/>
+            <wp:effectExtent l="0" t="0" r="0" b="1905"/>
+            <wp:docPr id="45" name="Picture 45"/>
+            <wp:cNvGraphicFramePr>
+              <a:graphicFrameLocks xmlns:a="http://schemas.openxmlformats.org/drawingml/2006/main" noChangeAspect="1"/>
+            </wp:cNvGraphicFramePr>
+            <a:graphic xmlns:a="http://schemas.openxmlformats.org/drawingml/2006/main">
+              <a:graphicData uri="http://schemas.openxmlformats.org/drawingml/2006/picture">
+                <pic:pic xmlns:pic="http://schemas.openxmlformats.org/drawingml/2006/picture">
+                  <pic:nvPicPr>
+                    <pic:cNvPr id="1" name=""/>
+                    <pic:cNvPicPr/>
+                  </pic:nvPicPr>
+                  <pic:blipFill>
+                    <a:blip r:embed="rId43"/>
+                    <a:stretch>
+                      <a:fillRect/>
+                    </a:stretch>
+                  </pic:blipFill>
+                  <pic:spPr>
+                    <a:xfrm>
+                      <a:off x="0" y="0"/>
+                      <a:ext cx="5943600" cy="2969895"/>
+                    </a:xfrm>
+                    <a:prstGeom prst="rect">
+                      <a:avLst/>
+                    </a:prstGeom>
+                  </pic:spPr>
+                </pic:pic>
+              </a:graphicData>
+            </a:graphic>
+          </wp:inline>
+        </w:drawing>
+      </w:r>
+    </w:p>
+    <w:p>
+      <w:pPr>
+        <w:rPr>
+          <w:rFonts w:ascii="Times New Roman" w:hAnsi="Times New Roman"/>
+          <w:b/>
+        </w:rPr>
+      </w:pPr>
+      <w:r>
+        <w:rPr>
+          <w:rFonts w:ascii="Times New Roman" w:hAnsi="Times New Roman"/>
+          <w:b/>
+        </w:rPr>
+        <w:t>Dashboard page</w:t>
+      </w:r>
+    </w:p>
+    <w:p>
+      <w:pPr>
+        <w:rPr>
+          <w:rFonts w:ascii="Times New Roman" w:hAnsi="Times New Roman"/>
+          <w:b/>
+        </w:rPr>
+      </w:pPr>
+      <w:r>
+        <w:rPr>
+          <w:rFonts w:ascii="Times New Roman" w:hAnsi="Times New Roman"/>
+          <w:b/>
+        </w:rPr>
+        <w:lastRenderedPageBreak/>
+        <w:drawing>
+          <wp:inline distT="0" distB="0" distL="0" distR="0" wp14:anchorId="691FB410" wp14:editId="39C59CE1">
+            <wp:extent cx="5943600" cy="2927985"/>
+            <wp:effectExtent l="0" t="0" r="0" b="5715"/>
+            <wp:docPr id="42" name="Picture 42"/>
+            <wp:cNvGraphicFramePr>
+              <a:graphicFrameLocks xmlns:a="http://schemas.openxmlformats.org/drawingml/2006/main" noChangeAspect="1"/>
+            </wp:cNvGraphicFramePr>
+            <a:graphic xmlns:a="http://schemas.openxmlformats.org/drawingml/2006/main">
+              <a:graphicData uri="http://schemas.openxmlformats.org/drawingml/2006/picture">
+                <pic:pic xmlns:pic="http://schemas.openxmlformats.org/drawingml/2006/picture">
+                  <pic:nvPicPr>
+                    <pic:cNvPr id="1" name=""/>
+                    <pic:cNvPicPr/>
+                  </pic:nvPicPr>
+                  <pic:blipFill>
+                    <a:blip r:embed="rId44"/>
+                    <a:stretch>
+                      <a:fillRect/>
+                    </a:stretch>
+                  </pic:blipFill>
+                  <pic:spPr>
+                    <a:xfrm>
+                      <a:off x="0" y="0"/>
+                      <a:ext cx="5943600" cy="2927985"/>
+                    </a:xfrm>
+                    <a:prstGeom prst="rect">
+                      <a:avLst/>
+                    </a:prstGeom>
+                  </pic:spPr>
+                </pic:pic>
+              </a:graphicData>
+            </a:graphic>
+          </wp:inline>
+        </w:drawing>
+      </w:r>
+    </w:p>
+    <w:p>
+      <w:pPr>
+        <w:rPr>
+          <w:rFonts w:ascii="Times New Roman" w:hAnsi="Times New Roman"/>
+          <w:b/>
+        </w:rPr>
+      </w:pPr>
+      <w:r>
+        <w:rPr>
+          <w:rFonts w:ascii="Times New Roman" w:hAnsi="Times New Roman"/>
+          <w:b/>
+        </w:rPr>
+        <w:t>Profile page</w:t>
+      </w:r>
+    </w:p>
+    <w:p>
+      <w:pPr>
+        <w:rPr>
+          <w:rFonts w:ascii="Times New Roman" w:hAnsi="Times New Roman"/>
+          <w:b/>
+        </w:rPr>
+      </w:pPr>
+      <w:r>
+        <w:rPr>
+          <w:rFonts w:ascii="Times New Roman" w:hAnsi="Times New Roman"/>
+          <w:b/>
+        </w:rPr>
+        <w:drawing>
+          <wp:inline distT="0" distB="0" distL="0" distR="0" wp14:anchorId="70F2EA24" wp14:editId="062F76C0">
+            <wp:extent cx="5943600" cy="2781935"/>
+            <wp:effectExtent l="0" t="0" r="0" b="0"/>
+            <wp:docPr id="43" name="Picture 43"/>
+            <wp:cNvGraphicFramePr>
+              <a:graphicFrameLocks xmlns:a="http://schemas.openxmlformats.org/drawingml/2006/main" noChangeAspect="1"/>
+            </wp:cNvGraphicFramePr>
+            <a:graphic xmlns:a="http://schemas.openxmlformats.org/drawingml/2006/main">
+              <a:graphicData uri="http://schemas.openxmlformats.org/drawingml/2006/picture">
+                <pic:pic xmlns:pic="http://schemas.openxmlformats.org/drawingml/2006/picture">
+                  <pic:nvPicPr>
+                    <pic:cNvPr id="1" name=""/>
+                    <pic:cNvPicPr/>
+                  </pic:nvPicPr>
+                  <pic:blipFill>
+                    <a:blip r:embed="rId45"/>
+                    <a:stretch>
+                      <a:fillRect/>
+                    </a:stretch>
+                  </pic:blipFill>
+                  <pic:spPr>
+                    <a:xfrm>
+                      <a:off x="0" y="0"/>
+                      <a:ext cx="5943600" cy="2781935"/>
+                    </a:xfrm>
+                    <a:prstGeom prst="rect">
+                      <a:avLst/>
+                    </a:prstGeom>
+                  </pic:spPr>
+                </pic:pic>
+              </a:graphicData>
+            </a:graphic>
+          </wp:inline>
+        </w:drawing>
+      </w:r>
+    </w:p>
+    <w:p>
+      <w:pPr>
+        <w:rPr>
+          <w:rFonts w:ascii="Times New Roman" w:hAnsi="Times New Roman"/>
+          <w:b/>
+        </w:rPr>
+      </w:pPr>
+      <w:r>
+        <w:rPr>
+          <w:rFonts w:ascii="Times New Roman" w:hAnsi="Times New Roman"/>
+          <w:b/>
+        </w:rPr>
+        <w:t xml:space="preserve">Logout </w:t>
+      </w:r>
+      <w:r>
+        <w:rPr>
+          <w:rFonts w:ascii="Times New Roman" w:hAnsi="Times New Roman"/>
+          <w:b/>
+        </w:rPr>
+        <w:t>page</w:t>
+      </w:r>
+    </w:p>
+    <w:p>
+      <w:pPr>
+        <w:rPr>
+          <w:rFonts w:ascii="Times New Roman" w:hAnsi="Times New Roman"/>
+          <w:b/>
+        </w:rPr>
+      </w:pPr>
+      <w:r>
+        <w:rPr>
+          <w:rFonts w:ascii="Times New Roman" w:hAnsi="Times New Roman"/>
+          <w:b/>
+        </w:rPr>
+        <w:lastRenderedPageBreak/>
+        <w:drawing>
+          <wp:inline distT="0" distB="0" distL="0" distR="0" wp14:anchorId="02C5F2B9" wp14:editId="7EFD6358">
+            <wp:extent cx="5943600" cy="2813685"/>
+            <wp:effectExtent l="0" t="0" r="0" b="5715"/>
+            <wp:docPr id="44" name="Picture 44"/>
+            <wp:cNvGraphicFramePr>
+              <a:graphicFrameLocks xmlns:a="http://schemas.openxmlformats.org/drawingml/2006/main" noChangeAspect="1"/>
+            </wp:cNvGraphicFramePr>
+            <a:graphic xmlns:a="http://schemas.openxmlformats.org/drawingml/2006/main">
+              <a:graphicData uri="http://schemas.openxmlformats.org/drawingml/2006/picture">
+                <pic:pic xmlns:pic="http://schemas.openxmlformats.org/drawingml/2006/picture">
+                  <pic:nvPicPr>
+                    <pic:cNvPr id="1" name=""/>
+                    <pic:cNvPicPr/>
+                  </pic:nvPicPr>
+                  <pic:blipFill>
+                    <a:blip r:embed="rId46"/>
+                    <a:stretch>
+                      <a:fillRect/>
+                    </a:stretch>
+                  </pic:blipFill>
+                  <pic:spPr>
+                    <a:xfrm>
+                      <a:off x="0" y="0"/>
+                      <a:ext cx="5943600" cy="2813685"/>
+                    </a:xfrm>
+                    <a:prstGeom prst="rect">
+                      <a:avLst/>
+                    </a:prstGeom>
+                  </pic:spPr>
+                </pic:pic>
+              </a:graphicData>
+            </a:graphic>
+          </wp:inline>
+        </w:drawing>
+      </w:r>
+    </w:p>
+    <w:p>
+      <w:pPr>
+        <w:rPr>
+          <w:rFonts w:ascii="Times New Roman" w:hAnsi="Times New Roman"/>
+          <w:b/>
+        </w:rPr>
+      </w:pPr>
+      <w:r>
+        <w:rPr>
+          <w:rFonts w:ascii="Times New Roman" w:hAnsi="Times New Roman"/>
+          <w:b/>
+        </w:rPr>
+        <w:t>Student Reflection</w:t>
+      </w:r>
+    </w:p>
+    <w:p>
+      <w:pPr>
+        <w:spacing w:after="100" w:afterAutospacing="1"/>
+        <w:rPr>
+          <w:rFonts w:ascii="Times New Roman" w:hAnsi="Times New Roman"/>
+          <w:kern w:val="0"/>
+        </w:rPr>
+      </w:pPr>
+      <w:proofErr w:type="spellStart"/>
+      <w:r>
+        <w:rPr>
+          <w:rFonts w:ascii="Times New Roman" w:hAnsi="Times New Roman"/>
+        </w:rPr>
+        <w:t>Create</w:t>
+      </w:r>
+      <w:r>
+        <w:rPr>
+          <w:rFonts w:ascii="Times New Roman" w:hAnsi="Times New Roman"/>
+        </w:rPr>
+        <w:t>ed</w:t>
+      </w:r>
+      <w:proofErr w:type="spellEnd"/>
+      <w:r>
+        <w:rPr>
+          <w:rFonts w:ascii="Times New Roman" w:hAnsi="Times New Roman"/>
+        </w:rPr>
+        <w:t xml:space="preserve"> </w:t>
+      </w:r>
       <w:bookmarkStart w:id="27" w:name="_GoBack"/>
       <w:bookmarkEnd w:id="27"/>
+      <w:r>
+        <w:rPr>
+          <w:rFonts w:ascii="Times New Roman" w:hAnsi="Times New Roman"/>
+        </w:rPr>
+        <w:t xml:space="preserve"> an employee system with:</w:t>
+      </w:r>
+    </w:p>
+    <w:p>
+      <w:pPr>
+        <w:numPr>
+          <w:ilvl w:val="0"/>
+          <w:numId w:val="4"/>
+        </w:numPr>
+        <w:tabs>
+          <w:tab w:val="left" w:pos="720"/>
+        </w:tabs>
+        <w:spacing w:after="100" w:afterAutospacing="1" w:line="256" w:lineRule="auto"/>
+        <w:rPr>
+          <w:rFonts w:ascii="Times New Roman" w:hAnsi="Times New Roman"/>
+        </w:rPr>
+      </w:pPr>
+      <w:r>
+        <w:rPr>
+          <w:rFonts w:ascii="Times New Roman" w:hAnsi="Times New Roman"/>
+        </w:rPr>
+        <w:t>Registration</w:t>
+      </w:r>
+    </w:p>
+    <w:p>
+      <w:pPr>
+        <w:numPr>
+          <w:ilvl w:val="0"/>
+          <w:numId w:val="4"/>
+        </w:numPr>
+        <w:tabs>
+          <w:tab w:val="left" w:pos="720"/>
+        </w:tabs>
+        <w:spacing w:after="100" w:afterAutospacing="1" w:line="256" w:lineRule="auto"/>
+        <w:rPr>
+          <w:rFonts w:ascii="Times New Roman" w:hAnsi="Times New Roman"/>
+        </w:rPr>
+      </w:pPr>
+      <w:r>
+        <w:rPr>
+          <w:rFonts w:ascii="Times New Roman" w:hAnsi="Times New Roman"/>
+        </w:rPr>
+        <w:t>Authentication</w:t>
+      </w:r>
+    </w:p>
+    <w:p>
+      <w:pPr>
+        <w:numPr>
+          <w:ilvl w:val="0"/>
+          <w:numId w:val="4"/>
+        </w:numPr>
+        <w:tabs>
+          <w:tab w:val="left" w:pos="720"/>
+        </w:tabs>
+        <w:spacing w:after="100" w:afterAutospacing="1" w:line="256" w:lineRule="auto"/>
+        <w:rPr>
+          <w:rFonts w:ascii="Times New Roman" w:hAnsi="Times New Roman"/>
+        </w:rPr>
+      </w:pPr>
+      <w:r>
+        <w:rPr>
+          <w:rFonts w:ascii="Times New Roman" w:hAnsi="Times New Roman"/>
+        </w:rPr>
+        <w:t>Protected Pages</w:t>
+      </w:r>
+    </w:p>
+    <w:p>
+      <w:pPr>
+        <w:numPr>
+          <w:ilvl w:val="0"/>
+          <w:numId w:val="4"/>
+        </w:numPr>
+        <w:tabs>
+          <w:tab w:val="left" w:pos="720"/>
+        </w:tabs>
+        <w:spacing w:after="100" w:afterAutospacing="1" w:line="256" w:lineRule="auto"/>
+        <w:rPr>
+          <w:rFonts w:ascii="Times New Roman" w:hAnsi="Times New Roman"/>
+        </w:rPr>
+      </w:pPr>
+      <w:r>
+        <w:rPr>
+          <w:rFonts w:ascii="Times New Roman" w:hAnsi="Times New Roman"/>
+        </w:rPr>
+        <w:t>Session Management</w:t>
+      </w:r>
+    </w:p>
+    <w:p>
+      <w:pPr>
+        <w:rPr>
+          <w:rFonts w:ascii="Times New Roman" w:hAnsi="Times New Roman"/>
+          <w:b/>
+        </w:rPr>
+      </w:pPr>
     </w:p>
     <w:sectPr>
       <w:pgSz w:w="12240" w:h="15840"/>
@@ -5497,8 +6984,518 @@
       </w:pPr>
     </w:lvl>
   </w:abstractNum>
+  <w:abstractNum w:abstractNumId="1" w15:restartNumberingAfterBreak="0">
+    <w:nsid w:val="07AD2F02"/>
+    <w:multiLevelType w:val="multilevel"/>
+    <w:tmpl w:val="5D5036F6"/>
+    <w:lvl w:ilvl="0">
+      <w:start w:val="1"/>
+      <w:numFmt w:val="bullet"/>
+      <w:lvlText w:val=""/>
+      <w:lvlJc w:val="left"/>
+      <w:pPr>
+        <w:tabs>
+          <w:tab w:val="num" w:pos="720"/>
+        </w:tabs>
+        <w:ind w:left="720" w:hanging="360"/>
+      </w:pPr>
+      <w:rPr>
+        <w:rFonts w:ascii="Symbol" w:hAnsi="Symbol" w:hint="default"/>
+        <w:sz w:val="20"/>
+        <w:szCs w:val="20"/>
+      </w:rPr>
+    </w:lvl>
+    <w:lvl w:ilvl="1">
+      <w:start w:val="1"/>
+      <w:numFmt w:val="bullet"/>
+      <w:lvlText w:val="o"/>
+      <w:lvlJc w:val="left"/>
+      <w:pPr>
+        <w:tabs>
+          <w:tab w:val="num" w:pos="1440"/>
+        </w:tabs>
+        <w:ind w:left="1440" w:hanging="360"/>
+      </w:pPr>
+      <w:rPr>
+        <w:rFonts w:ascii="Courier New" w:hAnsi="Courier New" w:cs="Courier New" w:hint="default"/>
+        <w:sz w:val="20"/>
+        <w:szCs w:val="20"/>
+      </w:rPr>
+    </w:lvl>
+    <w:lvl w:ilvl="2">
+      <w:start w:val="1"/>
+      <w:numFmt w:val="bullet"/>
+      <w:lvlText w:val=""/>
+      <w:lvlJc w:val="left"/>
+      <w:pPr>
+        <w:tabs>
+          <w:tab w:val="num" w:pos="2160"/>
+        </w:tabs>
+        <w:ind w:left="2160" w:hanging="360"/>
+      </w:pPr>
+      <w:rPr>
+        <w:rFonts w:ascii="Wingdings" w:hAnsi="Wingdings" w:hint="default"/>
+        <w:sz w:val="20"/>
+        <w:szCs w:val="20"/>
+      </w:rPr>
+    </w:lvl>
+    <w:lvl w:ilvl="3">
+      <w:start w:val="1"/>
+      <w:numFmt w:val="bullet"/>
+      <w:lvlText w:val=""/>
+      <w:lvlJc w:val="left"/>
+      <w:pPr>
+        <w:tabs>
+          <w:tab w:val="num" w:pos="2880"/>
+        </w:tabs>
+        <w:ind w:left="2880" w:hanging="360"/>
+      </w:pPr>
+      <w:rPr>
+        <w:rFonts w:ascii="Wingdings" w:hAnsi="Wingdings" w:hint="default"/>
+        <w:sz w:val="20"/>
+        <w:szCs w:val="20"/>
+      </w:rPr>
+    </w:lvl>
+    <w:lvl w:ilvl="4">
+      <w:start w:val="1"/>
+      <w:numFmt w:val="bullet"/>
+      <w:lvlText w:val=""/>
+      <w:lvlJc w:val="left"/>
+      <w:pPr>
+        <w:tabs>
+          <w:tab w:val="num" w:pos="3600"/>
+        </w:tabs>
+        <w:ind w:left="3600" w:hanging="360"/>
+      </w:pPr>
+      <w:rPr>
+        <w:rFonts w:ascii="Wingdings" w:hAnsi="Wingdings" w:hint="default"/>
+        <w:sz w:val="20"/>
+        <w:szCs w:val="20"/>
+      </w:rPr>
+    </w:lvl>
+    <w:lvl w:ilvl="5">
+      <w:start w:val="1"/>
+      <w:numFmt w:val="bullet"/>
+      <w:lvlText w:val=""/>
+      <w:lvlJc w:val="left"/>
+      <w:pPr>
+        <w:tabs>
+          <w:tab w:val="num" w:pos="4320"/>
+        </w:tabs>
+        <w:ind w:left="4320" w:hanging="360"/>
+      </w:pPr>
+      <w:rPr>
+        <w:rFonts w:ascii="Wingdings" w:hAnsi="Wingdings" w:hint="default"/>
+        <w:sz w:val="20"/>
+        <w:szCs w:val="20"/>
+      </w:rPr>
+    </w:lvl>
+    <w:lvl w:ilvl="6">
+      <w:start w:val="1"/>
+      <w:numFmt w:val="bullet"/>
+      <w:lvlText w:val=""/>
+      <w:lvlJc w:val="left"/>
+      <w:pPr>
+        <w:tabs>
+          <w:tab w:val="num" w:pos="5040"/>
+        </w:tabs>
+        <w:ind w:left="5040" w:hanging="360"/>
+      </w:pPr>
+      <w:rPr>
+        <w:rFonts w:ascii="Wingdings" w:hAnsi="Wingdings" w:hint="default"/>
+        <w:sz w:val="20"/>
+        <w:szCs w:val="20"/>
+      </w:rPr>
+    </w:lvl>
+    <w:lvl w:ilvl="7">
+      <w:start w:val="1"/>
+      <w:numFmt w:val="bullet"/>
+      <w:lvlText w:val=""/>
+      <w:lvlJc w:val="left"/>
+      <w:pPr>
+        <w:tabs>
+          <w:tab w:val="num" w:pos="5760"/>
+        </w:tabs>
+        <w:ind w:left="5760" w:hanging="360"/>
+      </w:pPr>
+      <w:rPr>
+        <w:rFonts w:ascii="Wingdings" w:hAnsi="Wingdings" w:hint="default"/>
+        <w:sz w:val="20"/>
+        <w:szCs w:val="20"/>
+      </w:rPr>
+    </w:lvl>
+    <w:lvl w:ilvl="8">
+      <w:start w:val="1"/>
+      <w:numFmt w:val="bullet"/>
+      <w:lvlText w:val=""/>
+      <w:lvlJc w:val="left"/>
+      <w:pPr>
+        <w:tabs>
+          <w:tab w:val="num" w:pos="6480"/>
+        </w:tabs>
+        <w:ind w:left="6480" w:hanging="360"/>
+      </w:pPr>
+      <w:rPr>
+        <w:rFonts w:ascii="Wingdings" w:hAnsi="Wingdings" w:hint="default"/>
+        <w:sz w:val="20"/>
+        <w:szCs w:val="20"/>
+      </w:rPr>
+    </w:lvl>
+  </w:abstractNum>
+  <w:abstractNum w:abstractNumId="2" w15:restartNumberingAfterBreak="0">
+    <w:nsid w:val="12CA7D9C"/>
+    <w:multiLevelType w:val="multilevel"/>
+    <w:tmpl w:val="4D52A7B4"/>
+    <w:lvl w:ilvl="0">
+      <w:start w:val="1"/>
+      <w:numFmt w:val="bullet"/>
+      <w:lvlText w:val=""/>
+      <w:lvlJc w:val="left"/>
+      <w:pPr>
+        <w:tabs>
+          <w:tab w:val="num" w:pos="720"/>
+        </w:tabs>
+        <w:ind w:left="720" w:hanging="360"/>
+      </w:pPr>
+      <w:rPr>
+        <w:rFonts w:ascii="Symbol" w:hAnsi="Symbol" w:hint="default"/>
+        <w:sz w:val="20"/>
+        <w:szCs w:val="20"/>
+      </w:rPr>
+    </w:lvl>
+    <w:lvl w:ilvl="1">
+      <w:start w:val="1"/>
+      <w:numFmt w:val="bullet"/>
+      <w:lvlText w:val="o"/>
+      <w:lvlJc w:val="left"/>
+      <w:pPr>
+        <w:tabs>
+          <w:tab w:val="num" w:pos="1440"/>
+        </w:tabs>
+        <w:ind w:left="1440" w:hanging="360"/>
+      </w:pPr>
+      <w:rPr>
+        <w:rFonts w:ascii="Courier New" w:hAnsi="Courier New" w:cs="Courier New" w:hint="default"/>
+        <w:sz w:val="20"/>
+        <w:szCs w:val="20"/>
+      </w:rPr>
+    </w:lvl>
+    <w:lvl w:ilvl="2">
+      <w:start w:val="1"/>
+      <w:numFmt w:val="bullet"/>
+      <w:lvlText w:val=""/>
+      <w:lvlJc w:val="left"/>
+      <w:pPr>
+        <w:tabs>
+          <w:tab w:val="num" w:pos="2160"/>
+        </w:tabs>
+        <w:ind w:left="2160" w:hanging="360"/>
+      </w:pPr>
+      <w:rPr>
+        <w:rFonts w:ascii="Wingdings" w:hAnsi="Wingdings" w:hint="default"/>
+        <w:sz w:val="20"/>
+        <w:szCs w:val="20"/>
+      </w:rPr>
+    </w:lvl>
+    <w:lvl w:ilvl="3">
+      <w:start w:val="1"/>
+      <w:numFmt w:val="bullet"/>
+      <w:lvlText w:val=""/>
+      <w:lvlJc w:val="left"/>
+      <w:pPr>
+        <w:tabs>
+          <w:tab w:val="num" w:pos="2880"/>
+        </w:tabs>
+        <w:ind w:left="2880" w:hanging="360"/>
+      </w:pPr>
+      <w:rPr>
+        <w:rFonts w:ascii="Wingdings" w:hAnsi="Wingdings" w:hint="default"/>
+        <w:sz w:val="20"/>
+        <w:szCs w:val="20"/>
+      </w:rPr>
+    </w:lvl>
+    <w:lvl w:ilvl="4">
+      <w:start w:val="1"/>
+      <w:numFmt w:val="bullet"/>
+      <w:lvlText w:val=""/>
+      <w:lvlJc w:val="left"/>
+      <w:pPr>
+        <w:tabs>
+          <w:tab w:val="num" w:pos="3600"/>
+        </w:tabs>
+        <w:ind w:left="3600" w:hanging="360"/>
+      </w:pPr>
+      <w:rPr>
+        <w:rFonts w:ascii="Wingdings" w:hAnsi="Wingdings" w:hint="default"/>
+        <w:sz w:val="20"/>
+        <w:szCs w:val="20"/>
+      </w:rPr>
+    </w:lvl>
+    <w:lvl w:ilvl="5">
+      <w:start w:val="1"/>
+      <w:numFmt w:val="bullet"/>
+      <w:lvlText w:val=""/>
+      <w:lvlJc w:val="left"/>
+      <w:pPr>
+        <w:tabs>
+          <w:tab w:val="num" w:pos="4320"/>
+        </w:tabs>
+        <w:ind w:left="4320" w:hanging="360"/>
+      </w:pPr>
+      <w:rPr>
+        <w:rFonts w:ascii="Wingdings" w:hAnsi="Wingdings" w:hint="default"/>
+        <w:sz w:val="20"/>
+        <w:szCs w:val="20"/>
+      </w:rPr>
+    </w:lvl>
+    <w:lvl w:ilvl="6">
+      <w:start w:val="1"/>
+      <w:numFmt w:val="bullet"/>
+      <w:lvlText w:val=""/>
+      <w:lvlJc w:val="left"/>
+      <w:pPr>
+        <w:tabs>
+          <w:tab w:val="num" w:pos="5040"/>
+        </w:tabs>
+        <w:ind w:left="5040" w:hanging="360"/>
+      </w:pPr>
+      <w:rPr>
+        <w:rFonts w:ascii="Wingdings" w:hAnsi="Wingdings" w:hint="default"/>
+        <w:sz w:val="20"/>
+        <w:szCs w:val="20"/>
+      </w:rPr>
+    </w:lvl>
+    <w:lvl w:ilvl="7">
+      <w:start w:val="1"/>
+      <w:numFmt w:val="bullet"/>
+      <w:lvlText w:val=""/>
+      <w:lvlJc w:val="left"/>
+      <w:pPr>
+        <w:tabs>
+          <w:tab w:val="num" w:pos="5760"/>
+        </w:tabs>
+        <w:ind w:left="5760" w:hanging="360"/>
+      </w:pPr>
+      <w:rPr>
+        <w:rFonts w:ascii="Wingdings" w:hAnsi="Wingdings" w:hint="default"/>
+        <w:sz w:val="20"/>
+        <w:szCs w:val="20"/>
+      </w:rPr>
+    </w:lvl>
+    <w:lvl w:ilvl="8">
+      <w:start w:val="1"/>
+      <w:numFmt w:val="bullet"/>
+      <w:lvlText w:val=""/>
+      <w:lvlJc w:val="left"/>
+      <w:pPr>
+        <w:tabs>
+          <w:tab w:val="num" w:pos="6480"/>
+        </w:tabs>
+        <w:ind w:left="6480" w:hanging="360"/>
+      </w:pPr>
+      <w:rPr>
+        <w:rFonts w:ascii="Wingdings" w:hAnsi="Wingdings" w:hint="default"/>
+        <w:sz w:val="20"/>
+        <w:szCs w:val="20"/>
+      </w:rPr>
+    </w:lvl>
+  </w:abstractNum>
+  <w:abstractNum w:abstractNumId="3" w15:restartNumberingAfterBreak="0">
+    <w:nsid w:val="5090713E"/>
+    <w:multiLevelType w:val="multilevel"/>
+    <w:tmpl w:val="2E6060BA"/>
+    <w:lvl w:ilvl="0">
+      <w:start w:val="1"/>
+      <w:numFmt w:val="decimal"/>
+      <w:lvlText w:val="%1."/>
+      <w:lvlJc w:val="left"/>
+      <w:pPr>
+        <w:tabs>
+          <w:tab w:val="num" w:pos="720"/>
+        </w:tabs>
+        <w:ind w:left="720" w:hanging="360"/>
+      </w:pPr>
+      <w:rPr>
+        <w:rFonts w:ascii="Times New Roman" w:hAnsi="Times New Roman" w:cs="Times New Roman" w:hint="default"/>
+      </w:rPr>
+    </w:lvl>
+    <w:lvl w:ilvl="1">
+      <w:start w:val="1"/>
+      <w:numFmt w:val="decimal"/>
+      <w:lvlText w:val="%2."/>
+      <w:lvlJc w:val="left"/>
+      <w:pPr>
+        <w:tabs>
+          <w:tab w:val="num" w:pos="1440"/>
+        </w:tabs>
+        <w:ind w:left="1440" w:hanging="360"/>
+      </w:pPr>
+      <w:rPr>
+        <w:rFonts w:ascii="Times New Roman" w:hAnsi="Times New Roman" w:cs="Times New Roman" w:hint="default"/>
+      </w:rPr>
+    </w:lvl>
+    <w:lvl w:ilvl="2">
+      <w:start w:val="1"/>
+      <w:numFmt w:val="decimal"/>
+      <w:lvlText w:val="%3."/>
+      <w:lvlJc w:val="left"/>
+      <w:pPr>
+        <w:tabs>
+          <w:tab w:val="num" w:pos="2160"/>
+        </w:tabs>
+        <w:ind w:left="2160" w:hanging="360"/>
+      </w:pPr>
+      <w:rPr>
+        <w:rFonts w:ascii="Times New Roman" w:hAnsi="Times New Roman" w:cs="Times New Roman" w:hint="default"/>
+      </w:rPr>
+    </w:lvl>
+    <w:lvl w:ilvl="3">
+      <w:start w:val="1"/>
+      <w:numFmt w:val="decimal"/>
+      <w:lvlText w:val="%4."/>
+      <w:lvlJc w:val="left"/>
+      <w:pPr>
+        <w:tabs>
+          <w:tab w:val="num" w:pos="2880"/>
+        </w:tabs>
+        <w:ind w:left="2880" w:hanging="360"/>
+      </w:pPr>
+      <w:rPr>
+        <w:rFonts w:ascii="Times New Roman" w:hAnsi="Times New Roman" w:cs="Times New Roman" w:hint="default"/>
+      </w:rPr>
+    </w:lvl>
+    <w:lvl w:ilvl="4">
+      <w:start w:val="1"/>
+      <w:numFmt w:val="decimal"/>
+      <w:lvlText w:val="%5."/>
+      <w:lvlJc w:val="left"/>
+      <w:pPr>
+        <w:tabs>
+          <w:tab w:val="num" w:pos="3600"/>
+        </w:tabs>
+        <w:ind w:left="3600" w:hanging="360"/>
+      </w:pPr>
+      <w:rPr>
+        <w:rFonts w:ascii="Times New Roman" w:hAnsi="Times New Roman" w:cs="Times New Roman" w:hint="default"/>
+      </w:rPr>
+    </w:lvl>
+    <w:lvl w:ilvl="5">
+      <w:start w:val="1"/>
+      <w:numFmt w:val="decimal"/>
+      <w:lvlText w:val="%6."/>
+      <w:lvlJc w:val="left"/>
+      <w:pPr>
+        <w:tabs>
+          <w:tab w:val="num" w:pos="4320"/>
+        </w:tabs>
+        <w:ind w:left="4320" w:hanging="360"/>
+      </w:pPr>
+      <w:rPr>
+        <w:rFonts w:ascii="Times New Roman" w:hAnsi="Times New Roman" w:cs="Times New Roman" w:hint="default"/>
+      </w:rPr>
+    </w:lvl>
+    <w:lvl w:ilvl="6">
+      <w:start w:val="1"/>
+      <w:numFmt w:val="decimal"/>
+      <w:lvlText w:val="%7."/>
+      <w:lvlJc w:val="left"/>
+      <w:pPr>
+        <w:tabs>
+          <w:tab w:val="num" w:pos="5040"/>
+        </w:tabs>
+        <w:ind w:left="5040" w:hanging="360"/>
+      </w:pPr>
+      <w:rPr>
+        <w:rFonts w:ascii="Times New Roman" w:hAnsi="Times New Roman" w:cs="Times New Roman" w:hint="default"/>
+      </w:rPr>
+    </w:lvl>
+    <w:lvl w:ilvl="7">
+      <w:start w:val="1"/>
+      <w:numFmt w:val="decimal"/>
+      <w:lvlText w:val="%8."/>
+      <w:lvlJc w:val="left"/>
+      <w:pPr>
+        <w:tabs>
+          <w:tab w:val="num" w:pos="5760"/>
+        </w:tabs>
+        <w:ind w:left="5760" w:hanging="360"/>
+      </w:pPr>
+      <w:rPr>
+        <w:rFonts w:ascii="Times New Roman" w:hAnsi="Times New Roman" w:cs="Times New Roman" w:hint="default"/>
+      </w:rPr>
+    </w:lvl>
+    <w:lvl w:ilvl="8">
+      <w:start w:val="1"/>
+      <w:numFmt w:val="decimal"/>
+      <w:lvlText w:val="%9."/>
+      <w:lvlJc w:val="left"/>
+      <w:pPr>
+        <w:tabs>
+          <w:tab w:val="num" w:pos="6480"/>
+        </w:tabs>
+        <w:ind w:left="6480" w:hanging="360"/>
+      </w:pPr>
+      <w:rPr>
+        <w:rFonts w:ascii="Times New Roman" w:hAnsi="Times New Roman" w:cs="Times New Roman" w:hint="default"/>
+      </w:rPr>
+    </w:lvl>
+  </w:abstractNum>
   <w:num w:numId="1">
     <w:abstractNumId w:val="0"/>
+  </w:num>
+  <w:num w:numId="2">
+    <w:abstractNumId w:val="3"/>
+    <w:lvlOverride w:ilvl="0">
+      <w:startOverride w:val="1"/>
+    </w:lvlOverride>
+    <w:lvlOverride w:ilvl="1">
+      <w:startOverride w:val="1"/>
+    </w:lvlOverride>
+    <w:lvlOverride w:ilvl="2">
+      <w:startOverride w:val="1"/>
+    </w:lvlOverride>
+    <w:lvlOverride w:ilvl="3">
+      <w:startOverride w:val="1"/>
+    </w:lvlOverride>
+    <w:lvlOverride w:ilvl="4">
+      <w:startOverride w:val="1"/>
+    </w:lvlOverride>
+    <w:lvlOverride w:ilvl="5">
+      <w:startOverride w:val="1"/>
+    </w:lvlOverride>
+    <w:lvlOverride w:ilvl="6">
+      <w:startOverride w:val="1"/>
+    </w:lvlOverride>
+    <w:lvlOverride w:ilvl="7">
+      <w:startOverride w:val="1"/>
+    </w:lvlOverride>
+    <w:lvlOverride w:ilvl="8">
+      <w:startOverride w:val="1"/>
+    </w:lvlOverride>
+  </w:num>
+  <w:num w:numId="3">
+    <w:abstractNumId w:val="1"/>
+    <w:lvlOverride w:ilvl="0"/>
+    <w:lvlOverride w:ilvl="1"/>
+    <w:lvlOverride w:ilvl="2"/>
+    <w:lvlOverride w:ilvl="3"/>
+    <w:lvlOverride w:ilvl="4"/>
+    <w:lvlOverride w:ilvl="5"/>
+    <w:lvlOverride w:ilvl="6"/>
+    <w:lvlOverride w:ilvl="7"/>
+    <w:lvlOverride w:ilvl="8"/>
+  </w:num>
+  <w:num w:numId="4">
+    <w:abstractNumId w:val="2"/>
+    <w:lvlOverride w:ilvl="0"/>
+    <w:lvlOverride w:ilvl="1"/>
+    <w:lvlOverride w:ilvl="2"/>
+    <w:lvlOverride w:ilvl="3"/>
+    <w:lvlOverride w:ilvl="4"/>
+    <w:lvlOverride w:ilvl="5"/>
+    <w:lvlOverride w:ilvl="6"/>
+    <w:lvlOverride w:ilvl="7"/>
+    <w:lvlOverride w:ilvl="8"/>
   </w:num>
 </w:numbering>
 </file>
@@ -5908,7 +7905,7 @@
   <w:style w:type="paragraph" w:default="1" w:styleId="Normal">
     <w:name w:val="Normal"/>
     <w:qFormat/>
-    <w:rsid w:val="00EE79A6"/>
+    <w:rsid w:val="00D877C8"/>
     <w:pPr>
       <w:spacing w:before="100" w:beforeAutospacing="1" w:line="276" w:lineRule="auto"/>
     </w:pPr>
@@ -6233,6 +8230,17 @@
       <w:bCs/>
     </w:rPr>
   </w:style>
+  <w:style w:type="paragraph" w:styleId="ListParagraph">
+    <w:name w:val="List Paragraph"/>
+    <w:basedOn w:val="Normal"/>
+    <w:uiPriority w:val="34"/>
+    <w:qFormat/>
+    <w:rsid w:val="00665698"/>
+    <w:pPr>
+      <w:ind w:left="720"/>
+      <w:contextualSpacing/>
+    </w:pPr>
+  </w:style>
 </w:styles>
 </file>
 
@@ -6536,7 +8544,7 @@
 </file>
 
 <file path=customXml/itemProps1.xml><?xml version="1.0" encoding="utf-8"?>
-<ds:datastoreItem xmlns:ds="http://schemas.openxmlformats.org/officeDocument/2006/customXml" ds:itemID="{E84047F4-F1DF-47EF-A214-AB604EF4712A}">
+<ds:datastoreItem xmlns:ds="http://schemas.openxmlformats.org/officeDocument/2006/customXml" ds:itemID="{BE414B2F-4AE2-4198-95D5-C8579D8DD01F}">
   <ds:schemaRefs>
     <ds:schemaRef ds:uri="http://schemas.openxmlformats.org/officeDocument/2006/bibliography"/>
   </ds:schemaRefs>

</xml_diff>

<commit_message>
Add Week 8 tasks and update logbook
</commit_message>
<xml_diff>
--- a/log book-Advanced web.docx
+++ b/log book-Advanced web.docx
@@ -425,8 +425,11 @@
               <w:tab w:val="right" w:leader="dot" w:pos="9350"/>
             </w:tabs>
             <w:rPr>
-              <w:rFonts w:ascii="Times New Roman" w:hAnsi="Times New Roman"/>
+              <w:rFonts w:asciiTheme="minorHAnsi" w:eastAsiaTheme="minorEastAsia" w:hAnsiTheme="minorHAnsi" w:cstheme="minorBidi"/>
               <w:noProof/>
+              <w:kern w:val="0"/>
+              <w:sz w:val="22"/>
+              <w:szCs w:val="22"/>
             </w:rPr>
           </w:pPr>
           <w:r>
@@ -447,18 +450,16 @@
             </w:rPr>
             <w:fldChar w:fldCharType="separate"/>
           </w:r>
-          <w:hyperlink w:anchor="_Toc231463271" w:history="1">
+          <w:hyperlink w:anchor="_Toc232688294" w:history="1">
             <w:r>
               <w:rPr>
                 <w:rStyle w:val="Hyperlink"/>
-                <w:rFonts w:ascii="Times New Roman" w:hAnsi="Times New Roman"/>
                 <w:noProof/>
               </w:rPr>
               <w:t>WEEK 1: LOCAL ENVIRONMENT SETUP</w:t>
             </w:r>
             <w:r>
               <w:rPr>
-                <w:rFonts w:ascii="Times New Roman" w:hAnsi="Times New Roman"/>
                 <w:noProof/>
                 <w:webHidden/>
               </w:rPr>
@@ -466,7 +467,6 @@
             </w:r>
             <w:r>
               <w:rPr>
-                <w:rFonts w:ascii="Times New Roman" w:hAnsi="Times New Roman"/>
                 <w:noProof/>
                 <w:webHidden/>
               </w:rPr>
@@ -474,22 +474,19 @@
             </w:r>
             <w:r>
               <w:rPr>
-                <w:rFonts w:ascii="Times New Roman" w:hAnsi="Times New Roman"/>
-                <w:noProof/>
-                <w:webHidden/>
-              </w:rPr>
-              <w:instrText xml:space="preserve"> PAGEREF _Toc231463271 \h </w:instrText>
-            </w:r>
-            <w:r>
-              <w:rPr>
-                <w:rFonts w:ascii="Times New Roman" w:hAnsi="Times New Roman"/>
-                <w:noProof/>
-                <w:webHidden/>
-              </w:rPr>
-            </w:r>
-            <w:r>
-              <w:rPr>
-                <w:rFonts w:ascii="Times New Roman" w:hAnsi="Times New Roman"/>
+                <w:noProof/>
+                <w:webHidden/>
+              </w:rPr>
+              <w:instrText xml:space="preserve"> PAGEREF _Toc232688294 \h </w:instrText>
+            </w:r>
+            <w:r>
+              <w:rPr>
+                <w:noProof/>
+                <w:webHidden/>
+              </w:rPr>
+            </w:r>
+            <w:r>
+              <w:rPr>
                 <w:noProof/>
                 <w:webHidden/>
               </w:rPr>
@@ -497,15 +494,13 @@
             </w:r>
             <w:r>
               <w:rPr>
-                <w:rFonts w:ascii="Times New Roman" w:hAnsi="Times New Roman"/>
-                <w:noProof/>
-                <w:webHidden/>
-              </w:rPr>
-              <w:t>2</w:t>
-            </w:r>
-            <w:r>
-              <w:rPr>
-                <w:rFonts w:ascii="Times New Roman" w:hAnsi="Times New Roman"/>
+                <w:noProof/>
+                <w:webHidden/>
+              </w:rPr>
+              <w:t>4</w:t>
+            </w:r>
+            <w:r>
+              <w:rPr>
                 <w:noProof/>
                 <w:webHidden/>
               </w:rPr>
@@ -520,11 +515,14 @@
               <w:tab w:val="right" w:leader="dot" w:pos="9350"/>
             </w:tabs>
             <w:rPr>
-              <w:rFonts w:ascii="Times New Roman" w:hAnsi="Times New Roman"/>
+              <w:rFonts w:asciiTheme="minorHAnsi" w:eastAsiaTheme="minorEastAsia" w:hAnsiTheme="minorHAnsi" w:cstheme="minorBidi"/>
               <w:noProof/>
+              <w:kern w:val="0"/>
+              <w:sz w:val="22"/>
+              <w:szCs w:val="22"/>
             </w:rPr>
           </w:pPr>
-          <w:hyperlink w:anchor="_Toc231463272" w:history="1">
+          <w:hyperlink w:anchor="_Toc232688295" w:history="1">
             <w:r>
               <w:rPr>
                 <w:rStyle w:val="Hyperlink"/>
@@ -535,7 +533,6 @@
             </w:r>
             <w:r>
               <w:rPr>
-                <w:rFonts w:ascii="Times New Roman" w:hAnsi="Times New Roman"/>
                 <w:noProof/>
                 <w:webHidden/>
               </w:rPr>
@@ -543,7 +540,6 @@
             </w:r>
             <w:r>
               <w:rPr>
-                <w:rFonts w:ascii="Times New Roman" w:hAnsi="Times New Roman"/>
                 <w:noProof/>
                 <w:webHidden/>
               </w:rPr>
@@ -551,22 +547,19 @@
             </w:r>
             <w:r>
               <w:rPr>
-                <w:rFonts w:ascii="Times New Roman" w:hAnsi="Times New Roman"/>
-                <w:noProof/>
-                <w:webHidden/>
-              </w:rPr>
-              <w:instrText xml:space="preserve"> PAGEREF _Toc231463272 \h </w:instrText>
-            </w:r>
-            <w:r>
-              <w:rPr>
-                <w:rFonts w:ascii="Times New Roman" w:hAnsi="Times New Roman"/>
-                <w:noProof/>
-                <w:webHidden/>
-              </w:rPr>
-            </w:r>
-            <w:r>
-              <w:rPr>
-                <w:rFonts w:ascii="Times New Roman" w:hAnsi="Times New Roman"/>
+                <w:noProof/>
+                <w:webHidden/>
+              </w:rPr>
+              <w:instrText xml:space="preserve"> PAGEREF _Toc232688295 \h </w:instrText>
+            </w:r>
+            <w:r>
+              <w:rPr>
+                <w:noProof/>
+                <w:webHidden/>
+              </w:rPr>
+            </w:r>
+            <w:r>
+              <w:rPr>
                 <w:noProof/>
                 <w:webHidden/>
               </w:rPr>
@@ -574,15 +567,13 @@
             </w:r>
             <w:r>
               <w:rPr>
-                <w:rFonts w:ascii="Times New Roman" w:hAnsi="Times New Roman"/>
-                <w:noProof/>
-                <w:webHidden/>
-              </w:rPr>
-              <w:t>2</w:t>
-            </w:r>
-            <w:r>
-              <w:rPr>
-                <w:rFonts w:ascii="Times New Roman" w:hAnsi="Times New Roman"/>
+                <w:noProof/>
+                <w:webHidden/>
+              </w:rPr>
+              <w:t>4</w:t>
+            </w:r>
+            <w:r>
+              <w:rPr>
                 <w:noProof/>
                 <w:webHidden/>
               </w:rPr>
@@ -597,11 +588,14 @@
               <w:tab w:val="right" w:leader="dot" w:pos="9350"/>
             </w:tabs>
             <w:rPr>
-              <w:rFonts w:ascii="Times New Roman" w:hAnsi="Times New Roman"/>
+              <w:rFonts w:asciiTheme="minorHAnsi" w:eastAsiaTheme="minorEastAsia" w:hAnsiTheme="minorHAnsi" w:cstheme="minorBidi"/>
               <w:noProof/>
+              <w:kern w:val="0"/>
+              <w:sz w:val="22"/>
+              <w:szCs w:val="22"/>
             </w:rPr>
           </w:pPr>
-          <w:hyperlink w:anchor="_Toc231463273" w:history="1">
+          <w:hyperlink w:anchor="_Toc232688296" w:history="1">
             <w:r>
               <w:rPr>
                 <w:rStyle w:val="Hyperlink"/>
@@ -612,7 +606,6 @@
             </w:r>
             <w:r>
               <w:rPr>
-                <w:rFonts w:ascii="Times New Roman" w:hAnsi="Times New Roman"/>
                 <w:noProof/>
                 <w:webHidden/>
               </w:rPr>
@@ -620,7 +613,6 @@
             </w:r>
             <w:r>
               <w:rPr>
-                <w:rFonts w:ascii="Times New Roman" w:hAnsi="Times New Roman"/>
                 <w:noProof/>
                 <w:webHidden/>
               </w:rPr>
@@ -628,22 +620,19 @@
             </w:r>
             <w:r>
               <w:rPr>
-                <w:rFonts w:ascii="Times New Roman" w:hAnsi="Times New Roman"/>
-                <w:noProof/>
-                <w:webHidden/>
-              </w:rPr>
-              <w:instrText xml:space="preserve"> PAGEREF _Toc231463273 \h </w:instrText>
-            </w:r>
-            <w:r>
-              <w:rPr>
-                <w:rFonts w:ascii="Times New Roman" w:hAnsi="Times New Roman"/>
-                <w:noProof/>
-                <w:webHidden/>
-              </w:rPr>
-            </w:r>
-            <w:r>
-              <w:rPr>
-                <w:rFonts w:ascii="Times New Roman" w:hAnsi="Times New Roman"/>
+                <w:noProof/>
+                <w:webHidden/>
+              </w:rPr>
+              <w:instrText xml:space="preserve"> PAGEREF _Toc232688296 \h </w:instrText>
+            </w:r>
+            <w:r>
+              <w:rPr>
+                <w:noProof/>
+                <w:webHidden/>
+              </w:rPr>
+            </w:r>
+            <w:r>
+              <w:rPr>
                 <w:noProof/>
                 <w:webHidden/>
               </w:rPr>
@@ -651,15 +640,13 @@
             </w:r>
             <w:r>
               <w:rPr>
-                <w:rFonts w:ascii="Times New Roman" w:hAnsi="Times New Roman"/>
-                <w:noProof/>
-                <w:webHidden/>
-              </w:rPr>
-              <w:t>2</w:t>
-            </w:r>
-            <w:r>
-              <w:rPr>
-                <w:rFonts w:ascii="Times New Roman" w:hAnsi="Times New Roman"/>
+                <w:noProof/>
+                <w:webHidden/>
+              </w:rPr>
+              <w:t>4</w:t>
+            </w:r>
+            <w:r>
+              <w:rPr>
                 <w:noProof/>
                 <w:webHidden/>
               </w:rPr>
@@ -674,11 +661,14 @@
               <w:tab w:val="right" w:leader="dot" w:pos="9350"/>
             </w:tabs>
             <w:rPr>
-              <w:rFonts w:ascii="Times New Roman" w:hAnsi="Times New Roman"/>
+              <w:rFonts w:asciiTheme="minorHAnsi" w:eastAsiaTheme="minorEastAsia" w:hAnsiTheme="minorHAnsi" w:cstheme="minorBidi"/>
               <w:noProof/>
+              <w:kern w:val="0"/>
+              <w:sz w:val="22"/>
+              <w:szCs w:val="22"/>
             </w:rPr>
           </w:pPr>
-          <w:hyperlink w:anchor="_Toc231463274" w:history="1">
+          <w:hyperlink w:anchor="_Toc232688297" w:history="1">
             <w:r>
               <w:rPr>
                 <w:rStyle w:val="Hyperlink"/>
@@ -691,7 +681,6 @@
             </w:r>
             <w:r>
               <w:rPr>
-                <w:rFonts w:ascii="Times New Roman" w:hAnsi="Times New Roman"/>
                 <w:noProof/>
                 <w:webHidden/>
               </w:rPr>
@@ -699,7 +688,6 @@
             </w:r>
             <w:r>
               <w:rPr>
-                <w:rFonts w:ascii="Times New Roman" w:hAnsi="Times New Roman"/>
                 <w:noProof/>
                 <w:webHidden/>
               </w:rPr>
@@ -707,22 +695,19 @@
             </w:r>
             <w:r>
               <w:rPr>
-                <w:rFonts w:ascii="Times New Roman" w:hAnsi="Times New Roman"/>
-                <w:noProof/>
-                <w:webHidden/>
-              </w:rPr>
-              <w:instrText xml:space="preserve"> PAGEREF _Toc231463274 \h </w:instrText>
-            </w:r>
-            <w:r>
-              <w:rPr>
-                <w:rFonts w:ascii="Times New Roman" w:hAnsi="Times New Roman"/>
-                <w:noProof/>
-                <w:webHidden/>
-              </w:rPr>
-            </w:r>
-            <w:r>
-              <w:rPr>
-                <w:rFonts w:ascii="Times New Roman" w:hAnsi="Times New Roman"/>
+                <w:noProof/>
+                <w:webHidden/>
+              </w:rPr>
+              <w:instrText xml:space="preserve"> PAGEREF _Toc232688297 \h </w:instrText>
+            </w:r>
+            <w:r>
+              <w:rPr>
+                <w:noProof/>
+                <w:webHidden/>
+              </w:rPr>
+            </w:r>
+            <w:r>
+              <w:rPr>
                 <w:noProof/>
                 <w:webHidden/>
               </w:rPr>
@@ -730,15 +715,13 @@
             </w:r>
             <w:r>
               <w:rPr>
-                <w:rFonts w:ascii="Times New Roman" w:hAnsi="Times New Roman"/>
-                <w:noProof/>
-                <w:webHidden/>
-              </w:rPr>
-              <w:t>2</w:t>
-            </w:r>
-            <w:r>
-              <w:rPr>
-                <w:rFonts w:ascii="Times New Roman" w:hAnsi="Times New Roman"/>
+                <w:noProof/>
+                <w:webHidden/>
+              </w:rPr>
+              <w:t>4</w:t>
+            </w:r>
+            <w:r>
+              <w:rPr>
                 <w:noProof/>
                 <w:webHidden/>
               </w:rPr>
@@ -753,11 +736,14 @@
               <w:tab w:val="right" w:leader="dot" w:pos="9350"/>
             </w:tabs>
             <w:rPr>
-              <w:rFonts w:ascii="Times New Roman" w:hAnsi="Times New Roman"/>
+              <w:rFonts w:asciiTheme="minorHAnsi" w:eastAsiaTheme="minorEastAsia" w:hAnsiTheme="minorHAnsi" w:cstheme="minorBidi"/>
               <w:noProof/>
+              <w:kern w:val="0"/>
+              <w:sz w:val="22"/>
+              <w:szCs w:val="22"/>
             </w:rPr>
           </w:pPr>
-          <w:hyperlink w:anchor="_Toc231463275" w:history="1">
+          <w:hyperlink w:anchor="_Toc232688298" w:history="1">
             <w:r>
               <w:rPr>
                 <w:rStyle w:val="Hyperlink"/>
@@ -770,7 +756,6 @@
             </w:r>
             <w:r>
               <w:rPr>
-                <w:rFonts w:ascii="Times New Roman" w:hAnsi="Times New Roman"/>
                 <w:noProof/>
                 <w:webHidden/>
               </w:rPr>
@@ -778,7 +763,6 @@
             </w:r>
             <w:r>
               <w:rPr>
-                <w:rFonts w:ascii="Times New Roman" w:hAnsi="Times New Roman"/>
                 <w:noProof/>
                 <w:webHidden/>
               </w:rPr>
@@ -786,22 +770,19 @@
             </w:r>
             <w:r>
               <w:rPr>
-                <w:rFonts w:ascii="Times New Roman" w:hAnsi="Times New Roman"/>
-                <w:noProof/>
-                <w:webHidden/>
-              </w:rPr>
-              <w:instrText xml:space="preserve"> PAGEREF _Toc231463275 \h </w:instrText>
-            </w:r>
-            <w:r>
-              <w:rPr>
-                <w:rFonts w:ascii="Times New Roman" w:hAnsi="Times New Roman"/>
-                <w:noProof/>
-                <w:webHidden/>
-              </w:rPr>
-            </w:r>
-            <w:r>
-              <w:rPr>
-                <w:rFonts w:ascii="Times New Roman" w:hAnsi="Times New Roman"/>
+                <w:noProof/>
+                <w:webHidden/>
+              </w:rPr>
+              <w:instrText xml:space="preserve"> PAGEREF _Toc232688298 \h </w:instrText>
+            </w:r>
+            <w:r>
+              <w:rPr>
+                <w:noProof/>
+                <w:webHidden/>
+              </w:rPr>
+            </w:r>
+            <w:r>
+              <w:rPr>
                 <w:noProof/>
                 <w:webHidden/>
               </w:rPr>
@@ -809,15 +790,13 @@
             </w:r>
             <w:r>
               <w:rPr>
-                <w:rFonts w:ascii="Times New Roman" w:hAnsi="Times New Roman"/>
-                <w:noProof/>
-                <w:webHidden/>
-              </w:rPr>
-              <w:t>3</w:t>
-            </w:r>
-            <w:r>
-              <w:rPr>
-                <w:rFonts w:ascii="Times New Roman" w:hAnsi="Times New Roman"/>
+                <w:noProof/>
+                <w:webHidden/>
+              </w:rPr>
+              <w:t>5</w:t>
+            </w:r>
+            <w:r>
+              <w:rPr>
                 <w:noProof/>
                 <w:webHidden/>
               </w:rPr>
@@ -832,11 +811,14 @@
               <w:tab w:val="right" w:leader="dot" w:pos="9350"/>
             </w:tabs>
             <w:rPr>
-              <w:rFonts w:ascii="Times New Roman" w:hAnsi="Times New Roman"/>
+              <w:rFonts w:asciiTheme="minorHAnsi" w:eastAsiaTheme="minorEastAsia" w:hAnsiTheme="minorHAnsi" w:cstheme="minorBidi"/>
               <w:noProof/>
+              <w:kern w:val="0"/>
+              <w:sz w:val="22"/>
+              <w:szCs w:val="22"/>
             </w:rPr>
           </w:pPr>
-          <w:hyperlink w:anchor="_Toc231463276" w:history="1">
+          <w:hyperlink w:anchor="_Toc232688299" w:history="1">
             <w:r>
               <w:rPr>
                 <w:rStyle w:val="Hyperlink"/>
@@ -849,7 +831,6 @@
             </w:r>
             <w:r>
               <w:rPr>
-                <w:rFonts w:ascii="Times New Roman" w:hAnsi="Times New Roman"/>
                 <w:noProof/>
                 <w:webHidden/>
               </w:rPr>
@@ -857,7 +838,6 @@
             </w:r>
             <w:r>
               <w:rPr>
-                <w:rFonts w:ascii="Times New Roman" w:hAnsi="Times New Roman"/>
                 <w:noProof/>
                 <w:webHidden/>
               </w:rPr>
@@ -865,22 +845,19 @@
             </w:r>
             <w:r>
               <w:rPr>
-                <w:rFonts w:ascii="Times New Roman" w:hAnsi="Times New Roman"/>
-                <w:noProof/>
-                <w:webHidden/>
-              </w:rPr>
-              <w:instrText xml:space="preserve"> PAGEREF _Toc231463276 \h </w:instrText>
-            </w:r>
-            <w:r>
-              <w:rPr>
-                <w:rFonts w:ascii="Times New Roman" w:hAnsi="Times New Roman"/>
-                <w:noProof/>
-                <w:webHidden/>
-              </w:rPr>
-            </w:r>
-            <w:r>
-              <w:rPr>
-                <w:rFonts w:ascii="Times New Roman" w:hAnsi="Times New Roman"/>
+                <w:noProof/>
+                <w:webHidden/>
+              </w:rPr>
+              <w:instrText xml:space="preserve"> PAGEREF _Toc232688299 \h </w:instrText>
+            </w:r>
+            <w:r>
+              <w:rPr>
+                <w:noProof/>
+                <w:webHidden/>
+              </w:rPr>
+            </w:r>
+            <w:r>
+              <w:rPr>
                 <w:noProof/>
                 <w:webHidden/>
               </w:rPr>
@@ -888,15 +865,13 @@
             </w:r>
             <w:r>
               <w:rPr>
-                <w:rFonts w:ascii="Times New Roman" w:hAnsi="Times New Roman"/>
-                <w:noProof/>
-                <w:webHidden/>
-              </w:rPr>
-              <w:t>3</w:t>
-            </w:r>
-            <w:r>
-              <w:rPr>
-                <w:rFonts w:ascii="Times New Roman" w:hAnsi="Times New Roman"/>
+                <w:noProof/>
+                <w:webHidden/>
+              </w:rPr>
+              <w:t>5</w:t>
+            </w:r>
+            <w:r>
+              <w:rPr>
                 <w:noProof/>
                 <w:webHidden/>
               </w:rPr>
@@ -911,11 +886,14 @@
               <w:tab w:val="right" w:leader="dot" w:pos="9350"/>
             </w:tabs>
             <w:rPr>
-              <w:rFonts w:ascii="Times New Roman" w:hAnsi="Times New Roman"/>
+              <w:rFonts w:asciiTheme="minorHAnsi" w:eastAsiaTheme="minorEastAsia" w:hAnsiTheme="minorHAnsi" w:cstheme="minorBidi"/>
               <w:noProof/>
+              <w:kern w:val="0"/>
+              <w:sz w:val="22"/>
+              <w:szCs w:val="22"/>
             </w:rPr>
           </w:pPr>
-          <w:hyperlink w:anchor="_Toc231463277" w:history="1">
+          <w:hyperlink w:anchor="_Toc232688300" w:history="1">
             <w:r>
               <w:rPr>
                 <w:rStyle w:val="Hyperlink"/>
@@ -928,7 +906,6 @@
             </w:r>
             <w:r>
               <w:rPr>
-                <w:rFonts w:ascii="Times New Roman" w:hAnsi="Times New Roman"/>
                 <w:noProof/>
                 <w:webHidden/>
               </w:rPr>
@@ -936,7 +913,6 @@
             </w:r>
             <w:r>
               <w:rPr>
-                <w:rFonts w:ascii="Times New Roman" w:hAnsi="Times New Roman"/>
                 <w:noProof/>
                 <w:webHidden/>
               </w:rPr>
@@ -944,22 +920,19 @@
             </w:r>
             <w:r>
               <w:rPr>
-                <w:rFonts w:ascii="Times New Roman" w:hAnsi="Times New Roman"/>
-                <w:noProof/>
-                <w:webHidden/>
-              </w:rPr>
-              <w:instrText xml:space="preserve"> PAGEREF _Toc231463277 \h </w:instrText>
-            </w:r>
-            <w:r>
-              <w:rPr>
-                <w:rFonts w:ascii="Times New Roman" w:hAnsi="Times New Roman"/>
-                <w:noProof/>
-                <w:webHidden/>
-              </w:rPr>
-            </w:r>
-            <w:r>
-              <w:rPr>
-                <w:rFonts w:ascii="Times New Roman" w:hAnsi="Times New Roman"/>
+                <w:noProof/>
+                <w:webHidden/>
+              </w:rPr>
+              <w:instrText xml:space="preserve"> PAGEREF _Toc232688300 \h </w:instrText>
+            </w:r>
+            <w:r>
+              <w:rPr>
+                <w:noProof/>
+                <w:webHidden/>
+              </w:rPr>
+            </w:r>
+            <w:r>
+              <w:rPr>
                 <w:noProof/>
                 <w:webHidden/>
               </w:rPr>
@@ -967,15 +940,13 @@
             </w:r>
             <w:r>
               <w:rPr>
-                <w:rFonts w:ascii="Times New Roman" w:hAnsi="Times New Roman"/>
-                <w:noProof/>
-                <w:webHidden/>
-              </w:rPr>
-              <w:t>4</w:t>
-            </w:r>
-            <w:r>
-              <w:rPr>
-                <w:rFonts w:ascii="Times New Roman" w:hAnsi="Times New Roman"/>
+                <w:noProof/>
+                <w:webHidden/>
+              </w:rPr>
+              <w:t>5</w:t>
+            </w:r>
+            <w:r>
+              <w:rPr>
                 <w:noProof/>
                 <w:webHidden/>
               </w:rPr>
@@ -990,11 +961,14 @@
               <w:tab w:val="right" w:leader="dot" w:pos="9350"/>
             </w:tabs>
             <w:rPr>
-              <w:rFonts w:ascii="Times New Roman" w:hAnsi="Times New Roman"/>
+              <w:rFonts w:asciiTheme="minorHAnsi" w:eastAsiaTheme="minorEastAsia" w:hAnsiTheme="minorHAnsi" w:cstheme="minorBidi"/>
               <w:noProof/>
+              <w:kern w:val="0"/>
+              <w:sz w:val="22"/>
+              <w:szCs w:val="22"/>
             </w:rPr>
           </w:pPr>
-          <w:hyperlink w:anchor="_Toc231463278" w:history="1">
+          <w:hyperlink w:anchor="_Toc232688301" w:history="1">
             <w:r>
               <w:rPr>
                 <w:rStyle w:val="Hyperlink"/>
@@ -1007,7 +981,6 @@
             </w:r>
             <w:r>
               <w:rPr>
-                <w:rFonts w:ascii="Times New Roman" w:hAnsi="Times New Roman"/>
                 <w:noProof/>
                 <w:webHidden/>
               </w:rPr>
@@ -1015,7 +988,6 @@
             </w:r>
             <w:r>
               <w:rPr>
-                <w:rFonts w:ascii="Times New Roman" w:hAnsi="Times New Roman"/>
                 <w:noProof/>
                 <w:webHidden/>
               </w:rPr>
@@ -1023,22 +995,19 @@
             </w:r>
             <w:r>
               <w:rPr>
-                <w:rFonts w:ascii="Times New Roman" w:hAnsi="Times New Roman"/>
-                <w:noProof/>
-                <w:webHidden/>
-              </w:rPr>
-              <w:instrText xml:space="preserve"> PAGEREF _Toc231463278 \h </w:instrText>
-            </w:r>
-            <w:r>
-              <w:rPr>
-                <w:rFonts w:ascii="Times New Roman" w:hAnsi="Times New Roman"/>
-                <w:noProof/>
-                <w:webHidden/>
-              </w:rPr>
-            </w:r>
-            <w:r>
-              <w:rPr>
-                <w:rFonts w:ascii="Times New Roman" w:hAnsi="Times New Roman"/>
+                <w:noProof/>
+                <w:webHidden/>
+              </w:rPr>
+              <w:instrText xml:space="preserve"> PAGEREF _Toc232688301 \h </w:instrText>
+            </w:r>
+            <w:r>
+              <w:rPr>
+                <w:noProof/>
+                <w:webHidden/>
+              </w:rPr>
+            </w:r>
+            <w:r>
+              <w:rPr>
                 <w:noProof/>
                 <w:webHidden/>
               </w:rPr>
@@ -1046,15 +1015,13 @@
             </w:r>
             <w:r>
               <w:rPr>
-                <w:rFonts w:ascii="Times New Roman" w:hAnsi="Times New Roman"/>
-                <w:noProof/>
-                <w:webHidden/>
-              </w:rPr>
-              <w:t>4</w:t>
-            </w:r>
-            <w:r>
-              <w:rPr>
-                <w:rFonts w:ascii="Times New Roman" w:hAnsi="Times New Roman"/>
+                <w:noProof/>
+                <w:webHidden/>
+              </w:rPr>
+              <w:t>6</w:t>
+            </w:r>
+            <w:r>
+              <w:rPr>
                 <w:noProof/>
                 <w:webHidden/>
               </w:rPr>
@@ -1069,11 +1036,14 @@
               <w:tab w:val="right" w:leader="dot" w:pos="9350"/>
             </w:tabs>
             <w:rPr>
-              <w:rFonts w:ascii="Times New Roman" w:hAnsi="Times New Roman"/>
+              <w:rFonts w:asciiTheme="minorHAnsi" w:eastAsiaTheme="minorEastAsia" w:hAnsiTheme="minorHAnsi" w:cstheme="minorBidi"/>
               <w:noProof/>
+              <w:kern w:val="0"/>
+              <w:sz w:val="22"/>
+              <w:szCs w:val="22"/>
             </w:rPr>
           </w:pPr>
-          <w:hyperlink w:anchor="_Toc231463279" w:history="1">
+          <w:hyperlink w:anchor="_Toc232688302" w:history="1">
             <w:r>
               <w:rPr>
                 <w:rStyle w:val="Hyperlink"/>
@@ -1086,7 +1056,6 @@
             </w:r>
             <w:r>
               <w:rPr>
-                <w:rFonts w:ascii="Times New Roman" w:hAnsi="Times New Roman"/>
                 <w:noProof/>
                 <w:webHidden/>
               </w:rPr>
@@ -1094,7 +1063,6 @@
             </w:r>
             <w:r>
               <w:rPr>
-                <w:rFonts w:ascii="Times New Roman" w:hAnsi="Times New Roman"/>
                 <w:noProof/>
                 <w:webHidden/>
               </w:rPr>
@@ -1102,22 +1070,19 @@
             </w:r>
             <w:r>
               <w:rPr>
-                <w:rFonts w:ascii="Times New Roman" w:hAnsi="Times New Roman"/>
-                <w:noProof/>
-                <w:webHidden/>
-              </w:rPr>
-              <w:instrText xml:space="preserve"> PAGEREF _Toc231463279 \h </w:instrText>
-            </w:r>
-            <w:r>
-              <w:rPr>
-                <w:rFonts w:ascii="Times New Roman" w:hAnsi="Times New Roman"/>
-                <w:noProof/>
-                <w:webHidden/>
-              </w:rPr>
-            </w:r>
-            <w:r>
-              <w:rPr>
-                <w:rFonts w:ascii="Times New Roman" w:hAnsi="Times New Roman"/>
+                <w:noProof/>
+                <w:webHidden/>
+              </w:rPr>
+              <w:instrText xml:space="preserve"> PAGEREF _Toc232688302 \h </w:instrText>
+            </w:r>
+            <w:r>
+              <w:rPr>
+                <w:noProof/>
+                <w:webHidden/>
+              </w:rPr>
+            </w:r>
+            <w:r>
+              <w:rPr>
                 <w:noProof/>
                 <w:webHidden/>
               </w:rPr>
@@ -1125,15 +1090,13 @@
             </w:r>
             <w:r>
               <w:rPr>
-                <w:rFonts w:ascii="Times New Roman" w:hAnsi="Times New Roman"/>
-                <w:noProof/>
-                <w:webHidden/>
-              </w:rPr>
-              <w:t>4</w:t>
-            </w:r>
-            <w:r>
-              <w:rPr>
-                <w:rFonts w:ascii="Times New Roman" w:hAnsi="Times New Roman"/>
+                <w:noProof/>
+                <w:webHidden/>
+              </w:rPr>
+              <w:t>6</w:t>
+            </w:r>
+            <w:r>
+              <w:rPr>
                 <w:noProof/>
                 <w:webHidden/>
               </w:rPr>
@@ -1148,11 +1111,14 @@
               <w:tab w:val="right" w:leader="dot" w:pos="9350"/>
             </w:tabs>
             <w:rPr>
-              <w:rFonts w:ascii="Times New Roman" w:hAnsi="Times New Roman"/>
+              <w:rFonts w:asciiTheme="minorHAnsi" w:eastAsiaTheme="minorEastAsia" w:hAnsiTheme="minorHAnsi" w:cstheme="minorBidi"/>
               <w:noProof/>
+              <w:kern w:val="0"/>
+              <w:sz w:val="22"/>
+              <w:szCs w:val="22"/>
             </w:rPr>
           </w:pPr>
-          <w:hyperlink w:anchor="_Toc231463280" w:history="1">
+          <w:hyperlink w:anchor="_Toc232688303" w:history="1">
             <w:r>
               <w:rPr>
                 <w:rStyle w:val="Hyperlink"/>
@@ -1161,11 +1127,10 @@
                 <w:bCs/>
                 <w:noProof/>
               </w:rPr>
-              <w:t>Dashboard Layout Design</w:t>
-            </w:r>
-            <w:r>
-              <w:rPr>
-                <w:rFonts w:ascii="Times New Roman" w:hAnsi="Times New Roman"/>
+              <w:t>Hand-drawn Wireframe</w:t>
+            </w:r>
+            <w:r>
+              <w:rPr>
                 <w:noProof/>
                 <w:webHidden/>
               </w:rPr>
@@ -1173,7 +1138,6 @@
             </w:r>
             <w:r>
               <w:rPr>
-                <w:rFonts w:ascii="Times New Roman" w:hAnsi="Times New Roman"/>
                 <w:noProof/>
                 <w:webHidden/>
               </w:rPr>
@@ -1181,22 +1145,19 @@
             </w:r>
             <w:r>
               <w:rPr>
-                <w:rFonts w:ascii="Times New Roman" w:hAnsi="Times New Roman"/>
-                <w:noProof/>
-                <w:webHidden/>
-              </w:rPr>
-              <w:instrText xml:space="preserve"> PAGEREF _Toc231463280 \h </w:instrText>
-            </w:r>
-            <w:r>
-              <w:rPr>
-                <w:rFonts w:ascii="Times New Roman" w:hAnsi="Times New Roman"/>
-                <w:noProof/>
-                <w:webHidden/>
-              </w:rPr>
-            </w:r>
-            <w:r>
-              <w:rPr>
-                <w:rFonts w:ascii="Times New Roman" w:hAnsi="Times New Roman"/>
+                <w:noProof/>
+                <w:webHidden/>
+              </w:rPr>
+              <w:instrText xml:space="preserve"> PAGEREF _Toc232688303 \h </w:instrText>
+            </w:r>
+            <w:r>
+              <w:rPr>
+                <w:noProof/>
+                <w:webHidden/>
+              </w:rPr>
+            </w:r>
+            <w:r>
+              <w:rPr>
                 <w:noProof/>
                 <w:webHidden/>
               </w:rPr>
@@ -1204,15 +1165,13 @@
             </w:r>
             <w:r>
               <w:rPr>
-                <w:rFonts w:ascii="Times New Roman" w:hAnsi="Times New Roman"/>
-                <w:noProof/>
-                <w:webHidden/>
-              </w:rPr>
-              <w:t>5</w:t>
-            </w:r>
-            <w:r>
-              <w:rPr>
-                <w:rFonts w:ascii="Times New Roman" w:hAnsi="Times New Roman"/>
+                <w:noProof/>
+                <w:webHidden/>
+              </w:rPr>
+              <w:t>6</w:t>
+            </w:r>
+            <w:r>
+              <w:rPr>
                 <w:noProof/>
                 <w:webHidden/>
               </w:rPr>
@@ -1227,11 +1186,14 @@
               <w:tab w:val="right" w:leader="dot" w:pos="9350"/>
             </w:tabs>
             <w:rPr>
-              <w:rFonts w:ascii="Times New Roman" w:hAnsi="Times New Roman"/>
+              <w:rFonts w:asciiTheme="minorHAnsi" w:eastAsiaTheme="minorEastAsia" w:hAnsiTheme="minorHAnsi" w:cstheme="minorBidi"/>
               <w:noProof/>
+              <w:kern w:val="0"/>
+              <w:sz w:val="22"/>
+              <w:szCs w:val="22"/>
             </w:rPr>
           </w:pPr>
-          <w:hyperlink w:anchor="_Toc231463281" w:history="1">
+          <w:hyperlink w:anchor="_Toc232688304" w:history="1">
             <w:r>
               <w:rPr>
                 <w:rStyle w:val="Hyperlink"/>
@@ -1240,11 +1202,10 @@
                 <w:bCs/>
                 <w:noProof/>
               </w:rPr>
-              <w:t>Mobile View Mockup</w:t>
-            </w:r>
-            <w:r>
-              <w:rPr>
-                <w:rFonts w:ascii="Times New Roman" w:hAnsi="Times New Roman"/>
+              <w:t>Dashboard Layout Design</w:t>
+            </w:r>
+            <w:r>
+              <w:rPr>
                 <w:noProof/>
                 <w:webHidden/>
               </w:rPr>
@@ -1252,7 +1213,6 @@
             </w:r>
             <w:r>
               <w:rPr>
-                <w:rFonts w:ascii="Times New Roman" w:hAnsi="Times New Roman"/>
                 <w:noProof/>
                 <w:webHidden/>
               </w:rPr>
@@ -1260,22 +1220,19 @@
             </w:r>
             <w:r>
               <w:rPr>
-                <w:rFonts w:ascii="Times New Roman" w:hAnsi="Times New Roman"/>
-                <w:noProof/>
-                <w:webHidden/>
-              </w:rPr>
-              <w:instrText xml:space="preserve"> PAGEREF _Toc231463281 \h </w:instrText>
-            </w:r>
-            <w:r>
-              <w:rPr>
-                <w:rFonts w:ascii="Times New Roman" w:hAnsi="Times New Roman"/>
-                <w:noProof/>
-                <w:webHidden/>
-              </w:rPr>
-            </w:r>
-            <w:r>
-              <w:rPr>
-                <w:rFonts w:ascii="Times New Roman" w:hAnsi="Times New Roman"/>
+                <w:noProof/>
+                <w:webHidden/>
+              </w:rPr>
+              <w:instrText xml:space="preserve"> PAGEREF _Toc232688304 \h </w:instrText>
+            </w:r>
+            <w:r>
+              <w:rPr>
+                <w:noProof/>
+                <w:webHidden/>
+              </w:rPr>
+            </w:r>
+            <w:r>
+              <w:rPr>
                 <w:noProof/>
                 <w:webHidden/>
               </w:rPr>
@@ -1283,15 +1240,13 @@
             </w:r>
             <w:r>
               <w:rPr>
-                <w:rFonts w:ascii="Times New Roman" w:hAnsi="Times New Roman"/>
-                <w:noProof/>
-                <w:webHidden/>
-              </w:rPr>
-              <w:t>6</w:t>
-            </w:r>
-            <w:r>
-              <w:rPr>
-                <w:rFonts w:ascii="Times New Roman" w:hAnsi="Times New Roman"/>
+                <w:noProof/>
+                <w:webHidden/>
+              </w:rPr>
+              <w:t>7</w:t>
+            </w:r>
+            <w:r>
+              <w:rPr>
                 <w:noProof/>
                 <w:webHidden/>
               </w:rPr>
@@ -1306,11 +1261,14 @@
               <w:tab w:val="right" w:leader="dot" w:pos="9350"/>
             </w:tabs>
             <w:rPr>
-              <w:rFonts w:ascii="Times New Roman" w:hAnsi="Times New Roman"/>
+              <w:rFonts w:asciiTheme="minorHAnsi" w:eastAsiaTheme="minorEastAsia" w:hAnsiTheme="minorHAnsi" w:cstheme="minorBidi"/>
               <w:noProof/>
+              <w:kern w:val="0"/>
+              <w:sz w:val="22"/>
+              <w:szCs w:val="22"/>
             </w:rPr>
           </w:pPr>
-          <w:hyperlink w:anchor="_Toc231463282" w:history="1">
+          <w:hyperlink w:anchor="_Toc232688305" w:history="1">
             <w:r>
               <w:rPr>
                 <w:rStyle w:val="Hyperlink"/>
@@ -1319,11 +1277,10 @@
                 <w:bCs/>
                 <w:noProof/>
               </w:rPr>
-              <w:t>Color Theme and Navigation Structure</w:t>
-            </w:r>
-            <w:r>
-              <w:rPr>
-                <w:rFonts w:ascii="Times New Roman" w:hAnsi="Times New Roman"/>
+              <w:t>Mobile View Mockup</w:t>
+            </w:r>
+            <w:r>
+              <w:rPr>
                 <w:noProof/>
                 <w:webHidden/>
               </w:rPr>
@@ -1331,7 +1288,6 @@
             </w:r>
             <w:r>
               <w:rPr>
-                <w:rFonts w:ascii="Times New Roman" w:hAnsi="Times New Roman"/>
                 <w:noProof/>
                 <w:webHidden/>
               </w:rPr>
@@ -1339,22 +1295,19 @@
             </w:r>
             <w:r>
               <w:rPr>
-                <w:rFonts w:ascii="Times New Roman" w:hAnsi="Times New Roman"/>
-                <w:noProof/>
-                <w:webHidden/>
-              </w:rPr>
-              <w:instrText xml:space="preserve"> PAGEREF _Toc231463282 \h </w:instrText>
-            </w:r>
-            <w:r>
-              <w:rPr>
-                <w:rFonts w:ascii="Times New Roman" w:hAnsi="Times New Roman"/>
-                <w:noProof/>
-                <w:webHidden/>
-              </w:rPr>
-            </w:r>
-            <w:r>
-              <w:rPr>
-                <w:rFonts w:ascii="Times New Roman" w:hAnsi="Times New Roman"/>
+                <w:noProof/>
+                <w:webHidden/>
+              </w:rPr>
+              <w:instrText xml:space="preserve"> PAGEREF _Toc232688305 \h </w:instrText>
+            </w:r>
+            <w:r>
+              <w:rPr>
+                <w:noProof/>
+                <w:webHidden/>
+              </w:rPr>
+            </w:r>
+            <w:r>
+              <w:rPr>
                 <w:noProof/>
                 <w:webHidden/>
               </w:rPr>
@@ -1362,15 +1315,13 @@
             </w:r>
             <w:r>
               <w:rPr>
-                <w:rFonts w:ascii="Times New Roman" w:hAnsi="Times New Roman"/>
-                <w:noProof/>
-                <w:webHidden/>
-              </w:rPr>
-              <w:t>7</w:t>
-            </w:r>
-            <w:r>
-              <w:rPr>
-                <w:rFonts w:ascii="Times New Roman" w:hAnsi="Times New Roman"/>
+                <w:noProof/>
+                <w:webHidden/>
+              </w:rPr>
+              <w:t>8</w:t>
+            </w:r>
+            <w:r>
+              <w:rPr>
                 <w:noProof/>
                 <w:webHidden/>
               </w:rPr>
@@ -1385,11 +1336,14 @@
               <w:tab w:val="right" w:leader="dot" w:pos="9350"/>
             </w:tabs>
             <w:rPr>
-              <w:rFonts w:ascii="Times New Roman" w:hAnsi="Times New Roman"/>
+              <w:rFonts w:asciiTheme="minorHAnsi" w:eastAsiaTheme="minorEastAsia" w:hAnsiTheme="minorHAnsi" w:cstheme="minorBidi"/>
               <w:noProof/>
+              <w:kern w:val="0"/>
+              <w:sz w:val="22"/>
+              <w:szCs w:val="22"/>
             </w:rPr>
           </w:pPr>
-          <w:hyperlink w:anchor="_Toc231463283" w:history="1">
+          <w:hyperlink w:anchor="_Toc232688306" w:history="1">
             <w:r>
               <w:rPr>
                 <w:rStyle w:val="Hyperlink"/>
@@ -1398,11 +1352,10 @@
                 <w:bCs/>
                 <w:noProof/>
               </w:rPr>
-              <w:t>GUI Prototype in Google Stitch</w:t>
-            </w:r>
-            <w:r>
-              <w:rPr>
-                <w:rFonts w:ascii="Times New Roman" w:hAnsi="Times New Roman"/>
+              <w:t>Color Theme and Navigation Structure</w:t>
+            </w:r>
+            <w:r>
+              <w:rPr>
                 <w:noProof/>
                 <w:webHidden/>
               </w:rPr>
@@ -1410,7 +1363,6 @@
             </w:r>
             <w:r>
               <w:rPr>
-                <w:rFonts w:ascii="Times New Roman" w:hAnsi="Times New Roman"/>
                 <w:noProof/>
                 <w:webHidden/>
               </w:rPr>
@@ -1418,22 +1370,19 @@
             </w:r>
             <w:r>
               <w:rPr>
-                <w:rFonts w:ascii="Times New Roman" w:hAnsi="Times New Roman"/>
-                <w:noProof/>
-                <w:webHidden/>
-              </w:rPr>
-              <w:instrText xml:space="preserve"> PAGEREF _Toc231463283 \h </w:instrText>
-            </w:r>
-            <w:r>
-              <w:rPr>
-                <w:rFonts w:ascii="Times New Roman" w:hAnsi="Times New Roman"/>
-                <w:noProof/>
-                <w:webHidden/>
-              </w:rPr>
-            </w:r>
-            <w:r>
-              <w:rPr>
-                <w:rFonts w:ascii="Times New Roman" w:hAnsi="Times New Roman"/>
+                <w:noProof/>
+                <w:webHidden/>
+              </w:rPr>
+              <w:instrText xml:space="preserve"> PAGEREF _Toc232688306 \h </w:instrText>
+            </w:r>
+            <w:r>
+              <w:rPr>
+                <w:noProof/>
+                <w:webHidden/>
+              </w:rPr>
+            </w:r>
+            <w:r>
+              <w:rPr>
                 <w:noProof/>
                 <w:webHidden/>
               </w:rPr>
@@ -1441,7 +1390,6 @@
             </w:r>
             <w:r>
               <w:rPr>
-                <w:rFonts w:ascii="Times New Roman" w:hAnsi="Times New Roman"/>
                 <w:noProof/>
                 <w:webHidden/>
               </w:rPr>
@@ -1449,7 +1397,6 @@
             </w:r>
             <w:r>
               <w:rPr>
-                <w:rFonts w:ascii="Times New Roman" w:hAnsi="Times New Roman"/>
                 <w:noProof/>
                 <w:webHidden/>
               </w:rPr>
@@ -1464,11 +1411,14 @@
               <w:tab w:val="right" w:leader="dot" w:pos="9350"/>
             </w:tabs>
             <w:rPr>
-              <w:rFonts w:ascii="Times New Roman" w:hAnsi="Times New Roman"/>
+              <w:rFonts w:asciiTheme="minorHAnsi" w:eastAsiaTheme="minorEastAsia" w:hAnsiTheme="minorHAnsi" w:cstheme="minorBidi"/>
               <w:noProof/>
+              <w:kern w:val="0"/>
+              <w:sz w:val="22"/>
+              <w:szCs w:val="22"/>
             </w:rPr>
           </w:pPr>
-          <w:hyperlink w:anchor="_Toc231463284" w:history="1">
+          <w:hyperlink w:anchor="_Toc232688307" w:history="1">
             <w:r>
               <w:rPr>
                 <w:rStyle w:val="Hyperlink"/>
@@ -1477,11 +1427,10 @@
                 <w:bCs/>
                 <w:noProof/>
               </w:rPr>
-              <w:t>Week 3: JavaScript and PHP Basics</w:t>
-            </w:r>
-            <w:r>
-              <w:rPr>
-                <w:rFonts w:ascii="Times New Roman" w:hAnsi="Times New Roman"/>
+              <w:t>GUI Prototype in drawer.io</w:t>
+            </w:r>
+            <w:r>
+              <w:rPr>
                 <w:noProof/>
                 <w:webHidden/>
               </w:rPr>
@@ -1489,7 +1438,6 @@
             </w:r>
             <w:r>
               <w:rPr>
-                <w:rFonts w:ascii="Times New Roman" w:hAnsi="Times New Roman"/>
                 <w:noProof/>
                 <w:webHidden/>
               </w:rPr>
@@ -1497,22 +1445,19 @@
             </w:r>
             <w:r>
               <w:rPr>
-                <w:rFonts w:ascii="Times New Roman" w:hAnsi="Times New Roman"/>
-                <w:noProof/>
-                <w:webHidden/>
-              </w:rPr>
-              <w:instrText xml:space="preserve"> PAGEREF _Toc231463284 \h </w:instrText>
-            </w:r>
-            <w:r>
-              <w:rPr>
-                <w:rFonts w:ascii="Times New Roman" w:hAnsi="Times New Roman"/>
-                <w:noProof/>
-                <w:webHidden/>
-              </w:rPr>
-            </w:r>
-            <w:r>
-              <w:rPr>
-                <w:rFonts w:ascii="Times New Roman" w:hAnsi="Times New Roman"/>
+                <w:noProof/>
+                <w:webHidden/>
+              </w:rPr>
+              <w:instrText xml:space="preserve"> PAGEREF _Toc232688307 \h </w:instrText>
+            </w:r>
+            <w:r>
+              <w:rPr>
+                <w:noProof/>
+                <w:webHidden/>
+              </w:rPr>
+            </w:r>
+            <w:r>
+              <w:rPr>
                 <w:noProof/>
                 <w:webHidden/>
               </w:rPr>
@@ -1520,15 +1465,13 @@
             </w:r>
             <w:r>
               <w:rPr>
-                <w:rFonts w:ascii="Times New Roman" w:hAnsi="Times New Roman"/>
-                <w:noProof/>
-                <w:webHidden/>
-              </w:rPr>
-              <w:t>11</w:t>
-            </w:r>
-            <w:r>
-              <w:rPr>
-                <w:rFonts w:ascii="Times New Roman" w:hAnsi="Times New Roman"/>
+                <w:noProof/>
+                <w:webHidden/>
+              </w:rPr>
+              <w:t>9</w:t>
+            </w:r>
+            <w:r>
+              <w:rPr>
                 <w:noProof/>
                 <w:webHidden/>
               </w:rPr>
@@ -1543,11 +1486,14 @@
               <w:tab w:val="right" w:leader="dot" w:pos="9350"/>
             </w:tabs>
             <w:rPr>
-              <w:rFonts w:ascii="Times New Roman" w:hAnsi="Times New Roman"/>
+              <w:rFonts w:asciiTheme="minorHAnsi" w:eastAsiaTheme="minorEastAsia" w:hAnsiTheme="minorHAnsi" w:cstheme="minorBidi"/>
               <w:noProof/>
+              <w:kern w:val="0"/>
+              <w:sz w:val="22"/>
+              <w:szCs w:val="22"/>
             </w:rPr>
           </w:pPr>
-          <w:hyperlink w:anchor="_Toc231463285" w:history="1">
+          <w:hyperlink w:anchor="_Toc232688308" w:history="1">
             <w:r>
               <w:rPr>
                 <w:rStyle w:val="Hyperlink"/>
@@ -1556,11 +1502,10 @@
                 <w:bCs/>
                 <w:noProof/>
               </w:rPr>
-              <w:t>Password Strength Checker</w:t>
-            </w:r>
-            <w:r>
-              <w:rPr>
-                <w:rFonts w:ascii="Times New Roman" w:hAnsi="Times New Roman"/>
+              <w:t>Week 3: JavaScript and PHP Basics</w:t>
+            </w:r>
+            <w:r>
+              <w:rPr>
                 <w:noProof/>
                 <w:webHidden/>
               </w:rPr>
@@ -1568,7 +1513,6 @@
             </w:r>
             <w:r>
               <w:rPr>
-                <w:rFonts w:ascii="Times New Roman" w:hAnsi="Times New Roman"/>
                 <w:noProof/>
                 <w:webHidden/>
               </w:rPr>
@@ -1576,22 +1520,19 @@
             </w:r>
             <w:r>
               <w:rPr>
-                <w:rFonts w:ascii="Times New Roman" w:hAnsi="Times New Roman"/>
-                <w:noProof/>
-                <w:webHidden/>
-              </w:rPr>
-              <w:instrText xml:space="preserve"> PAGEREF _Toc231463285 \h </w:instrText>
-            </w:r>
-            <w:r>
-              <w:rPr>
-                <w:rFonts w:ascii="Times New Roman" w:hAnsi="Times New Roman"/>
-                <w:noProof/>
-                <w:webHidden/>
-              </w:rPr>
-            </w:r>
-            <w:r>
-              <w:rPr>
-                <w:rFonts w:ascii="Times New Roman" w:hAnsi="Times New Roman"/>
+                <w:noProof/>
+                <w:webHidden/>
+              </w:rPr>
+              <w:instrText xml:space="preserve"> PAGEREF _Toc232688308 \h </w:instrText>
+            </w:r>
+            <w:r>
+              <w:rPr>
+                <w:noProof/>
+                <w:webHidden/>
+              </w:rPr>
+            </w:r>
+            <w:r>
+              <w:rPr>
                 <w:noProof/>
                 <w:webHidden/>
               </w:rPr>
@@ -1599,15 +1540,13 @@
             </w:r>
             <w:r>
               <w:rPr>
-                <w:rFonts w:ascii="Times New Roman" w:hAnsi="Times New Roman"/>
-                <w:noProof/>
-                <w:webHidden/>
-              </w:rPr>
-              <w:t>12</w:t>
-            </w:r>
-            <w:r>
-              <w:rPr>
-                <w:rFonts w:ascii="Times New Roman" w:hAnsi="Times New Roman"/>
+                <w:noProof/>
+                <w:webHidden/>
+              </w:rPr>
+              <w:t>11</w:t>
+            </w:r>
+            <w:r>
+              <w:rPr>
                 <w:noProof/>
                 <w:webHidden/>
               </w:rPr>
@@ -1622,11 +1561,14 @@
               <w:tab w:val="right" w:leader="dot" w:pos="9350"/>
             </w:tabs>
             <w:rPr>
-              <w:rFonts w:ascii="Times New Roman" w:hAnsi="Times New Roman"/>
+              <w:rFonts w:asciiTheme="minorHAnsi" w:eastAsiaTheme="minorEastAsia" w:hAnsiTheme="minorHAnsi" w:cstheme="minorBidi"/>
               <w:noProof/>
+              <w:kern w:val="0"/>
+              <w:sz w:val="22"/>
+              <w:szCs w:val="22"/>
             </w:rPr>
           </w:pPr>
-          <w:hyperlink w:anchor="_Toc231463286" w:history="1">
+          <w:hyperlink w:anchor="_Toc232688309" w:history="1">
             <w:r>
               <w:rPr>
                 <w:rStyle w:val="Hyperlink"/>
@@ -1635,11 +1577,10 @@
                 <w:bCs/>
                 <w:noProof/>
               </w:rPr>
-              <w:t>Database Connection Script</w:t>
-            </w:r>
-            <w:r>
-              <w:rPr>
-                <w:rFonts w:ascii="Times New Roman" w:hAnsi="Times New Roman"/>
+              <w:t>Password Strength Checker</w:t>
+            </w:r>
+            <w:r>
+              <w:rPr>
                 <w:noProof/>
                 <w:webHidden/>
               </w:rPr>
@@ -1647,7 +1588,6 @@
             </w:r>
             <w:r>
               <w:rPr>
-                <w:rFonts w:ascii="Times New Roman" w:hAnsi="Times New Roman"/>
                 <w:noProof/>
                 <w:webHidden/>
               </w:rPr>
@@ -1655,22 +1595,19 @@
             </w:r>
             <w:r>
               <w:rPr>
-                <w:rFonts w:ascii="Times New Roman" w:hAnsi="Times New Roman"/>
-                <w:noProof/>
-                <w:webHidden/>
-              </w:rPr>
-              <w:instrText xml:space="preserve"> PAGEREF _Toc231463286 \h </w:instrText>
-            </w:r>
-            <w:r>
-              <w:rPr>
-                <w:rFonts w:ascii="Times New Roman" w:hAnsi="Times New Roman"/>
-                <w:noProof/>
-                <w:webHidden/>
-              </w:rPr>
-            </w:r>
-            <w:r>
-              <w:rPr>
-                <w:rFonts w:ascii="Times New Roman" w:hAnsi="Times New Roman"/>
+                <w:noProof/>
+                <w:webHidden/>
+              </w:rPr>
+              <w:instrText xml:space="preserve"> PAGEREF _Toc232688309 \h </w:instrText>
+            </w:r>
+            <w:r>
+              <w:rPr>
+                <w:noProof/>
+                <w:webHidden/>
+              </w:rPr>
+            </w:r>
+            <w:r>
+              <w:rPr>
                 <w:noProof/>
                 <w:webHidden/>
               </w:rPr>
@@ -1678,15 +1615,13 @@
             </w:r>
             <w:r>
               <w:rPr>
-                <w:rFonts w:ascii="Times New Roman" w:hAnsi="Times New Roman"/>
-                <w:noProof/>
-                <w:webHidden/>
-              </w:rPr>
-              <w:t>13</w:t>
-            </w:r>
-            <w:r>
-              <w:rPr>
-                <w:rFonts w:ascii="Times New Roman" w:hAnsi="Times New Roman"/>
+                <w:noProof/>
+                <w:webHidden/>
+              </w:rPr>
+              <w:t>11</w:t>
+            </w:r>
+            <w:r>
+              <w:rPr>
                 <w:noProof/>
                 <w:webHidden/>
               </w:rPr>
@@ -1701,11 +1636,14 @@
               <w:tab w:val="right" w:leader="dot" w:pos="9350"/>
             </w:tabs>
             <w:rPr>
-              <w:rFonts w:ascii="Times New Roman" w:hAnsi="Times New Roman"/>
+              <w:rFonts w:asciiTheme="minorHAnsi" w:eastAsiaTheme="minorEastAsia" w:hAnsiTheme="minorHAnsi" w:cstheme="minorBidi"/>
               <w:noProof/>
+              <w:kern w:val="0"/>
+              <w:sz w:val="22"/>
+              <w:szCs w:val="22"/>
             </w:rPr>
           </w:pPr>
-          <w:hyperlink w:anchor="_Toc231463287" w:history="1">
+          <w:hyperlink w:anchor="_Toc232688310" w:history="1">
             <w:r>
               <w:rPr>
                 <w:rStyle w:val="Hyperlink"/>
@@ -1714,11 +1652,10 @@
                 <w:bCs/>
                 <w:noProof/>
               </w:rPr>
-              <w:t>Dynamic User Input Handling</w:t>
-            </w:r>
-            <w:r>
-              <w:rPr>
-                <w:rFonts w:ascii="Times New Roman" w:hAnsi="Times New Roman"/>
+              <w:t>Database Connection Script</w:t>
+            </w:r>
+            <w:r>
+              <w:rPr>
                 <w:noProof/>
                 <w:webHidden/>
               </w:rPr>
@@ -1726,7 +1663,6 @@
             </w:r>
             <w:r>
               <w:rPr>
-                <w:rFonts w:ascii="Times New Roman" w:hAnsi="Times New Roman"/>
                 <w:noProof/>
                 <w:webHidden/>
               </w:rPr>
@@ -1734,22 +1670,19 @@
             </w:r>
             <w:r>
               <w:rPr>
-                <w:rFonts w:ascii="Times New Roman" w:hAnsi="Times New Roman"/>
-                <w:noProof/>
-                <w:webHidden/>
-              </w:rPr>
-              <w:instrText xml:space="preserve"> PAGEREF _Toc231463287 \h </w:instrText>
-            </w:r>
-            <w:r>
-              <w:rPr>
-                <w:rFonts w:ascii="Times New Roman" w:hAnsi="Times New Roman"/>
-                <w:noProof/>
-                <w:webHidden/>
-              </w:rPr>
-            </w:r>
-            <w:r>
-              <w:rPr>
-                <w:rFonts w:ascii="Times New Roman" w:hAnsi="Times New Roman"/>
+                <w:noProof/>
+                <w:webHidden/>
+              </w:rPr>
+              <w:instrText xml:space="preserve"> PAGEREF _Toc232688310 \h </w:instrText>
+            </w:r>
+            <w:r>
+              <w:rPr>
+                <w:noProof/>
+                <w:webHidden/>
+              </w:rPr>
+            </w:r>
+            <w:r>
+              <w:rPr>
                 <w:noProof/>
                 <w:webHidden/>
               </w:rPr>
@@ -1757,15 +1690,13 @@
             </w:r>
             <w:r>
               <w:rPr>
-                <w:rFonts w:ascii="Times New Roman" w:hAnsi="Times New Roman"/>
-                <w:noProof/>
-                <w:webHidden/>
-              </w:rPr>
-              <w:t>13</w:t>
-            </w:r>
-            <w:r>
-              <w:rPr>
-                <w:rFonts w:ascii="Times New Roman" w:hAnsi="Times New Roman"/>
+                <w:noProof/>
+                <w:webHidden/>
+              </w:rPr>
+              <w:t>12</w:t>
+            </w:r>
+            <w:r>
+              <w:rPr>
                 <w:noProof/>
                 <w:webHidden/>
               </w:rPr>
@@ -1780,11 +1711,14 @@
               <w:tab w:val="right" w:leader="dot" w:pos="9350"/>
             </w:tabs>
             <w:rPr>
-              <w:rFonts w:ascii="Times New Roman" w:hAnsi="Times New Roman"/>
+              <w:rFonts w:asciiTheme="minorHAnsi" w:eastAsiaTheme="minorEastAsia" w:hAnsiTheme="minorHAnsi" w:cstheme="minorBidi"/>
               <w:noProof/>
+              <w:kern w:val="0"/>
+              <w:sz w:val="22"/>
+              <w:szCs w:val="22"/>
             </w:rPr>
           </w:pPr>
-          <w:hyperlink w:anchor="_Toc231463288" w:history="1">
+          <w:hyperlink w:anchor="_Toc232688311" w:history="1">
             <w:r>
               <w:rPr>
                 <w:rStyle w:val="Hyperlink"/>
@@ -1793,11 +1727,10 @@
                 <w:bCs/>
                 <w:noProof/>
               </w:rPr>
-              <w:t>Week 4: Server-Side Components and Backend Development Foundations</w:t>
-            </w:r>
-            <w:r>
-              <w:rPr>
-                <w:rFonts w:ascii="Times New Roman" w:hAnsi="Times New Roman"/>
+              <w:t>Dynamic User Input Handling</w:t>
+            </w:r>
+            <w:r>
+              <w:rPr>
                 <w:noProof/>
                 <w:webHidden/>
               </w:rPr>
@@ -1805,7 +1738,6 @@
             </w:r>
             <w:r>
               <w:rPr>
-                <w:rFonts w:ascii="Times New Roman" w:hAnsi="Times New Roman"/>
                 <w:noProof/>
                 <w:webHidden/>
               </w:rPr>
@@ -1813,22 +1745,19 @@
             </w:r>
             <w:r>
               <w:rPr>
-                <w:rFonts w:ascii="Times New Roman" w:hAnsi="Times New Roman"/>
-                <w:noProof/>
-                <w:webHidden/>
-              </w:rPr>
-              <w:instrText xml:space="preserve"> PAGEREF _Toc231463288 \h </w:instrText>
-            </w:r>
-            <w:r>
-              <w:rPr>
-                <w:rFonts w:ascii="Times New Roman" w:hAnsi="Times New Roman"/>
-                <w:noProof/>
-                <w:webHidden/>
-              </w:rPr>
-            </w:r>
-            <w:r>
-              <w:rPr>
-                <w:rFonts w:ascii="Times New Roman" w:hAnsi="Times New Roman"/>
+                <w:noProof/>
+                <w:webHidden/>
+              </w:rPr>
+              <w:instrText xml:space="preserve"> PAGEREF _Toc232688311 \h </w:instrText>
+            </w:r>
+            <w:r>
+              <w:rPr>
+                <w:noProof/>
+                <w:webHidden/>
+              </w:rPr>
+            </w:r>
+            <w:r>
+              <w:rPr>
                 <w:noProof/>
                 <w:webHidden/>
               </w:rPr>
@@ -1836,15 +1765,13 @@
             </w:r>
             <w:r>
               <w:rPr>
-                <w:rFonts w:ascii="Times New Roman" w:hAnsi="Times New Roman"/>
-                <w:noProof/>
-                <w:webHidden/>
-              </w:rPr>
-              <w:t>14</w:t>
-            </w:r>
-            <w:r>
-              <w:rPr>
-                <w:rFonts w:ascii="Times New Roman" w:hAnsi="Times New Roman"/>
+                <w:noProof/>
+                <w:webHidden/>
+              </w:rPr>
+              <w:t>13</w:t>
+            </w:r>
+            <w:r>
+              <w:rPr>
                 <w:noProof/>
                 <w:webHidden/>
               </w:rPr>
@@ -1859,11 +1786,14 @@
               <w:tab w:val="right" w:leader="dot" w:pos="9350"/>
             </w:tabs>
             <w:rPr>
-              <w:rFonts w:ascii="Times New Roman" w:hAnsi="Times New Roman"/>
+              <w:rFonts w:asciiTheme="minorHAnsi" w:eastAsiaTheme="minorEastAsia" w:hAnsiTheme="minorHAnsi" w:cstheme="minorBidi"/>
               <w:noProof/>
+              <w:kern w:val="0"/>
+              <w:sz w:val="22"/>
+              <w:szCs w:val="22"/>
             </w:rPr>
           </w:pPr>
-          <w:hyperlink w:anchor="_Toc231463289" w:history="1">
+          <w:hyperlink w:anchor="_Toc232688312" w:history="1">
             <w:r>
               <w:rPr>
                 <w:rStyle w:val="Hyperlink"/>
@@ -1871,13 +1801,11 @@
                 <w:b/>
                 <w:bCs/>
                 <w:noProof/>
-                <w:kern w:val="36"/>
-              </w:rPr>
-              <w:t>HTML Forms and PHP Integration</w:t>
-            </w:r>
-            <w:r>
-              <w:rPr>
-                <w:rFonts w:ascii="Times New Roman" w:hAnsi="Times New Roman"/>
+              </w:rPr>
+              <w:t>Week 4: Server-Side Components and Backend Development Foundations</w:t>
+            </w:r>
+            <w:r>
+              <w:rPr>
                 <w:noProof/>
                 <w:webHidden/>
               </w:rPr>
@@ -1885,7 +1813,6 @@
             </w:r>
             <w:r>
               <w:rPr>
-                <w:rFonts w:ascii="Times New Roman" w:hAnsi="Times New Roman"/>
                 <w:noProof/>
                 <w:webHidden/>
               </w:rPr>
@@ -1893,22 +1820,19 @@
             </w:r>
             <w:r>
               <w:rPr>
-                <w:rFonts w:ascii="Times New Roman" w:hAnsi="Times New Roman"/>
-                <w:noProof/>
-                <w:webHidden/>
-              </w:rPr>
-              <w:instrText xml:space="preserve"> PAGEREF _Toc231463289 \h </w:instrText>
-            </w:r>
-            <w:r>
-              <w:rPr>
-                <w:rFonts w:ascii="Times New Roman" w:hAnsi="Times New Roman"/>
-                <w:noProof/>
-                <w:webHidden/>
-              </w:rPr>
-            </w:r>
-            <w:r>
-              <w:rPr>
-                <w:rFonts w:ascii="Times New Roman" w:hAnsi="Times New Roman"/>
+                <w:noProof/>
+                <w:webHidden/>
+              </w:rPr>
+              <w:instrText xml:space="preserve"> PAGEREF _Toc232688312 \h </w:instrText>
+            </w:r>
+            <w:r>
+              <w:rPr>
+                <w:noProof/>
+                <w:webHidden/>
+              </w:rPr>
+            </w:r>
+            <w:r>
+              <w:rPr>
                 <w:noProof/>
                 <w:webHidden/>
               </w:rPr>
@@ -1916,15 +1840,13 @@
             </w:r>
             <w:r>
               <w:rPr>
-                <w:rFonts w:ascii="Times New Roman" w:hAnsi="Times New Roman"/>
-                <w:noProof/>
-                <w:webHidden/>
-              </w:rPr>
-              <w:t>15</w:t>
-            </w:r>
-            <w:r>
-              <w:rPr>
-                <w:rFonts w:ascii="Times New Roman" w:hAnsi="Times New Roman"/>
+                <w:noProof/>
+                <w:webHidden/>
+              </w:rPr>
+              <w:t>13</w:t>
+            </w:r>
+            <w:r>
+              <w:rPr>
                 <w:noProof/>
                 <w:webHidden/>
               </w:rPr>
@@ -1939,11 +1861,14 @@
               <w:tab w:val="right" w:leader="dot" w:pos="9350"/>
             </w:tabs>
             <w:rPr>
-              <w:rFonts w:ascii="Times New Roman" w:hAnsi="Times New Roman"/>
+              <w:rFonts w:asciiTheme="minorHAnsi" w:eastAsiaTheme="minorEastAsia" w:hAnsiTheme="minorHAnsi" w:cstheme="minorBidi"/>
               <w:noProof/>
+              <w:kern w:val="0"/>
+              <w:sz w:val="22"/>
+              <w:szCs w:val="22"/>
             </w:rPr>
           </w:pPr>
-          <w:hyperlink w:anchor="_Toc231463290" w:history="1">
+          <w:hyperlink w:anchor="_Toc232688313" w:history="1">
             <w:r>
               <w:rPr>
                 <w:rStyle w:val="Hyperlink"/>
@@ -1951,12 +1876,12 @@
                 <w:b/>
                 <w:bCs/>
                 <w:noProof/>
-              </w:rPr>
-              <w:t>Simple Authentication System</w:t>
-            </w:r>
-            <w:r>
-              <w:rPr>
-                <w:rFonts w:ascii="Times New Roman" w:hAnsi="Times New Roman"/>
+                <w:kern w:val="36"/>
+              </w:rPr>
+              <w:t>HTML Forms and PHP Integration</w:t>
+            </w:r>
+            <w:r>
+              <w:rPr>
                 <w:noProof/>
                 <w:webHidden/>
               </w:rPr>
@@ -1964,7 +1889,6 @@
             </w:r>
             <w:r>
               <w:rPr>
-                <w:rFonts w:ascii="Times New Roman" w:hAnsi="Times New Roman"/>
                 <w:noProof/>
                 <w:webHidden/>
               </w:rPr>
@@ -1972,22 +1896,19 @@
             </w:r>
             <w:r>
               <w:rPr>
-                <w:rFonts w:ascii="Times New Roman" w:hAnsi="Times New Roman"/>
-                <w:noProof/>
-                <w:webHidden/>
-              </w:rPr>
-              <w:instrText xml:space="preserve"> PAGEREF _Toc231463290 \h </w:instrText>
-            </w:r>
-            <w:r>
-              <w:rPr>
-                <w:rFonts w:ascii="Times New Roman" w:hAnsi="Times New Roman"/>
-                <w:noProof/>
-                <w:webHidden/>
-              </w:rPr>
-            </w:r>
-            <w:r>
-              <w:rPr>
-                <w:rFonts w:ascii="Times New Roman" w:hAnsi="Times New Roman"/>
+                <w:noProof/>
+                <w:webHidden/>
+              </w:rPr>
+              <w:instrText xml:space="preserve"> PAGEREF _Toc232688313 \h </w:instrText>
+            </w:r>
+            <w:r>
+              <w:rPr>
+                <w:noProof/>
+                <w:webHidden/>
+              </w:rPr>
+            </w:r>
+            <w:r>
+              <w:rPr>
                 <w:noProof/>
                 <w:webHidden/>
               </w:rPr>
@@ -1995,15 +1916,13 @@
             </w:r>
             <w:r>
               <w:rPr>
-                <w:rFonts w:ascii="Times New Roman" w:hAnsi="Times New Roman"/>
-                <w:noProof/>
-                <w:webHidden/>
-              </w:rPr>
-              <w:t>16</w:t>
-            </w:r>
-            <w:r>
-              <w:rPr>
-                <w:rFonts w:ascii="Times New Roman" w:hAnsi="Times New Roman"/>
+                <w:noProof/>
+                <w:webHidden/>
+              </w:rPr>
+              <w:t>14</w:t>
+            </w:r>
+            <w:r>
+              <w:rPr>
                 <w:noProof/>
                 <w:webHidden/>
               </w:rPr>
@@ -2018,11 +1937,14 @@
               <w:tab w:val="right" w:leader="dot" w:pos="9350"/>
             </w:tabs>
             <w:rPr>
-              <w:rFonts w:ascii="Times New Roman" w:hAnsi="Times New Roman"/>
+              <w:rFonts w:asciiTheme="minorHAnsi" w:eastAsiaTheme="minorEastAsia" w:hAnsiTheme="minorHAnsi" w:cstheme="minorBidi"/>
               <w:noProof/>
+              <w:kern w:val="0"/>
+              <w:sz w:val="22"/>
+              <w:szCs w:val="22"/>
             </w:rPr>
           </w:pPr>
-          <w:hyperlink w:anchor="_Toc231463291" w:history="1">
+          <w:hyperlink w:anchor="_Toc232688314" w:history="1">
             <w:r>
               <w:rPr>
                 <w:rStyle w:val="Hyperlink"/>
@@ -2031,11 +1953,10 @@
                 <w:bCs/>
                 <w:noProof/>
               </w:rPr>
-              <w:t>Backend Folder Organization</w:t>
-            </w:r>
-            <w:r>
-              <w:rPr>
-                <w:rFonts w:ascii="Times New Roman" w:hAnsi="Times New Roman"/>
+              <w:t>Simple Authentication System</w:t>
+            </w:r>
+            <w:r>
+              <w:rPr>
                 <w:noProof/>
                 <w:webHidden/>
               </w:rPr>
@@ -2043,7 +1964,6 @@
             </w:r>
             <w:r>
               <w:rPr>
-                <w:rFonts w:ascii="Times New Roman" w:hAnsi="Times New Roman"/>
                 <w:noProof/>
                 <w:webHidden/>
               </w:rPr>
@@ -2051,22 +1971,19 @@
             </w:r>
             <w:r>
               <w:rPr>
-                <w:rFonts w:ascii="Times New Roman" w:hAnsi="Times New Roman"/>
-                <w:noProof/>
-                <w:webHidden/>
-              </w:rPr>
-              <w:instrText xml:space="preserve"> PAGEREF _Toc231463291 \h </w:instrText>
-            </w:r>
-            <w:r>
-              <w:rPr>
-                <w:rFonts w:ascii="Times New Roman" w:hAnsi="Times New Roman"/>
-                <w:noProof/>
-                <w:webHidden/>
-              </w:rPr>
-            </w:r>
-            <w:r>
-              <w:rPr>
-                <w:rFonts w:ascii="Times New Roman" w:hAnsi="Times New Roman"/>
+                <w:noProof/>
+                <w:webHidden/>
+              </w:rPr>
+              <w:instrText xml:space="preserve"> PAGEREF _Toc232688314 \h </w:instrText>
+            </w:r>
+            <w:r>
+              <w:rPr>
+                <w:noProof/>
+                <w:webHidden/>
+              </w:rPr>
+            </w:r>
+            <w:r>
+              <w:rPr>
                 <w:noProof/>
                 <w:webHidden/>
               </w:rPr>
@@ -2074,15 +1991,13 @@
             </w:r>
             <w:r>
               <w:rPr>
-                <w:rFonts w:ascii="Times New Roman" w:hAnsi="Times New Roman"/>
-                <w:noProof/>
-                <w:webHidden/>
-              </w:rPr>
-              <w:t>19</w:t>
-            </w:r>
-            <w:r>
-              <w:rPr>
-                <w:rFonts w:ascii="Times New Roman" w:hAnsi="Times New Roman"/>
+                <w:noProof/>
+                <w:webHidden/>
+              </w:rPr>
+              <w:t>16</w:t>
+            </w:r>
+            <w:r>
+              <w:rPr>
                 <w:noProof/>
                 <w:webHidden/>
               </w:rPr>
@@ -2097,11 +2012,14 @@
               <w:tab w:val="right" w:leader="dot" w:pos="9350"/>
             </w:tabs>
             <w:rPr>
-              <w:rFonts w:ascii="Times New Roman" w:hAnsi="Times New Roman"/>
+              <w:rFonts w:asciiTheme="minorHAnsi" w:eastAsiaTheme="minorEastAsia" w:hAnsiTheme="minorHAnsi" w:cstheme="minorBidi"/>
               <w:noProof/>
+              <w:kern w:val="0"/>
+              <w:sz w:val="22"/>
+              <w:szCs w:val="22"/>
             </w:rPr>
           </w:pPr>
-          <w:hyperlink w:anchor="_Toc231463292" w:history="1">
+          <w:hyperlink w:anchor="_Toc232688315" w:history="1">
             <w:r>
               <w:rPr>
                 <w:rStyle w:val="Hyperlink"/>
@@ -2110,11 +2028,10 @@
                 <w:bCs/>
                 <w:noProof/>
               </w:rPr>
-              <w:t>Week 5: Database Components and CRUD Operations</w:t>
-            </w:r>
-            <w:r>
-              <w:rPr>
-                <w:rFonts w:ascii="Times New Roman" w:hAnsi="Times New Roman"/>
+              <w:t>Backend Folder Organization</w:t>
+            </w:r>
+            <w:r>
+              <w:rPr>
                 <w:noProof/>
                 <w:webHidden/>
               </w:rPr>
@@ -2122,7 +2039,6 @@
             </w:r>
             <w:r>
               <w:rPr>
-                <w:rFonts w:ascii="Times New Roman" w:hAnsi="Times New Roman"/>
                 <w:noProof/>
                 <w:webHidden/>
               </w:rPr>
@@ -2130,22 +2046,19 @@
             </w:r>
             <w:r>
               <w:rPr>
-                <w:rFonts w:ascii="Times New Roman" w:hAnsi="Times New Roman"/>
-                <w:noProof/>
-                <w:webHidden/>
-              </w:rPr>
-              <w:instrText xml:space="preserve"> PAGEREF _Toc231463292 \h </w:instrText>
-            </w:r>
-            <w:r>
-              <w:rPr>
-                <w:rFonts w:ascii="Times New Roman" w:hAnsi="Times New Roman"/>
-                <w:noProof/>
-                <w:webHidden/>
-              </w:rPr>
-            </w:r>
-            <w:r>
-              <w:rPr>
-                <w:rFonts w:ascii="Times New Roman" w:hAnsi="Times New Roman"/>
+                <w:noProof/>
+                <w:webHidden/>
+              </w:rPr>
+              <w:instrText xml:space="preserve"> PAGEREF _Toc232688315 \h </w:instrText>
+            </w:r>
+            <w:r>
+              <w:rPr>
+                <w:noProof/>
+                <w:webHidden/>
+              </w:rPr>
+            </w:r>
+            <w:r>
+              <w:rPr>
                 <w:noProof/>
                 <w:webHidden/>
               </w:rPr>
@@ -2153,15 +2066,13 @@
             </w:r>
             <w:r>
               <w:rPr>
-                <w:rFonts w:ascii="Times New Roman" w:hAnsi="Times New Roman"/>
-                <w:noProof/>
-                <w:webHidden/>
-              </w:rPr>
-              <w:t>20</w:t>
-            </w:r>
-            <w:r>
-              <w:rPr>
-                <w:rFonts w:ascii="Times New Roman" w:hAnsi="Times New Roman"/>
+                <w:noProof/>
+                <w:webHidden/>
+              </w:rPr>
+              <w:t>18</w:t>
+            </w:r>
+            <w:r>
+              <w:rPr>
                 <w:noProof/>
                 <w:webHidden/>
               </w:rPr>
@@ -2176,11 +2087,14 @@
               <w:tab w:val="right" w:leader="dot" w:pos="9350"/>
             </w:tabs>
             <w:rPr>
-              <w:rFonts w:ascii="Times New Roman" w:hAnsi="Times New Roman"/>
+              <w:rFonts w:asciiTheme="minorHAnsi" w:eastAsiaTheme="minorEastAsia" w:hAnsiTheme="minorHAnsi" w:cstheme="minorBidi"/>
               <w:noProof/>
+              <w:kern w:val="0"/>
+              <w:sz w:val="22"/>
+              <w:szCs w:val="22"/>
             </w:rPr>
           </w:pPr>
-          <w:hyperlink w:anchor="_Toc231463293" w:history="1">
+          <w:hyperlink w:anchor="_Toc232688316" w:history="1">
             <w:r>
               <w:rPr>
                 <w:rStyle w:val="Hyperlink"/>
@@ -2189,11 +2103,160 @@
                 <w:bCs/>
                 <w:noProof/>
               </w:rPr>
+              <w:t>Week 5: Database Components and CRUD Operations</w:t>
+            </w:r>
+            <w:r>
+              <w:rPr>
+                <w:noProof/>
+                <w:webHidden/>
+              </w:rPr>
+              <w:tab/>
+            </w:r>
+            <w:r>
+              <w:rPr>
+                <w:noProof/>
+                <w:webHidden/>
+              </w:rPr>
+              <w:fldChar w:fldCharType="begin"/>
+            </w:r>
+            <w:r>
+              <w:rPr>
+                <w:noProof/>
+                <w:webHidden/>
+              </w:rPr>
+              <w:instrText xml:space="preserve"> PAGEREF _Toc232688316 \h </w:instrText>
+            </w:r>
+            <w:r>
+              <w:rPr>
+                <w:noProof/>
+                <w:webHidden/>
+              </w:rPr>
+            </w:r>
+            <w:r>
+              <w:rPr>
+                <w:noProof/>
+                <w:webHidden/>
+              </w:rPr>
+              <w:fldChar w:fldCharType="separate"/>
+            </w:r>
+            <w:r>
+              <w:rPr>
+                <w:noProof/>
+                <w:webHidden/>
+              </w:rPr>
+              <w:t>19</w:t>
+            </w:r>
+            <w:r>
+              <w:rPr>
+                <w:noProof/>
+                <w:webHidden/>
+              </w:rPr>
+              <w:fldChar w:fldCharType="end"/>
+            </w:r>
+          </w:hyperlink>
+        </w:p>
+        <w:p>
+          <w:pPr>
+            <w:pStyle w:val="TOC2"/>
+            <w:tabs>
+              <w:tab w:val="right" w:leader="dot" w:pos="9350"/>
+            </w:tabs>
+            <w:rPr>
+              <w:rFonts w:asciiTheme="minorHAnsi" w:eastAsiaTheme="minorEastAsia" w:hAnsiTheme="minorHAnsi" w:cstheme="minorBidi"/>
+              <w:noProof/>
+              <w:kern w:val="0"/>
+              <w:sz w:val="22"/>
+              <w:szCs w:val="22"/>
+            </w:rPr>
+          </w:pPr>
+          <w:hyperlink w:anchor="_Toc232688317" w:history="1">
+            <w:r>
+              <w:rPr>
+                <w:rStyle w:val="Hyperlink"/>
+                <w:rFonts w:ascii="Times New Roman" w:hAnsi="Times New Roman"/>
+                <w:b/>
+                <w:bCs/>
+                <w:noProof/>
+              </w:rPr>
               <w:t>Database Creation</w:t>
             </w:r>
             <w:r>
               <w:rPr>
+                <w:noProof/>
+                <w:webHidden/>
+              </w:rPr>
+              <w:tab/>
+            </w:r>
+            <w:r>
+              <w:rPr>
+                <w:noProof/>
+                <w:webHidden/>
+              </w:rPr>
+              <w:fldChar w:fldCharType="begin"/>
+            </w:r>
+            <w:r>
+              <w:rPr>
+                <w:noProof/>
+                <w:webHidden/>
+              </w:rPr>
+              <w:instrText xml:space="preserve"> PAGEREF _Toc232688317 \h </w:instrText>
+            </w:r>
+            <w:r>
+              <w:rPr>
+                <w:noProof/>
+                <w:webHidden/>
+              </w:rPr>
+            </w:r>
+            <w:r>
+              <w:rPr>
+                <w:noProof/>
+                <w:webHidden/>
+              </w:rPr>
+              <w:fldChar w:fldCharType="separate"/>
+            </w:r>
+            <w:r>
+              <w:rPr>
+                <w:noProof/>
+                <w:webHidden/>
+              </w:rPr>
+              <w:t>19</w:t>
+            </w:r>
+            <w:r>
+              <w:rPr>
+                <w:noProof/>
+                <w:webHidden/>
+              </w:rPr>
+              <w:fldChar w:fldCharType="end"/>
+            </w:r>
+          </w:hyperlink>
+        </w:p>
+        <w:p>
+          <w:pPr>
+            <w:pStyle w:val="TOC2"/>
+            <w:tabs>
+              <w:tab w:val="right" w:leader="dot" w:pos="9350"/>
+            </w:tabs>
+            <w:rPr>
+              <w:rFonts w:asciiTheme="minorHAnsi" w:eastAsiaTheme="minorEastAsia" w:hAnsiTheme="minorHAnsi" w:cstheme="minorBidi"/>
+              <w:noProof/>
+              <w:kern w:val="0"/>
+              <w:sz w:val="22"/>
+              <w:szCs w:val="22"/>
+            </w:rPr>
+          </w:pPr>
+          <w:hyperlink w:anchor="_Toc232688318" w:history="1">
+            <w:r>
+              <w:rPr>
+                <w:rStyle w:val="Hyperlink"/>
                 <w:rFonts w:ascii="Times New Roman" w:hAnsi="Times New Roman"/>
+                <w:b/>
+                <w:bCs/>
+                <w:noProof/>
+              </w:rPr>
+              <w:t>Week 6: Database Integration and CRUD Operations</w:t>
+            </w:r>
+            <w:r>
+              <w:rPr>
                 <w:noProof/>
                 <w:webHidden/>
               </w:rPr>
@@ -2201,7 +2264,81 @@
             </w:r>
             <w:r>
               <w:rPr>
+                <w:noProof/>
+                <w:webHidden/>
+              </w:rPr>
+              <w:fldChar w:fldCharType="begin"/>
+            </w:r>
+            <w:r>
+              <w:rPr>
+                <w:noProof/>
+                <w:webHidden/>
+              </w:rPr>
+              <w:instrText xml:space="preserve"> PAGEREF _Toc232688318 \h </w:instrText>
+            </w:r>
+            <w:r>
+              <w:rPr>
+                <w:noProof/>
+                <w:webHidden/>
+              </w:rPr>
+            </w:r>
+            <w:r>
+              <w:rPr>
+                <w:noProof/>
+                <w:webHidden/>
+              </w:rPr>
+              <w:fldChar w:fldCharType="separate"/>
+            </w:r>
+            <w:r>
+              <w:rPr>
+                <w:noProof/>
+                <w:webHidden/>
+              </w:rPr>
+              <w:t>20</w:t>
+            </w:r>
+            <w:r>
+              <w:rPr>
+                <w:noProof/>
+                <w:webHidden/>
+              </w:rPr>
+              <w:fldChar w:fldCharType="end"/>
+            </w:r>
+          </w:hyperlink>
+        </w:p>
+        <w:p>
+          <w:pPr>
+            <w:pStyle w:val="TOC2"/>
+            <w:tabs>
+              <w:tab w:val="right" w:leader="dot" w:pos="9350"/>
+            </w:tabs>
+            <w:rPr>
+              <w:rFonts w:asciiTheme="minorHAnsi" w:eastAsiaTheme="minorEastAsia" w:hAnsiTheme="minorHAnsi" w:cstheme="minorBidi"/>
+              <w:noProof/>
+              <w:kern w:val="0"/>
+              <w:sz w:val="22"/>
+              <w:szCs w:val="22"/>
+            </w:rPr>
+          </w:pPr>
+          <w:hyperlink w:anchor="_Toc232688319" w:history="1">
+            <w:r>
+              <w:rPr>
+                <w:rStyle w:val="Hyperlink"/>
                 <w:rFonts w:ascii="Times New Roman" w:hAnsi="Times New Roman"/>
+                <w:b/>
+                <w:bCs/>
+                <w:noProof/>
+              </w:rPr>
+              <w:t>Create</w:t>
+            </w:r>
+            <w:r>
+              <w:rPr>
+                <w:noProof/>
+                <w:webHidden/>
+              </w:rPr>
+              <w:tab/>
+            </w:r>
+            <w:r>
+              <w:rPr>
                 <w:noProof/>
                 <w:webHidden/>
               </w:rPr>
@@ -2209,22 +2346,246 @@
             </w:r>
             <w:r>
               <w:rPr>
+                <w:noProof/>
+                <w:webHidden/>
+              </w:rPr>
+              <w:instrText xml:space="preserve"> PAGEREF _Toc232688319 \h </w:instrText>
+            </w:r>
+            <w:r>
+              <w:rPr>
+                <w:noProof/>
+                <w:webHidden/>
+              </w:rPr>
+            </w:r>
+            <w:r>
+              <w:rPr>
+                <w:noProof/>
+                <w:webHidden/>
+              </w:rPr>
+              <w:fldChar w:fldCharType="separate"/>
+            </w:r>
+            <w:r>
+              <w:rPr>
+                <w:noProof/>
+                <w:webHidden/>
+              </w:rPr>
+              <w:t>21</w:t>
+            </w:r>
+            <w:r>
+              <w:rPr>
+                <w:noProof/>
+                <w:webHidden/>
+              </w:rPr>
+              <w:fldChar w:fldCharType="end"/>
+            </w:r>
+          </w:hyperlink>
+        </w:p>
+        <w:p>
+          <w:pPr>
+            <w:pStyle w:val="TOC1"/>
+            <w:tabs>
+              <w:tab w:val="right" w:leader="dot" w:pos="9350"/>
+            </w:tabs>
+            <w:rPr>
+              <w:rFonts w:asciiTheme="minorHAnsi" w:eastAsiaTheme="minorEastAsia" w:hAnsiTheme="minorHAnsi" w:cstheme="minorBidi"/>
+              <w:noProof/>
+              <w:kern w:val="0"/>
+              <w:sz w:val="22"/>
+              <w:szCs w:val="22"/>
+            </w:rPr>
+          </w:pPr>
+          <w:hyperlink w:anchor="_Toc232688320" w:history="1">
+            <w:r>
+              <w:rPr>
+                <w:rStyle w:val="Hyperlink"/>
                 <w:rFonts w:ascii="Times New Roman" w:hAnsi="Times New Roman"/>
-                <w:noProof/>
-                <w:webHidden/>
-              </w:rPr>
-              <w:instrText xml:space="preserve"> PAGEREF _Toc231463293 \h </w:instrText>
-            </w:r>
-            <w:r>
-              <w:rPr>
+                <w:b/>
+                <w:bCs/>
+                <w:noProof/>
+                <w:kern w:val="36"/>
+              </w:rPr>
+              <w:t>Week 7: User Authentication and Session Management</w:t>
+            </w:r>
+            <w:r>
+              <w:rPr>
+                <w:noProof/>
+                <w:webHidden/>
+              </w:rPr>
+              <w:tab/>
+            </w:r>
+            <w:r>
+              <w:rPr>
+                <w:noProof/>
+                <w:webHidden/>
+              </w:rPr>
+              <w:fldChar w:fldCharType="begin"/>
+            </w:r>
+            <w:r>
+              <w:rPr>
+                <w:noProof/>
+                <w:webHidden/>
+              </w:rPr>
+              <w:instrText xml:space="preserve"> PAGEREF _Toc232688320 \h </w:instrText>
+            </w:r>
+            <w:r>
+              <w:rPr>
+                <w:noProof/>
+                <w:webHidden/>
+              </w:rPr>
+            </w:r>
+            <w:r>
+              <w:rPr>
+                <w:noProof/>
+                <w:webHidden/>
+              </w:rPr>
+              <w:fldChar w:fldCharType="separate"/>
+            </w:r>
+            <w:r>
+              <w:rPr>
+                <w:noProof/>
+                <w:webHidden/>
+              </w:rPr>
+              <w:t>22</w:t>
+            </w:r>
+            <w:r>
+              <w:rPr>
+                <w:noProof/>
+                <w:webHidden/>
+              </w:rPr>
+              <w:fldChar w:fldCharType="end"/>
+            </w:r>
+          </w:hyperlink>
+        </w:p>
+        <w:p>
+          <w:pPr>
+            <w:pStyle w:val="TOC1"/>
+            <w:tabs>
+              <w:tab w:val="right" w:leader="dot" w:pos="9350"/>
+            </w:tabs>
+            <w:rPr>
+              <w:rFonts w:asciiTheme="minorHAnsi" w:eastAsiaTheme="minorEastAsia" w:hAnsiTheme="minorHAnsi" w:cstheme="minorBidi"/>
+              <w:noProof/>
+              <w:kern w:val="0"/>
+              <w:sz w:val="22"/>
+              <w:szCs w:val="22"/>
+            </w:rPr>
+          </w:pPr>
+          <w:hyperlink w:anchor="_Toc232688321" w:history="1">
+            <w:r>
+              <w:rPr>
+                <w:rStyle w:val="Hyperlink"/>
                 <w:rFonts w:ascii="Times New Roman" w:hAnsi="Times New Roman"/>
-                <w:noProof/>
-                <w:webHidden/>
-              </w:rPr>
-            </w:r>
-            <w:r>
-              <w:rPr>
+                <w:b/>
+                <w:bCs/>
+                <w:noProof/>
+                <w:kern w:val="36"/>
+              </w:rPr>
+              <w:t>Practical Task 1</w:t>
+            </w:r>
+            <w:r>
+              <w:rPr>
+                <w:noProof/>
+                <w:webHidden/>
+              </w:rPr>
+              <w:tab/>
+            </w:r>
+            <w:r>
+              <w:rPr>
+                <w:noProof/>
+                <w:webHidden/>
+              </w:rPr>
+              <w:fldChar w:fldCharType="begin"/>
+            </w:r>
+            <w:r>
+              <w:rPr>
+                <w:noProof/>
+                <w:webHidden/>
+              </w:rPr>
+              <w:instrText xml:space="preserve"> PAGEREF _Toc232688321 \h </w:instrText>
+            </w:r>
+            <w:r>
+              <w:rPr>
+                <w:noProof/>
+                <w:webHidden/>
+              </w:rPr>
+            </w:r>
+            <w:r>
+              <w:rPr>
+                <w:noProof/>
+                <w:webHidden/>
+              </w:rPr>
+              <w:fldChar w:fldCharType="separate"/>
+            </w:r>
+            <w:r>
+              <w:rPr>
+                <w:noProof/>
+                <w:webHidden/>
+              </w:rPr>
+              <w:t>22</w:t>
+            </w:r>
+            <w:r>
+              <w:rPr>
+                <w:noProof/>
+                <w:webHidden/>
+              </w:rPr>
+              <w:fldChar w:fldCharType="end"/>
+            </w:r>
+          </w:hyperlink>
+        </w:p>
+        <w:p>
+          <w:pPr>
+            <w:pStyle w:val="TOC2"/>
+            <w:tabs>
+              <w:tab w:val="right" w:leader="dot" w:pos="9350"/>
+            </w:tabs>
+            <w:rPr>
+              <w:rFonts w:asciiTheme="minorHAnsi" w:eastAsiaTheme="minorEastAsia" w:hAnsiTheme="minorHAnsi" w:cstheme="minorBidi"/>
+              <w:noProof/>
+              <w:kern w:val="0"/>
+              <w:sz w:val="22"/>
+              <w:szCs w:val="22"/>
+            </w:rPr>
+          </w:pPr>
+          <w:hyperlink w:anchor="_Toc232688322" w:history="1">
+            <w:r>
+              <w:rPr>
+                <w:rStyle w:val="Hyperlink"/>
                 <w:rFonts w:ascii="Times New Roman" w:hAnsi="Times New Roman"/>
+                <w:b/>
+                <w:bCs/>
+                <w:noProof/>
+              </w:rPr>
+              <w:t>Student Portal Login System</w:t>
+            </w:r>
+            <w:r>
+              <w:rPr>
+                <w:noProof/>
+                <w:webHidden/>
+              </w:rPr>
+              <w:tab/>
+            </w:r>
+            <w:r>
+              <w:rPr>
+                <w:noProof/>
+                <w:webHidden/>
+              </w:rPr>
+              <w:fldChar w:fldCharType="begin"/>
+            </w:r>
+            <w:r>
+              <w:rPr>
+                <w:noProof/>
+                <w:webHidden/>
+              </w:rPr>
+              <w:instrText xml:space="preserve"> PAGEREF _Toc232688322 \h </w:instrText>
+            </w:r>
+            <w:r>
+              <w:rPr>
+                <w:noProof/>
+                <w:webHidden/>
+              </w:rPr>
+            </w:r>
+            <w:r>
+              <w:rPr>
                 <w:noProof/>
                 <w:webHidden/>
               </w:rPr>
@@ -2232,15 +2593,305 @@
             </w:r>
             <w:r>
               <w:rPr>
+                <w:noProof/>
+                <w:webHidden/>
+              </w:rPr>
+              <w:t>22</w:t>
+            </w:r>
+            <w:r>
+              <w:rPr>
+                <w:noProof/>
+                <w:webHidden/>
+              </w:rPr>
+              <w:fldChar w:fldCharType="end"/>
+            </w:r>
+          </w:hyperlink>
+        </w:p>
+        <w:p>
+          <w:pPr>
+            <w:pStyle w:val="TOC1"/>
+            <w:tabs>
+              <w:tab w:val="right" w:leader="dot" w:pos="9350"/>
+            </w:tabs>
+            <w:rPr>
+              <w:rFonts w:asciiTheme="minorHAnsi" w:eastAsiaTheme="minorEastAsia" w:hAnsiTheme="minorHAnsi" w:cstheme="minorBidi"/>
+              <w:noProof/>
+              <w:kern w:val="0"/>
+              <w:sz w:val="22"/>
+              <w:szCs w:val="22"/>
+            </w:rPr>
+          </w:pPr>
+          <w:hyperlink w:anchor="_Toc232688323" w:history="1">
+            <w:r>
+              <w:rPr>
+                <w:rStyle w:val="Hyperlink"/>
                 <w:rFonts w:ascii="Times New Roman" w:hAnsi="Times New Roman"/>
-                <w:noProof/>
-                <w:webHidden/>
-              </w:rPr>
-              <w:t>20</w:t>
-            </w:r>
-            <w:r>
-              <w:rPr>
+                <w:b/>
+                <w:bCs/>
+                <w:noProof/>
+                <w:kern w:val="36"/>
+              </w:rPr>
+              <w:t>Register Page</w:t>
+            </w:r>
+            <w:r>
+              <w:rPr>
+                <w:noProof/>
+                <w:webHidden/>
+              </w:rPr>
+              <w:tab/>
+            </w:r>
+            <w:r>
+              <w:rPr>
+                <w:noProof/>
+                <w:webHidden/>
+              </w:rPr>
+              <w:fldChar w:fldCharType="begin"/>
+            </w:r>
+            <w:r>
+              <w:rPr>
+                <w:noProof/>
+                <w:webHidden/>
+              </w:rPr>
+              <w:instrText xml:space="preserve"> PAGEREF _Toc232688323 \h </w:instrText>
+            </w:r>
+            <w:r>
+              <w:rPr>
+                <w:noProof/>
+                <w:webHidden/>
+              </w:rPr>
+            </w:r>
+            <w:r>
+              <w:rPr>
+                <w:noProof/>
+                <w:webHidden/>
+              </w:rPr>
+              <w:fldChar w:fldCharType="separate"/>
+            </w:r>
+            <w:r>
+              <w:rPr>
+                <w:noProof/>
+                <w:webHidden/>
+              </w:rPr>
+              <w:t>22</w:t>
+            </w:r>
+            <w:r>
+              <w:rPr>
+                <w:noProof/>
+                <w:webHidden/>
+              </w:rPr>
+              <w:fldChar w:fldCharType="end"/>
+            </w:r>
+          </w:hyperlink>
+        </w:p>
+        <w:p>
+          <w:pPr>
+            <w:pStyle w:val="TOC1"/>
+            <w:tabs>
+              <w:tab w:val="right" w:leader="dot" w:pos="9350"/>
+            </w:tabs>
+            <w:rPr>
+              <w:rFonts w:asciiTheme="minorHAnsi" w:eastAsiaTheme="minorEastAsia" w:hAnsiTheme="minorHAnsi" w:cstheme="minorBidi"/>
+              <w:noProof/>
+              <w:kern w:val="0"/>
+              <w:sz w:val="22"/>
+              <w:szCs w:val="22"/>
+            </w:rPr>
+          </w:pPr>
+          <w:hyperlink w:anchor="_Toc232688324" w:history="1">
+            <w:r>
+              <w:rPr>
+                <w:noProof/>
+                <w:webHidden/>
+              </w:rPr>
+              <w:tab/>
+            </w:r>
+            <w:r>
+              <w:rPr>
+                <w:noProof/>
+                <w:webHidden/>
+              </w:rPr>
+              <w:fldChar w:fldCharType="begin"/>
+            </w:r>
+            <w:r>
+              <w:rPr>
+                <w:noProof/>
+                <w:webHidden/>
+              </w:rPr>
+              <w:instrText xml:space="preserve"> PAGEREF _Toc232688324 \h </w:instrText>
+            </w:r>
+            <w:r>
+              <w:rPr>
+                <w:noProof/>
+                <w:webHidden/>
+              </w:rPr>
+            </w:r>
+            <w:r>
+              <w:rPr>
+                <w:noProof/>
+                <w:webHidden/>
+              </w:rPr>
+              <w:fldChar w:fldCharType="separate"/>
+            </w:r>
+            <w:r>
+              <w:rPr>
+                <w:noProof/>
+                <w:webHidden/>
+              </w:rPr>
+              <w:t>23</w:t>
+            </w:r>
+            <w:r>
+              <w:rPr>
+                <w:noProof/>
+                <w:webHidden/>
+              </w:rPr>
+              <w:fldChar w:fldCharType="end"/>
+            </w:r>
+          </w:hyperlink>
+        </w:p>
+        <w:p>
+          <w:pPr>
+            <w:pStyle w:val="TOC1"/>
+            <w:tabs>
+              <w:tab w:val="right" w:leader="dot" w:pos="9350"/>
+            </w:tabs>
+            <w:rPr>
+              <w:rFonts w:asciiTheme="minorHAnsi" w:eastAsiaTheme="minorEastAsia" w:hAnsiTheme="minorHAnsi" w:cstheme="minorBidi"/>
+              <w:noProof/>
+              <w:kern w:val="0"/>
+              <w:sz w:val="22"/>
+              <w:szCs w:val="22"/>
+            </w:rPr>
+          </w:pPr>
+          <w:hyperlink w:anchor="_Toc232688325" w:history="1">
+            <w:r>
+              <w:rPr>
+                <w:rStyle w:val="Hyperlink"/>
                 <w:rFonts w:ascii="Times New Roman" w:hAnsi="Times New Roman"/>
+                <w:b/>
+                <w:bCs/>
+                <w:noProof/>
+                <w:kern w:val="36"/>
+              </w:rPr>
+              <w:t>Practical Task 2</w:t>
+            </w:r>
+            <w:r>
+              <w:rPr>
+                <w:noProof/>
+                <w:webHidden/>
+              </w:rPr>
+              <w:tab/>
+            </w:r>
+            <w:r>
+              <w:rPr>
+                <w:noProof/>
+                <w:webHidden/>
+              </w:rPr>
+              <w:fldChar w:fldCharType="begin"/>
+            </w:r>
+            <w:r>
+              <w:rPr>
+                <w:noProof/>
+                <w:webHidden/>
+              </w:rPr>
+              <w:instrText xml:space="preserve"> PAGEREF _Toc232688325 \h </w:instrText>
+            </w:r>
+            <w:r>
+              <w:rPr>
+                <w:noProof/>
+                <w:webHidden/>
+              </w:rPr>
+            </w:r>
+            <w:r>
+              <w:rPr>
+                <w:noProof/>
+                <w:webHidden/>
+              </w:rPr>
+              <w:fldChar w:fldCharType="separate"/>
+            </w:r>
+            <w:r>
+              <w:rPr>
+                <w:noProof/>
+                <w:webHidden/>
+              </w:rPr>
+              <w:t>24</w:t>
+            </w:r>
+            <w:r>
+              <w:rPr>
+                <w:noProof/>
+                <w:webHidden/>
+              </w:rPr>
+              <w:fldChar w:fldCharType="end"/>
+            </w:r>
+          </w:hyperlink>
+        </w:p>
+        <w:p>
+          <w:pPr>
+            <w:pStyle w:val="TOC2"/>
+            <w:tabs>
+              <w:tab w:val="right" w:leader="dot" w:pos="9350"/>
+            </w:tabs>
+            <w:rPr>
+              <w:rFonts w:asciiTheme="minorHAnsi" w:eastAsiaTheme="minorEastAsia" w:hAnsiTheme="minorHAnsi" w:cstheme="minorBidi"/>
+              <w:noProof/>
+              <w:kern w:val="0"/>
+              <w:sz w:val="22"/>
+              <w:szCs w:val="22"/>
+            </w:rPr>
+          </w:pPr>
+          <w:hyperlink w:anchor="_Toc232688326" w:history="1">
+            <w:r>
+              <w:rPr>
+                <w:rStyle w:val="Hyperlink"/>
+                <w:rFonts w:ascii="Times New Roman" w:hAnsi="Times New Roman"/>
+                <w:b/>
+                <w:bCs/>
+                <w:noProof/>
+              </w:rPr>
+              <w:t>Employee Portal</w:t>
+            </w:r>
+            <w:r>
+              <w:rPr>
+                <w:noProof/>
+                <w:webHidden/>
+              </w:rPr>
+              <w:tab/>
+            </w:r>
+            <w:r>
+              <w:rPr>
+                <w:noProof/>
+                <w:webHidden/>
+              </w:rPr>
+              <w:fldChar w:fldCharType="begin"/>
+            </w:r>
+            <w:r>
+              <w:rPr>
+                <w:noProof/>
+                <w:webHidden/>
+              </w:rPr>
+              <w:instrText xml:space="preserve"> PAGEREF _Toc232688326 \h </w:instrText>
+            </w:r>
+            <w:r>
+              <w:rPr>
+                <w:noProof/>
+                <w:webHidden/>
+              </w:rPr>
+            </w:r>
+            <w:r>
+              <w:rPr>
+                <w:noProof/>
+                <w:webHidden/>
+              </w:rPr>
+              <w:fldChar w:fldCharType="separate"/>
+            </w:r>
+            <w:r>
+              <w:rPr>
+                <w:noProof/>
+                <w:webHidden/>
+              </w:rPr>
+              <w:t>24</w:t>
+            </w:r>
+            <w:r>
+              <w:rPr>
                 <w:noProof/>
                 <w:webHidden/>
               </w:rPr>
@@ -2283,7 +2934,7 @@
           <w:szCs w:val="24"/>
         </w:rPr>
       </w:pPr>
-      <w:bookmarkStart w:id="0" w:name="_Toc231463271"/>
+      <w:bookmarkStart w:id="0" w:name="_Toc232688294"/>
       <w:r>
         <w:rPr>
           <w:sz w:val="24"/>
@@ -2303,7 +2954,7 @@
           <w:szCs w:val="24"/>
         </w:rPr>
       </w:pPr>
-      <w:bookmarkStart w:id="1" w:name="_Toc231463272"/>
+      <w:bookmarkStart w:id="1" w:name="_Toc232688295"/>
       <w:r>
         <w:rPr>
           <w:rFonts w:ascii="Times New Roman" w:hAnsi="Times New Roman" w:cs="Times New Roman"/>
@@ -2311,6 +2962,7 @@
           <w:sz w:val="24"/>
           <w:szCs w:val="24"/>
         </w:rPr>
+        <w:lastRenderedPageBreak/>
         <w:t>Title</w:t>
       </w:r>
       <w:bookmarkEnd w:id="1"/>
@@ -2323,7 +2975,7 @@
           <w:color w:val="auto"/>
         </w:rPr>
       </w:pPr>
-      <w:bookmarkStart w:id="2" w:name="_Toc231463273"/>
+      <w:bookmarkStart w:id="2" w:name="_Toc232688296"/>
       <w:r>
         <w:rPr>
           <w:rFonts w:ascii="Times New Roman" w:hAnsi="Times New Roman" w:cs="Times New Roman"/>
@@ -2413,7 +3065,7 @@
           <w:szCs w:val="24"/>
         </w:rPr>
       </w:pPr>
-      <w:bookmarkStart w:id="3" w:name="_Toc231463274"/>
+      <w:bookmarkStart w:id="3" w:name="_Toc232688297"/>
       <w:r>
         <w:rPr>
           <w:rFonts w:ascii="Times New Roman" w:hAnsi="Times New Roman" w:cs="Times New Roman"/>
@@ -2534,7 +3186,7 @@
           <w:szCs w:val="24"/>
         </w:rPr>
       </w:pPr>
-      <w:bookmarkStart w:id="4" w:name="_Toc231463275"/>
+      <w:bookmarkStart w:id="4" w:name="_Toc232688298"/>
       <w:r>
         <w:rPr>
           <w:rFonts w:ascii="Times New Roman" w:hAnsi="Times New Roman" w:cs="Times New Roman"/>
@@ -2544,6 +3196,7 @@
           <w:sz w:val="24"/>
           <w:szCs w:val="24"/>
         </w:rPr>
+        <w:lastRenderedPageBreak/>
         <w:t>Localhost Test Page</w:t>
       </w:r>
       <w:bookmarkEnd w:id="4"/>
@@ -2684,7 +3337,7 @@
           <w:szCs w:val="24"/>
         </w:rPr>
       </w:pPr>
-      <w:bookmarkStart w:id="8" w:name="_Toc231463276"/>
+      <w:bookmarkStart w:id="8" w:name="_Toc232688299"/>
       <w:r>
         <w:rPr>
           <w:rFonts w:ascii="Times New Roman" w:hAnsi="Times New Roman" w:cs="Times New Roman"/>
@@ -2801,7 +3454,7 @@
           <w:szCs w:val="24"/>
         </w:rPr>
       </w:pPr>
-      <w:bookmarkStart w:id="10" w:name="_Toc231463277"/>
+      <w:bookmarkStart w:id="10" w:name="_Toc232688300"/>
       <w:r>
         <w:rPr>
           <w:rFonts w:ascii="Times New Roman" w:hAnsi="Times New Roman" w:cs="Times New Roman"/>
@@ -2875,7 +3528,6 @@
           <w:rFonts w:ascii="Times New Roman" w:hAnsi="Times New Roman"/>
           <w:iCs/>
         </w:rPr>
-        <w:lastRenderedPageBreak/>
         <w:t xml:space="preserve">Fig 5 confirms successful MySQL database connection using </w:t>
       </w:r>
       <w:proofErr w:type="spellStart"/>
@@ -2939,7 +3591,7 @@
           <w:szCs w:val="24"/>
         </w:rPr>
       </w:pPr>
-      <w:bookmarkStart w:id="11" w:name="_Toc231463278"/>
+      <w:bookmarkStart w:id="11" w:name="_Toc232688301"/>
       <w:r>
         <w:rPr>
           <w:rFonts w:ascii="Times New Roman" w:hAnsi="Times New Roman" w:cs="Times New Roman"/>
@@ -2958,7 +3610,11 @@
         <w:pStyle w:val="NormalWeb"/>
       </w:pPr>
       <w:r>
-        <w:t xml:space="preserve">During this week, I successfully configured the local development environment using XAMPP and verified that Apache and MySQL services were functioning correctly. I created and executed a Hello World PHP script through localhost to confirm PHP integration with the Apache server. Additionally, I established a successful connection between PHP and the MySQL database using </w:t>
+        <w:t xml:space="preserve">During this week, I successfully configured the local development environment using XAMPP and verified that Apache and MySQL services were functioning correctly. I created and executed </w:t>
+      </w:r>
+      <w:r>
+        <w:lastRenderedPageBreak/>
+        <w:t xml:space="preserve">a Hello World PHP script through localhost to confirm PHP integration with the Apache server. Additionally, I established a successful connection between PHP and the MySQL database using </w:t>
       </w:r>
       <w:proofErr w:type="spellStart"/>
       <w:r>
@@ -2997,7 +3653,7 @@
           <w:szCs w:val="24"/>
         </w:rPr>
       </w:pPr>
-      <w:bookmarkStart w:id="12" w:name="_Toc231463279"/>
+      <w:bookmarkStart w:id="12" w:name="_Toc232688302"/>
       <w:r>
         <w:rPr>
           <w:rFonts w:ascii="Times New Roman" w:hAnsi="Times New Roman" w:cs="Times New Roman"/>
@@ -3023,6 +3679,7 @@
           <w:szCs w:val="24"/>
         </w:rPr>
       </w:pPr>
+      <w:bookmarkStart w:id="13" w:name="_Toc232688303"/>
       <w:r>
         <w:rPr>
           <w:rFonts w:ascii="Times New Roman" w:hAnsi="Times New Roman" w:cs="Times New Roman"/>
@@ -3034,6 +3691,7 @@
         </w:rPr>
         <w:t>Hand-drawn Wireframe</w:t>
       </w:r>
+      <w:bookmarkEnd w:id="13"/>
     </w:p>
     <w:p>
       <w:pPr>
@@ -3202,7 +3860,7 @@
           <w:szCs w:val="24"/>
         </w:rPr>
       </w:pPr>
-      <w:bookmarkStart w:id="13" w:name="_Toc231463280"/>
+      <w:bookmarkStart w:id="14" w:name="_Toc232688304"/>
       <w:r>
         <w:rPr>
           <w:rFonts w:ascii="Times New Roman" w:hAnsi="Times New Roman" w:cs="Times New Roman"/>
@@ -3215,7 +3873,7 @@
         <w:lastRenderedPageBreak/>
         <w:t>Dashboard Layout Design</w:t>
       </w:r>
-      <w:bookmarkEnd w:id="13"/>
+      <w:bookmarkEnd w:id="14"/>
     </w:p>
     <w:p>
       <w:pPr>
@@ -3326,7 +3984,7 @@
           <w:szCs w:val="24"/>
         </w:rPr>
       </w:pPr>
-      <w:bookmarkStart w:id="14" w:name="_Toc231463281"/>
+      <w:bookmarkStart w:id="15" w:name="_Toc232688305"/>
       <w:r>
         <w:rPr>
           <w:rFonts w:ascii="Times New Roman" w:hAnsi="Times New Roman" w:cs="Times New Roman"/>
@@ -3339,7 +3997,7 @@
         <w:lastRenderedPageBreak/>
         <w:t>Mobile View Mockup</w:t>
       </w:r>
-      <w:bookmarkEnd w:id="14"/>
+      <w:bookmarkEnd w:id="15"/>
     </w:p>
     <w:p>
       <w:pPr>
@@ -3430,7 +4088,7 @@
           <w:shd w:val="clear" w:color="auto" w:fill="151517"/>
         </w:rPr>
       </w:pPr>
-      <w:bookmarkStart w:id="15" w:name="_Toc231463282"/>
+      <w:bookmarkStart w:id="16" w:name="_Toc232688306"/>
       <w:r>
         <w:rPr>
           <w:rFonts w:ascii="Times New Roman" w:hAnsi="Times New Roman" w:cs="Times New Roman"/>
@@ -3443,7 +4101,7 @@
         <w:lastRenderedPageBreak/>
         <w:t>Color Theme and Navigation Structure</w:t>
       </w:r>
-      <w:bookmarkEnd w:id="15"/>
+      <w:bookmarkEnd w:id="16"/>
       <w:r>
         <w:rPr>
           <w:rFonts w:ascii="Times New Roman" w:eastAsia="Calibri" w:hAnsi="Times New Roman" w:cs="Times New Roman"/>
@@ -3672,7 +4330,7 @@
           <w:szCs w:val="24"/>
         </w:rPr>
       </w:pPr>
-      <w:bookmarkStart w:id="16" w:name="_Toc231463283"/>
+      <w:bookmarkStart w:id="17" w:name="_Toc232688307"/>
       <w:r>
         <w:rPr>
           <w:rFonts w:ascii="Times New Roman" w:hAnsi="Times New Roman" w:cs="Times New Roman"/>
@@ -3684,7 +4342,6 @@
         </w:rPr>
         <w:t xml:space="preserve">GUI Prototype in </w:t>
       </w:r>
-      <w:bookmarkEnd w:id="16"/>
       <w:r>
         <w:rPr>
           <w:rFonts w:ascii="Times New Roman" w:hAnsi="Times New Roman" w:cs="Times New Roman"/>
@@ -3696,6 +4353,7 @@
         </w:rPr>
         <w:t>drawer.io</w:t>
       </w:r>
+      <w:bookmarkEnd w:id="17"/>
     </w:p>
     <w:p>
       <w:pPr>
@@ -3873,7 +4531,7 @@
           <w:szCs w:val="24"/>
         </w:rPr>
       </w:pPr>
-      <w:bookmarkStart w:id="17" w:name="_Toc231463284"/>
+      <w:bookmarkStart w:id="18" w:name="_Toc232688308"/>
       <w:r>
         <w:rPr>
           <w:rFonts w:ascii="Times New Roman" w:hAnsi="Times New Roman" w:cs="Times New Roman"/>
@@ -3885,7 +4543,7 @@
         </w:rPr>
         <w:t>Week 3: JavaScript and PHP Basics</w:t>
       </w:r>
-      <w:bookmarkEnd w:id="17"/>
+      <w:bookmarkEnd w:id="18"/>
     </w:p>
     <w:p>
       <w:pPr>
@@ -3972,7 +4630,7 @@
           <w:szCs w:val="24"/>
         </w:rPr>
       </w:pPr>
-      <w:bookmarkStart w:id="18" w:name="_Toc231463285"/>
+      <w:bookmarkStart w:id="19" w:name="_Toc232688309"/>
       <w:r>
         <w:rPr>
           <w:rFonts w:ascii="Times New Roman" w:hAnsi="Times New Roman" w:cs="Times New Roman"/>
@@ -3984,7 +4642,7 @@
         </w:rPr>
         <w:t>Password Strength Checker</w:t>
       </w:r>
-      <w:bookmarkEnd w:id="18"/>
+      <w:bookmarkEnd w:id="19"/>
     </w:p>
     <w:p>
       <w:pPr>
@@ -4128,7 +4786,7 @@
           <w:szCs w:val="24"/>
         </w:rPr>
       </w:pPr>
-      <w:bookmarkStart w:id="19" w:name="_Toc231463286"/>
+      <w:bookmarkStart w:id="20" w:name="_Toc232688310"/>
       <w:r>
         <w:rPr>
           <w:rFonts w:ascii="Times New Roman" w:hAnsi="Times New Roman" w:cs="Times New Roman"/>
@@ -4140,7 +4798,7 @@
         </w:rPr>
         <w:t>Database Connection Script</w:t>
       </w:r>
-      <w:bookmarkEnd w:id="19"/>
+      <w:bookmarkEnd w:id="20"/>
     </w:p>
     <w:p>
       <w:pPr>
@@ -4243,7 +4901,7 @@
           <w:szCs w:val="24"/>
         </w:rPr>
       </w:pPr>
-      <w:bookmarkStart w:id="20" w:name="_Toc231463287"/>
+      <w:bookmarkStart w:id="21" w:name="_Toc232688311"/>
       <w:r>
         <w:rPr>
           <w:rFonts w:ascii="Times New Roman" w:hAnsi="Times New Roman" w:cs="Times New Roman"/>
@@ -4256,7 +4914,7 @@
         <w:lastRenderedPageBreak/>
         <w:t>Dynamic User Input Handling</w:t>
       </w:r>
-      <w:bookmarkEnd w:id="20"/>
+      <w:bookmarkEnd w:id="21"/>
     </w:p>
     <w:p>
       <w:pPr>
@@ -4349,7 +5007,7 @@
           <w:szCs w:val="24"/>
         </w:rPr>
       </w:pPr>
-      <w:bookmarkStart w:id="21" w:name="_Toc231463288"/>
+      <w:bookmarkStart w:id="22" w:name="_Toc232688312"/>
       <w:r>
         <w:rPr>
           <w:rFonts w:ascii="Times New Roman" w:hAnsi="Times New Roman" w:cs="Times New Roman"/>
@@ -4361,7 +5019,7 @@
         </w:rPr>
         <w:t>Week 4: Server-Side Components and Backend Development Foundations</w:t>
       </w:r>
-      <w:bookmarkEnd w:id="21"/>
+      <w:bookmarkEnd w:id="22"/>
     </w:p>
     <w:p>
       <w:pPr>
@@ -4455,7 +5113,7 @@
           <w:szCs w:val="24"/>
         </w:rPr>
       </w:pPr>
-      <w:bookmarkStart w:id="22" w:name="_Toc231463289"/>
+      <w:bookmarkStart w:id="23" w:name="_Toc232688313"/>
       <w:r>
         <w:rPr>
           <w:rFonts w:ascii="Times New Roman" w:hAnsi="Times New Roman" w:cs="Times New Roman"/>
@@ -4468,7 +5126,7 @@
         </w:rPr>
         <w:t>HTML Forms and PHP Integration</w:t>
       </w:r>
-      <w:bookmarkEnd w:id="22"/>
+      <w:bookmarkEnd w:id="23"/>
     </w:p>
     <w:p>
       <w:pPr>
@@ -4662,7 +5320,7 @@
           <w:szCs w:val="24"/>
         </w:rPr>
       </w:pPr>
-      <w:bookmarkStart w:id="23" w:name="_Toc231463290"/>
+      <w:bookmarkStart w:id="24" w:name="_Toc232688314"/>
       <w:r>
         <w:rPr>
           <w:rFonts w:ascii="Times New Roman" w:hAnsi="Times New Roman" w:cs="Times New Roman"/>
@@ -4675,7 +5333,7 @@
         <w:lastRenderedPageBreak/>
         <w:t>Simple Authentication System</w:t>
       </w:r>
-      <w:bookmarkEnd w:id="23"/>
+      <w:bookmarkEnd w:id="24"/>
     </w:p>
     <w:p>
       <w:pPr>
@@ -4800,7 +5458,7 @@
           <w:szCs w:val="24"/>
         </w:rPr>
       </w:pPr>
-      <w:bookmarkStart w:id="24" w:name="_Toc231463291"/>
+      <w:bookmarkStart w:id="25" w:name="_Toc232688315"/>
       <w:r>
         <w:rPr>
           <w:rFonts w:ascii="Times New Roman" w:hAnsi="Times New Roman" w:cs="Times New Roman"/>
@@ -4813,7 +5471,7 @@
         <w:lastRenderedPageBreak/>
         <w:t>Backend Folder Organization</w:t>
       </w:r>
-      <w:bookmarkEnd w:id="24"/>
+      <w:bookmarkEnd w:id="25"/>
     </w:p>
     <w:p>
       <w:pPr>
@@ -4968,7 +5626,7 @@
           <w:szCs w:val="24"/>
         </w:rPr>
       </w:pPr>
-      <w:bookmarkStart w:id="25" w:name="_Toc231463292"/>
+      <w:bookmarkStart w:id="26" w:name="_Toc232688316"/>
       <w:r>
         <w:rPr>
           <w:rFonts w:ascii="Times New Roman" w:hAnsi="Times New Roman" w:cs="Times New Roman"/>
@@ -4981,7 +5639,7 @@
         <w:lastRenderedPageBreak/>
         <w:t>Week 5: Database Components and CRUD Operations</w:t>
       </w:r>
-      <w:bookmarkEnd w:id="25"/>
+      <w:bookmarkEnd w:id="26"/>
     </w:p>
     <w:p>
       <w:pPr>
@@ -4995,7 +5653,7 @@
           <w:szCs w:val="24"/>
         </w:rPr>
       </w:pPr>
-      <w:bookmarkStart w:id="26" w:name="_Toc231463293"/>
+      <w:bookmarkStart w:id="27" w:name="_Toc232688317"/>
       <w:r>
         <w:rPr>
           <w:rFonts w:ascii="Times New Roman" w:hAnsi="Times New Roman" w:cs="Times New Roman"/>
@@ -5007,7 +5665,7 @@
         </w:rPr>
         <w:t>Database Creation</w:t>
       </w:r>
-      <w:bookmarkEnd w:id="26"/>
+      <w:bookmarkEnd w:id="27"/>
     </w:p>
     <w:p>
       <w:pPr>
@@ -5388,6 +6046,7 @@
           <w:szCs w:val="28"/>
         </w:rPr>
       </w:pPr>
+      <w:bookmarkStart w:id="28" w:name="_Toc232688318"/>
       <w:r>
         <w:rPr>
           <w:rFonts w:ascii="Times New Roman" w:hAnsi="Times New Roman"/>
@@ -5398,6 +6057,7 @@
         </w:rPr>
         <w:t>Week 6: Database Integration and CRUD Operations</w:t>
       </w:r>
+      <w:bookmarkEnd w:id="28"/>
     </w:p>
     <w:p>
       <w:pPr>
@@ -5410,6 +6070,7 @@
           <w:kern w:val="0"/>
         </w:rPr>
       </w:pPr>
+      <w:bookmarkStart w:id="29" w:name="_Toc232688319"/>
       <w:r>
         <w:rPr>
           <w:rFonts w:ascii="Times New Roman" w:hAnsi="Times New Roman"/>
@@ -5420,16 +6081,18 @@
         <w:lastRenderedPageBreak/>
         <w:t>Create</w:t>
       </w:r>
-    </w:p>
-    <w:p>
-      <w:pPr>
-        <w:rPr>
-          <w:rFonts w:ascii="Times New Roman" w:hAnsi="Times New Roman"/>
-        </w:rPr>
-      </w:pPr>
-      <w:r>
-        <w:rPr>
-          <w:rFonts w:ascii="Times New Roman" w:hAnsi="Times New Roman"/>
+      <w:bookmarkEnd w:id="29"/>
+    </w:p>
+    <w:p>
+      <w:pPr>
+        <w:rPr>
+          <w:rFonts w:ascii="Times New Roman" w:hAnsi="Times New Roman"/>
+        </w:rPr>
+      </w:pPr>
+      <w:r>
+        <w:rPr>
+          <w:rFonts w:ascii="Times New Roman" w:hAnsi="Times New Roman"/>
+          <w:noProof/>
         </w:rPr>
         <w:drawing>
           <wp:inline distT="0" distB="0" distL="0" distR="0" wp14:anchorId="49A9DD8D" wp14:editId="403B10E9">
@@ -5492,6 +6155,7 @@
       <w:r>
         <w:rPr>
           <w:rFonts w:ascii="Times New Roman" w:hAnsi="Times New Roman"/>
+          <w:noProof/>
         </w:rPr>
         <w:drawing>
           <wp:inline distT="0" distB="0" distL="0" distR="0" wp14:anchorId="614616B7" wp14:editId="1575320C">
@@ -5554,6 +6218,7 @@
       <w:r>
         <w:rPr>
           <w:rFonts w:ascii="Times New Roman" w:hAnsi="Times New Roman"/>
+          <w:noProof/>
         </w:rPr>
         <w:drawing>
           <wp:inline distT="0" distB="0" distL="0" distR="0" wp14:anchorId="5914873A" wp14:editId="7E5A264F">
@@ -5616,6 +6281,7 @@
       <w:r>
         <w:rPr>
           <w:rFonts w:ascii="Times New Roman" w:hAnsi="Times New Roman"/>
+          <w:noProof/>
         </w:rPr>
         <w:lastRenderedPageBreak/>
         <w:drawing>
@@ -5702,19 +6368,7 @@
         <w:rPr>
           <w:rFonts w:ascii="Times New Roman" w:hAnsi="Times New Roman"/>
         </w:rPr>
-        <w:t>Develop</w:t>
-      </w:r>
-      <w:r>
-        <w:rPr>
-          <w:rFonts w:ascii="Times New Roman" w:hAnsi="Times New Roman"/>
-        </w:rPr>
-        <w:t>ed</w:t>
-      </w:r>
-      <w:r>
-        <w:rPr>
-          <w:rFonts w:ascii="Times New Roman" w:hAnsi="Times New Roman"/>
-        </w:rPr>
-        <w:t xml:space="preserve"> a mini Student Management System that can:</w:t>
+        <w:t>Developed a mini Student Management System that can:</w:t>
       </w:r>
     </w:p>
     <w:p>
@@ -5822,6 +6476,7 @@
           <w:szCs w:val="28"/>
         </w:rPr>
       </w:pPr>
+      <w:bookmarkStart w:id="30" w:name="_Toc232688320"/>
       <w:r>
         <w:rPr>
           <w:rFonts w:ascii="Times New Roman" w:hAnsi="Times New Roman"/>
@@ -5833,6 +6488,7 @@
         </w:rPr>
         <w:t>Week 7: User Authentication and Session Management</w:t>
       </w:r>
+      <w:bookmarkEnd w:id="30"/>
     </w:p>
     <w:p>
       <w:pPr>
@@ -5847,6 +6503,7 @@
           <w:szCs w:val="28"/>
         </w:rPr>
       </w:pPr>
+      <w:bookmarkStart w:id="31" w:name="_Toc232688321"/>
       <w:r>
         <w:rPr>
           <w:rFonts w:ascii="Times New Roman" w:hAnsi="Times New Roman"/>
@@ -5858,6 +6515,7 @@
         </w:rPr>
         <w:t>Practical Task 1</w:t>
       </w:r>
+      <w:bookmarkEnd w:id="31"/>
     </w:p>
     <w:p>
       <w:pPr>
@@ -5871,6 +6529,7 @@
           <w:szCs w:val="28"/>
         </w:rPr>
       </w:pPr>
+      <w:bookmarkStart w:id="32" w:name="_Toc232688322"/>
       <w:r>
         <w:rPr>
           <w:rFonts w:ascii="Times New Roman" w:hAnsi="Times New Roman"/>
@@ -5881,6 +6540,7 @@
         </w:rPr>
         <w:t>Student Portal Login System</w:t>
       </w:r>
+      <w:bookmarkEnd w:id="32"/>
     </w:p>
     <w:p>
       <w:pPr>
@@ -5909,6 +6569,7 @@
           <w:szCs w:val="28"/>
         </w:rPr>
       </w:pPr>
+      <w:bookmarkStart w:id="33" w:name="_Toc232688323"/>
       <w:r>
         <w:rPr>
           <w:rFonts w:ascii="Times New Roman" w:hAnsi="Times New Roman"/>
@@ -5931,6 +6592,7 @@
         </w:rPr>
         <w:t xml:space="preserve"> Page</w:t>
       </w:r>
+      <w:bookmarkEnd w:id="33"/>
     </w:p>
     <w:p>
       <w:pPr>
@@ -5945,11 +6607,13 @@
           <w:szCs w:val="28"/>
         </w:rPr>
       </w:pPr>
+      <w:bookmarkStart w:id="34" w:name="_Toc232688324"/>
       <w:r>
         <w:rPr>
           <w:rFonts w:ascii="Times New Roman" w:hAnsi="Times New Roman"/>
           <w:b/>
           <w:bCs/>
+          <w:noProof/>
           <w:kern w:val="36"/>
           <w:sz w:val="28"/>
           <w:szCs w:val="28"/>
@@ -5991,6 +6655,7 @@
           </wp:inline>
         </w:drawing>
       </w:r>
+      <w:bookmarkEnd w:id="34"/>
     </w:p>
     <w:p>
       <w:pPr>
@@ -6025,6 +6690,7 @@
         <w:rPr>
           <w:rFonts w:ascii="Times New Roman" w:hAnsi="Times New Roman"/>
           <w:b/>
+          <w:noProof/>
         </w:rPr>
         <w:drawing>
           <wp:inline distT="0" distB="0" distL="0" distR="0" wp14:anchorId="2B7063CD" wp14:editId="3CA86A17">
@@ -6089,6 +6755,7 @@
         <w:rPr>
           <w:rFonts w:ascii="Times New Roman" w:hAnsi="Times New Roman"/>
           <w:b/>
+          <w:noProof/>
         </w:rPr>
         <w:lastRenderedPageBreak/>
         <w:drawing>
@@ -6155,6 +6822,7 @@
           <w:rFonts w:ascii="Times New Roman" w:hAnsi="Times New Roman"/>
           <w:b/>
           <w:bCs/>
+          <w:noProof/>
           <w:kern w:val="36"/>
           <w:sz w:val="28"/>
           <w:szCs w:val="28"/>
@@ -6223,19 +6891,7 @@
         <w:rPr>
           <w:rFonts w:ascii="Times New Roman" w:hAnsi="Times New Roman"/>
         </w:rPr>
-        <w:t>Develop</w:t>
-      </w:r>
-      <w:r>
-        <w:rPr>
-          <w:rFonts w:ascii="Times New Roman" w:hAnsi="Times New Roman"/>
-        </w:rPr>
-        <w:t>ed</w:t>
-      </w:r>
-      <w:r>
-        <w:rPr>
-          <w:rFonts w:ascii="Times New Roman" w:hAnsi="Times New Roman"/>
-        </w:rPr>
-        <w:t xml:space="preserve"> a system that includes:</w:t>
+        <w:t>Developed a system that includes:</w:t>
       </w:r>
     </w:p>
     <w:p>
@@ -6336,6 +6992,7 @@
           <w:szCs w:val="28"/>
         </w:rPr>
       </w:pPr>
+      <w:bookmarkStart w:id="35" w:name="_Toc232688325"/>
       <w:r>
         <w:rPr>
           <w:rFonts w:ascii="Times New Roman" w:hAnsi="Times New Roman"/>
@@ -6347,6 +7004,7 @@
         </w:rPr>
         <w:t>Practical Task 2</w:t>
       </w:r>
+      <w:bookmarkEnd w:id="35"/>
     </w:p>
     <w:p>
       <w:pPr>
@@ -6360,6 +7018,7 @@
           <w:kern w:val="0"/>
         </w:rPr>
       </w:pPr>
+      <w:bookmarkStart w:id="36" w:name="_Toc232688326"/>
       <w:r>
         <w:rPr>
           <w:rFonts w:ascii="Times New Roman" w:hAnsi="Times New Roman"/>
@@ -6376,6 +7035,7 @@
         </w:rPr>
         <w:t>tal</w:t>
       </w:r>
+      <w:bookmarkEnd w:id="36"/>
     </w:p>
     <w:p>
       <w:pPr>
@@ -6404,6 +7064,7 @@
         <w:rPr>
           <w:rFonts w:ascii="Times New Roman" w:hAnsi="Times New Roman"/>
           <w:b/>
+          <w:noProof/>
         </w:rPr>
         <w:drawing>
           <wp:inline distT="0" distB="0" distL="0" distR="0" wp14:anchorId="75F8C5E1" wp14:editId="2B59CF09">
@@ -6476,6 +7137,7 @@
         <w:rPr>
           <w:rFonts w:ascii="Times New Roman" w:hAnsi="Times New Roman"/>
           <w:b/>
+          <w:noProof/>
         </w:rPr>
         <w:drawing>
           <wp:inline distT="0" distB="0" distL="0" distR="0" wp14:anchorId="31721207" wp14:editId="002A6226">
@@ -6540,6 +7202,7 @@
         <w:rPr>
           <w:rFonts w:ascii="Times New Roman" w:hAnsi="Times New Roman"/>
           <w:b/>
+          <w:noProof/>
         </w:rPr>
         <w:lastRenderedPageBreak/>
         <w:drawing>
@@ -6605,6 +7268,7 @@
         <w:rPr>
           <w:rFonts w:ascii="Times New Roman" w:hAnsi="Times New Roman"/>
           <w:b/>
+          <w:noProof/>
         </w:rPr>
         <w:drawing>
           <wp:inline distT="0" distB="0" distL="0" distR="0" wp14:anchorId="70F2EA24" wp14:editId="062F76C0">
@@ -6676,6 +7340,7 @@
         <w:rPr>
           <w:rFonts w:ascii="Times New Roman" w:hAnsi="Times New Roman"/>
           <w:b/>
+          <w:noProof/>
         </w:rPr>
         <w:lastRenderedPageBreak/>
         <w:drawing>
@@ -6743,28 +7408,14 @@
         <w:rPr>
           <w:rFonts w:ascii="Times New Roman" w:hAnsi="Times New Roman"/>
         </w:rPr>
-        <w:t>Create</w:t>
-      </w:r>
-      <w:r>
-        <w:rPr>
-          <w:rFonts w:ascii="Times New Roman" w:hAnsi="Times New Roman"/>
-        </w:rPr>
-        <w:t>ed</w:t>
+        <w:t>Createed</w:t>
       </w:r>
       <w:proofErr w:type="spellEnd"/>
       <w:r>
         <w:rPr>
           <w:rFonts w:ascii="Times New Roman" w:hAnsi="Times New Roman"/>
         </w:rPr>
-        <w:t xml:space="preserve"> </w:t>
-      </w:r>
-      <w:bookmarkStart w:id="27" w:name="_GoBack"/>
-      <w:bookmarkEnd w:id="27"/>
-      <w:r>
-        <w:rPr>
-          <w:rFonts w:ascii="Times New Roman" w:hAnsi="Times New Roman"/>
-        </w:rPr>
-        <w:t xml:space="preserve"> an employee system with:</w:t>
+        <w:t xml:space="preserve">  an employee system with:</w:t>
       </w:r>
     </w:p>
     <w:p>
@@ -6849,6 +7500,743 @@
           <w:rFonts w:ascii="Times New Roman" w:hAnsi="Times New Roman"/>
         </w:rPr>
         <w:t>Session Management</w:t>
+      </w:r>
+    </w:p>
+    <w:p>
+      <w:pPr>
+        <w:pStyle w:val="ListParagraph"/>
+        <w:spacing w:after="100" w:afterAutospacing="1"/>
+        <w:outlineLvl w:val="1"/>
+        <w:rPr>
+          <w:rFonts w:ascii="Times New Roman" w:hAnsi="Times New Roman"/>
+          <w:b/>
+          <w:bCs/>
+          <w:sz w:val="28"/>
+          <w:szCs w:val="28"/>
+        </w:rPr>
+      </w:pPr>
+      <w:r>
+        <w:rPr>
+          <w:rFonts w:ascii="Times New Roman" w:hAnsi="Times New Roman"/>
+          <w:b/>
+          <w:bCs/>
+          <w:sz w:val="28"/>
+          <w:szCs w:val="28"/>
+        </w:rPr>
+        <w:t>Week 8: Responsive Web Design and Mobile-First Development</w:t>
+      </w:r>
+    </w:p>
+    <w:p>
+      <w:pPr>
+        <w:spacing w:after="100" w:afterAutospacing="1"/>
+        <w:outlineLvl w:val="1"/>
+        <w:rPr>
+          <w:rFonts w:ascii="Times New Roman" w:hAnsi="Times New Roman"/>
+          <w:b/>
+          <w:bCs/>
+        </w:rPr>
+      </w:pPr>
+      <w:r>
+        <w:rPr>
+          <w:rFonts w:ascii="Times New Roman" w:hAnsi="Times New Roman"/>
+          <w:b/>
+          <w:bCs/>
+        </w:rPr>
+        <w:t xml:space="preserve">           </w:t>
+      </w:r>
+      <w:r>
+        <w:rPr>
+          <w:rFonts w:ascii="Times New Roman" w:hAnsi="Times New Roman"/>
+          <w:b/>
+          <w:bCs/>
+        </w:rPr>
+        <w:t>Task 1: Create a Responsive Personal Profile Page</w:t>
+      </w:r>
+    </w:p>
+    <w:p>
+      <w:pPr>
+        <w:spacing w:after="100" w:afterAutospacing="1"/>
+        <w:outlineLvl w:val="1"/>
+        <w:rPr>
+          <w:rFonts w:ascii="Times New Roman" w:hAnsi="Times New Roman"/>
+          <w:b/>
+          <w:bCs/>
+        </w:rPr>
+      </w:pPr>
+      <w:r>
+        <w:rPr>
+          <w:rFonts w:ascii="Times New Roman" w:hAnsi="Times New Roman"/>
+          <w:b/>
+          <w:bCs/>
+        </w:rPr>
+        <w:t>Profile and Name page</w:t>
+      </w:r>
+    </w:p>
+    <w:p>
+      <w:pPr>
+        <w:spacing w:after="100" w:afterAutospacing="1"/>
+        <w:outlineLvl w:val="1"/>
+        <w:rPr>
+          <w:rFonts w:ascii="Times New Roman" w:hAnsi="Times New Roman"/>
+          <w:b/>
+          <w:bCs/>
+          <w:kern w:val="0"/>
+        </w:rPr>
+      </w:pPr>
+      <w:r>
+        <w:rPr>
+          <w:rFonts w:ascii="Times New Roman" w:hAnsi="Times New Roman"/>
+          <w:b/>
+          <w:bCs/>
+          <w:kern w:val="0"/>
+        </w:rPr>
+        <w:drawing>
+          <wp:inline distT="0" distB="0" distL="0" distR="0" wp14:anchorId="2997E785" wp14:editId="5FDBE23D">
+            <wp:extent cx="4242391" cy="2236320"/>
+            <wp:effectExtent l="0" t="0" r="6350" b="0"/>
+            <wp:docPr id="18" name="Picture 18"/>
+            <wp:cNvGraphicFramePr>
+              <a:graphicFrameLocks xmlns:a="http://schemas.openxmlformats.org/drawingml/2006/main" noChangeAspect="1"/>
+            </wp:cNvGraphicFramePr>
+            <a:graphic xmlns:a="http://schemas.openxmlformats.org/drawingml/2006/main">
+              <a:graphicData uri="http://schemas.openxmlformats.org/drawingml/2006/picture">
+                <pic:pic xmlns:pic="http://schemas.openxmlformats.org/drawingml/2006/picture">
+                  <pic:nvPicPr>
+                    <pic:cNvPr id="1" name=""/>
+                    <pic:cNvPicPr/>
+                  </pic:nvPicPr>
+                  <pic:blipFill>
+                    <a:blip r:embed="rId47"/>
+                    <a:stretch>
+                      <a:fillRect/>
+                    </a:stretch>
+                  </pic:blipFill>
+                  <pic:spPr>
+                    <a:xfrm>
+                      <a:off x="0" y="0"/>
+                      <a:ext cx="4268148" cy="2249898"/>
+                    </a:xfrm>
+                    <a:prstGeom prst="rect">
+                      <a:avLst/>
+                    </a:prstGeom>
+                  </pic:spPr>
+                </pic:pic>
+              </a:graphicData>
+            </a:graphic>
+          </wp:inline>
+        </w:drawing>
+      </w:r>
+    </w:p>
+    <w:p>
+      <w:pPr>
+        <w:pStyle w:val="ListParagraph"/>
+        <w:spacing w:after="100" w:afterAutospacing="1"/>
+        <w:outlineLvl w:val="1"/>
+        <w:rPr>
+          <w:rFonts w:ascii="Times New Roman" w:hAnsi="Times New Roman"/>
+          <w:b/>
+          <w:bCs/>
+          <w:kern w:val="0"/>
+        </w:rPr>
+      </w:pPr>
+    </w:p>
+    <w:p>
+      <w:pPr>
+        <w:rPr>
+          <w:rFonts w:ascii="Times New Roman" w:hAnsi="Times New Roman"/>
+          <w:b/>
+        </w:rPr>
+      </w:pPr>
+      <w:r>
+        <w:rPr>
+          <w:rFonts w:ascii="Times New Roman" w:hAnsi="Times New Roman"/>
+          <w:b/>
+        </w:rPr>
+        <w:t>About page</w:t>
+      </w:r>
+    </w:p>
+    <w:p>
+      <w:pPr>
+        <w:rPr>
+          <w:rFonts w:ascii="Times New Roman" w:hAnsi="Times New Roman"/>
+          <w:b/>
+        </w:rPr>
+      </w:pPr>
+      <w:r>
+        <w:rPr>
+          <w:rFonts w:ascii="Times New Roman" w:hAnsi="Times New Roman"/>
+          <w:b/>
+        </w:rPr>
+        <w:drawing>
+          <wp:inline distT="0" distB="0" distL="0" distR="0" wp14:anchorId="2774B6FF" wp14:editId="7F55E3B9">
+            <wp:extent cx="5369442" cy="2830430"/>
+            <wp:effectExtent l="0" t="0" r="3175" b="8255"/>
+            <wp:docPr id="30" name="Picture 30"/>
+            <wp:cNvGraphicFramePr>
+              <a:graphicFrameLocks xmlns:a="http://schemas.openxmlformats.org/drawingml/2006/main" noChangeAspect="1"/>
+            </wp:cNvGraphicFramePr>
+            <a:graphic xmlns:a="http://schemas.openxmlformats.org/drawingml/2006/main">
+              <a:graphicData uri="http://schemas.openxmlformats.org/drawingml/2006/picture">
+                <pic:pic xmlns:pic="http://schemas.openxmlformats.org/drawingml/2006/picture">
+                  <pic:nvPicPr>
+                    <pic:cNvPr id="1" name=""/>
+                    <pic:cNvPicPr/>
+                  </pic:nvPicPr>
+                  <pic:blipFill>
+                    <a:blip r:embed="rId48"/>
+                    <a:stretch>
+                      <a:fillRect/>
+                    </a:stretch>
+                  </pic:blipFill>
+                  <pic:spPr>
+                    <a:xfrm>
+                      <a:off x="0" y="0"/>
+                      <a:ext cx="5388021" cy="2840224"/>
+                    </a:xfrm>
+                    <a:prstGeom prst="rect">
+                      <a:avLst/>
+                    </a:prstGeom>
+                  </pic:spPr>
+                </pic:pic>
+              </a:graphicData>
+            </a:graphic>
+          </wp:inline>
+        </w:drawing>
+      </w:r>
+    </w:p>
+    <w:p>
+      <w:pPr>
+        <w:rPr>
+          <w:rFonts w:ascii="Times New Roman" w:hAnsi="Times New Roman"/>
+          <w:b/>
+        </w:rPr>
+      </w:pPr>
+      <w:r>
+        <w:rPr>
+          <w:rFonts w:ascii="Times New Roman" w:hAnsi="Times New Roman"/>
+          <w:b/>
+        </w:rPr>
+        <w:t>Contact page</w:t>
+      </w:r>
+    </w:p>
+    <w:p>
+      <w:pPr>
+        <w:rPr>
+          <w:rFonts w:ascii="Times New Roman" w:hAnsi="Times New Roman"/>
+          <w:b/>
+        </w:rPr>
+      </w:pPr>
+      <w:r>
+        <w:rPr>
+          <w:rFonts w:ascii="Times New Roman" w:hAnsi="Times New Roman"/>
+          <w:b/>
+        </w:rPr>
+        <w:drawing>
+          <wp:inline distT="0" distB="0" distL="0" distR="0" wp14:anchorId="51B64818" wp14:editId="3AFADE30">
+            <wp:extent cx="5358657" cy="2824745"/>
+            <wp:effectExtent l="0" t="0" r="0" b="0"/>
+            <wp:docPr id="39" name="Picture 39"/>
+            <wp:cNvGraphicFramePr>
+              <a:graphicFrameLocks xmlns:a="http://schemas.openxmlformats.org/drawingml/2006/main" noChangeAspect="1"/>
+            </wp:cNvGraphicFramePr>
+            <a:graphic xmlns:a="http://schemas.openxmlformats.org/drawingml/2006/main">
+              <a:graphicData uri="http://schemas.openxmlformats.org/drawingml/2006/picture">
+                <pic:pic xmlns:pic="http://schemas.openxmlformats.org/drawingml/2006/picture">
+                  <pic:nvPicPr>
+                    <pic:cNvPr id="1" name=""/>
+                    <pic:cNvPicPr/>
+                  </pic:nvPicPr>
+                  <pic:blipFill>
+                    <a:blip r:embed="rId49"/>
+                    <a:stretch>
+                      <a:fillRect/>
+                    </a:stretch>
+                  </pic:blipFill>
+                  <pic:spPr>
+                    <a:xfrm>
+                      <a:off x="0" y="0"/>
+                      <a:ext cx="5373777" cy="2832716"/>
+                    </a:xfrm>
+                    <a:prstGeom prst="rect">
+                      <a:avLst/>
+                    </a:prstGeom>
+                  </pic:spPr>
+                </pic:pic>
+              </a:graphicData>
+            </a:graphic>
+          </wp:inline>
+        </w:drawing>
+      </w:r>
+    </w:p>
+    <w:p>
+      <w:pPr>
+        <w:rPr>
+          <w:rFonts w:ascii="Times New Roman" w:hAnsi="Times New Roman"/>
+          <w:b/>
+        </w:rPr>
+      </w:pPr>
+      <w:r>
+        <w:rPr>
+          <w:rFonts w:ascii="Times New Roman" w:hAnsi="Times New Roman"/>
+          <w:b/>
+        </w:rPr>
+        <w:t>Student reflection</w:t>
+      </w:r>
+    </w:p>
+    <w:p>
+      <w:pPr>
+        <w:spacing w:after="100" w:afterAutospacing="1"/>
+        <w:rPr>
+          <w:rFonts w:ascii="Times New Roman" w:hAnsi="Times New Roman"/>
+          <w:kern w:val="0"/>
+        </w:rPr>
+      </w:pPr>
+      <w:r>
+        <w:rPr>
+          <w:rFonts w:ascii="Times New Roman" w:hAnsi="Times New Roman"/>
+        </w:rPr>
+        <w:t>Create</w:t>
+      </w:r>
+      <w:r>
+        <w:rPr>
+          <w:rFonts w:ascii="Times New Roman" w:hAnsi="Times New Roman"/>
+        </w:rPr>
+        <w:t>d</w:t>
+      </w:r>
+      <w:r>
+        <w:rPr>
+          <w:rFonts w:ascii="Times New Roman" w:hAnsi="Times New Roman"/>
+        </w:rPr>
+        <w:t xml:space="preserve"> a webpage containing:</w:t>
+      </w:r>
+    </w:p>
+    <w:p>
+      <w:pPr>
+        <w:numPr>
+          <w:ilvl w:val="0"/>
+          <w:numId w:val="5"/>
+        </w:numPr>
+        <w:tabs>
+          <w:tab w:val="left" w:pos="720"/>
+        </w:tabs>
+        <w:spacing w:after="100" w:afterAutospacing="1" w:line="256" w:lineRule="auto"/>
+        <w:rPr>
+          <w:rFonts w:ascii="Times New Roman" w:hAnsi="Times New Roman"/>
+        </w:rPr>
+      </w:pPr>
+      <w:r>
+        <w:rPr>
+          <w:rFonts w:ascii="Times New Roman" w:hAnsi="Times New Roman"/>
+        </w:rPr>
+        <w:t>My</w:t>
+      </w:r>
+      <w:r>
+        <w:rPr>
+          <w:rFonts w:ascii="Times New Roman" w:hAnsi="Times New Roman"/>
+        </w:rPr>
+        <w:t xml:space="preserve"> name</w:t>
+      </w:r>
+    </w:p>
+    <w:p>
+      <w:pPr>
+        <w:numPr>
+          <w:ilvl w:val="0"/>
+          <w:numId w:val="5"/>
+        </w:numPr>
+        <w:tabs>
+          <w:tab w:val="left" w:pos="720"/>
+        </w:tabs>
+        <w:spacing w:after="100" w:afterAutospacing="1" w:line="256" w:lineRule="auto"/>
+        <w:rPr>
+          <w:rFonts w:ascii="Times New Roman" w:hAnsi="Times New Roman"/>
+        </w:rPr>
+      </w:pPr>
+      <w:r>
+        <w:rPr>
+          <w:rFonts w:ascii="Times New Roman" w:hAnsi="Times New Roman"/>
+        </w:rPr>
+        <w:lastRenderedPageBreak/>
+        <w:t>Profile picture</w:t>
+      </w:r>
+    </w:p>
+    <w:p>
+      <w:pPr>
+        <w:numPr>
+          <w:ilvl w:val="0"/>
+          <w:numId w:val="5"/>
+        </w:numPr>
+        <w:tabs>
+          <w:tab w:val="left" w:pos="720"/>
+        </w:tabs>
+        <w:spacing w:after="100" w:afterAutospacing="1" w:line="256" w:lineRule="auto"/>
+        <w:rPr>
+          <w:rFonts w:ascii="Times New Roman" w:hAnsi="Times New Roman"/>
+        </w:rPr>
+      </w:pPr>
+      <w:r>
+        <w:rPr>
+          <w:rFonts w:ascii="Times New Roman" w:hAnsi="Times New Roman"/>
+        </w:rPr>
+        <w:t>About section</w:t>
+      </w:r>
+    </w:p>
+    <w:p>
+      <w:pPr>
+        <w:numPr>
+          <w:ilvl w:val="0"/>
+          <w:numId w:val="5"/>
+        </w:numPr>
+        <w:tabs>
+          <w:tab w:val="left" w:pos="720"/>
+        </w:tabs>
+        <w:spacing w:after="100" w:afterAutospacing="1" w:line="256" w:lineRule="auto"/>
+        <w:rPr>
+          <w:rFonts w:ascii="Times New Roman" w:hAnsi="Times New Roman"/>
+        </w:rPr>
+      </w:pPr>
+      <w:r>
+        <w:rPr>
+          <w:rFonts w:ascii="Times New Roman" w:hAnsi="Times New Roman"/>
+        </w:rPr>
+        <w:t>Contact information</w:t>
+      </w:r>
+    </w:p>
+    <w:p>
+      <w:pPr>
+        <w:rPr>
+          <w:rFonts w:ascii="Times New Roman" w:hAnsi="Times New Roman"/>
+        </w:rPr>
+      </w:pPr>
+      <w:r>
+        <w:rPr>
+          <w:rFonts w:ascii="Times New Roman" w:hAnsi="Times New Roman"/>
+        </w:rPr>
+        <w:t>And</w:t>
+      </w:r>
+      <w:r>
+        <w:rPr>
+          <w:rFonts w:ascii="Times New Roman" w:hAnsi="Times New Roman"/>
+          <w:b/>
+        </w:rPr>
+        <w:t xml:space="preserve"> </w:t>
+      </w:r>
+      <w:r>
+        <w:rPr>
+          <w:rFonts w:ascii="Times New Roman" w:hAnsi="Times New Roman"/>
+        </w:rPr>
+        <w:t>adjusts automatically on different devices.</w:t>
+      </w:r>
+    </w:p>
+    <w:p>
+      <w:pPr>
+        <w:spacing w:after="100" w:afterAutospacing="1"/>
+        <w:outlineLvl w:val="1"/>
+        <w:rPr>
+          <w:rFonts w:ascii="Times New Roman" w:hAnsi="Times New Roman"/>
+          <w:b/>
+          <w:bCs/>
+          <w:kern w:val="0"/>
+          <w:sz w:val="28"/>
+          <w:szCs w:val="28"/>
+        </w:rPr>
+      </w:pPr>
+      <w:r>
+        <w:rPr>
+          <w:rFonts w:ascii="Times New Roman" w:hAnsi="Times New Roman"/>
+          <w:b/>
+          <w:bCs/>
+          <w:sz w:val="28"/>
+          <w:szCs w:val="28"/>
+        </w:rPr>
+        <w:t>Task 2: Build a Responsive Product Showcase</w:t>
+      </w:r>
+    </w:p>
+    <w:p>
+      <w:pPr>
+        <w:rPr>
+          <w:rFonts w:ascii="Times New Roman" w:hAnsi="Times New Roman"/>
+          <w:sz w:val="28"/>
+          <w:szCs w:val="28"/>
+        </w:rPr>
+      </w:pPr>
+    </w:p>
+    <w:p>
+      <w:pPr>
+        <w:rPr>
+          <w:rFonts w:ascii="Times New Roman" w:hAnsi="Times New Roman"/>
+          <w:b/>
+        </w:rPr>
+      </w:pPr>
+      <w:r>
+        <w:rPr>
+          <w:rFonts w:ascii="Times New Roman" w:hAnsi="Times New Roman"/>
+          <w:b/>
+        </w:rPr>
+        <w:t xml:space="preserve">Home page </w:t>
+      </w:r>
+    </w:p>
+    <w:p>
+      <w:pPr>
+        <w:rPr>
+          <w:rFonts w:ascii="Times New Roman" w:hAnsi="Times New Roman"/>
+          <w:b/>
+        </w:rPr>
+      </w:pPr>
+      <w:r>
+        <w:rPr>
+          <w:rFonts w:ascii="Times New Roman" w:hAnsi="Times New Roman"/>
+          <w:b/>
+        </w:rPr>
+        <w:drawing>
+          <wp:inline distT="0" distB="0" distL="0" distR="0" wp14:anchorId="1F2505A1" wp14:editId="31CFA349">
+            <wp:extent cx="5943600" cy="3032760"/>
+            <wp:effectExtent l="0" t="0" r="0" b="0"/>
+            <wp:docPr id="40" name="Picture 40"/>
+            <wp:cNvGraphicFramePr>
+              <a:graphicFrameLocks xmlns:a="http://schemas.openxmlformats.org/drawingml/2006/main" noChangeAspect="1"/>
+            </wp:cNvGraphicFramePr>
+            <a:graphic xmlns:a="http://schemas.openxmlformats.org/drawingml/2006/main">
+              <a:graphicData uri="http://schemas.openxmlformats.org/drawingml/2006/picture">
+                <pic:pic xmlns:pic="http://schemas.openxmlformats.org/drawingml/2006/picture">
+                  <pic:nvPicPr>
+                    <pic:cNvPr id="1" name=""/>
+                    <pic:cNvPicPr/>
+                  </pic:nvPicPr>
+                  <pic:blipFill>
+                    <a:blip r:embed="rId50"/>
+                    <a:stretch>
+                      <a:fillRect/>
+                    </a:stretch>
+                  </pic:blipFill>
+                  <pic:spPr>
+                    <a:xfrm>
+                      <a:off x="0" y="0"/>
+                      <a:ext cx="5943600" cy="3032760"/>
+                    </a:xfrm>
+                    <a:prstGeom prst="rect">
+                      <a:avLst/>
+                    </a:prstGeom>
+                  </pic:spPr>
+                </pic:pic>
+              </a:graphicData>
+            </a:graphic>
+          </wp:inline>
+        </w:drawing>
+      </w:r>
+    </w:p>
+    <w:p>
+      <w:pPr>
+        <w:rPr>
+          <w:rFonts w:ascii="Times New Roman" w:hAnsi="Times New Roman"/>
+          <w:b/>
+        </w:rPr>
+      </w:pPr>
+      <w:r>
+        <w:rPr>
+          <w:rFonts w:ascii="Times New Roman" w:hAnsi="Times New Roman"/>
+          <w:b/>
+        </w:rPr>
+        <w:t>Featured product page</w:t>
+      </w:r>
+    </w:p>
+    <w:p>
+      <w:pPr>
+        <w:rPr>
+          <w:rFonts w:ascii="Times New Roman" w:hAnsi="Times New Roman"/>
+          <w:b/>
+        </w:rPr>
+      </w:pPr>
+      <w:r>
+        <w:rPr>
+          <w:rFonts w:ascii="Times New Roman" w:hAnsi="Times New Roman"/>
+          <w:b/>
+        </w:rPr>
+        <w:lastRenderedPageBreak/>
+        <w:drawing>
+          <wp:inline distT="0" distB="0" distL="0" distR="0" wp14:anchorId="3A8AC477" wp14:editId="1BFF23A7">
+            <wp:extent cx="5942740" cy="3200400"/>
+            <wp:effectExtent l="0" t="0" r="1270" b="0"/>
+            <wp:docPr id="46" name="Picture 46"/>
+            <wp:cNvGraphicFramePr>
+              <a:graphicFrameLocks xmlns:a="http://schemas.openxmlformats.org/drawingml/2006/main" noChangeAspect="1"/>
+            </wp:cNvGraphicFramePr>
+            <a:graphic xmlns:a="http://schemas.openxmlformats.org/drawingml/2006/main">
+              <a:graphicData uri="http://schemas.openxmlformats.org/drawingml/2006/picture">
+                <pic:pic xmlns:pic="http://schemas.openxmlformats.org/drawingml/2006/picture">
+                  <pic:nvPicPr>
+                    <pic:cNvPr id="1" name=""/>
+                    <pic:cNvPicPr/>
+                  </pic:nvPicPr>
+                  <pic:blipFill>
+                    <a:blip r:embed="rId51"/>
+                    <a:stretch>
+                      <a:fillRect/>
+                    </a:stretch>
+                  </pic:blipFill>
+                  <pic:spPr>
+                    <a:xfrm>
+                      <a:off x="0" y="0"/>
+                      <a:ext cx="5964793" cy="3212276"/>
+                    </a:xfrm>
+                    <a:prstGeom prst="rect">
+                      <a:avLst/>
+                    </a:prstGeom>
+                  </pic:spPr>
+                </pic:pic>
+              </a:graphicData>
+            </a:graphic>
+          </wp:inline>
+        </w:drawing>
+      </w:r>
+    </w:p>
+    <w:p>
+      <w:pPr>
+        <w:rPr>
+          <w:rFonts w:ascii="Times New Roman" w:hAnsi="Times New Roman"/>
+          <w:b/>
+        </w:rPr>
+      </w:pPr>
+      <w:r>
+        <w:rPr>
+          <w:rFonts w:ascii="Times New Roman" w:hAnsi="Times New Roman"/>
+          <w:b/>
+        </w:rPr>
+        <w:t>Student reflection</w:t>
+      </w:r>
+    </w:p>
+    <w:p>
+      <w:pPr>
+        <w:spacing w:after="100" w:afterAutospacing="1" w:line="240" w:lineRule="auto"/>
+        <w:rPr>
+          <w:rFonts w:ascii="Times New Roman" w:hAnsi="Times New Roman"/>
+          <w:kern w:val="0"/>
+        </w:rPr>
+      </w:pPr>
+      <w:r>
+        <w:rPr>
+          <w:rFonts w:ascii="Times New Roman" w:hAnsi="Times New Roman"/>
+          <w:kern w:val="0"/>
+        </w:rPr>
+        <w:t xml:space="preserve">In this task, I built a responsive product showcase page using HTML and CSS. I learned how to apply </w:t>
+      </w:r>
+      <w:r>
+        <w:rPr>
+          <w:rFonts w:ascii="Times New Roman" w:hAnsi="Times New Roman"/>
+          <w:bCs/>
+          <w:kern w:val="0"/>
+        </w:rPr>
+        <w:t>mobile-first design</w:t>
+      </w:r>
+      <w:r>
+        <w:rPr>
+          <w:rFonts w:ascii="Times New Roman" w:hAnsi="Times New Roman"/>
+          <w:kern w:val="0"/>
+        </w:rPr>
+        <w:t xml:space="preserve"> by writing base styles for small screens first, then scaling up using </w:t>
+      </w:r>
+      <w:r>
+        <w:rPr>
+          <w:rFonts w:ascii="Courier New" w:hAnsi="Courier New" w:cs="Courier New"/>
+          <w:kern w:val="0"/>
+          <w:sz w:val="20"/>
+          <w:szCs w:val="20"/>
+        </w:rPr>
+        <w:t>min-width</w:t>
+      </w:r>
+      <w:r>
+        <w:rPr>
+          <w:rFonts w:ascii="Times New Roman" w:hAnsi="Times New Roman"/>
+          <w:kern w:val="0"/>
+        </w:rPr>
+        <w:t xml:space="preserve"> media queries at 600px (tablet) and 1024px (desktop).</w:t>
+      </w:r>
+    </w:p>
+    <w:p>
+      <w:pPr>
+        <w:spacing w:after="100" w:afterAutospacing="1" w:line="240" w:lineRule="auto"/>
+        <w:rPr>
+          <w:rFonts w:ascii="Times New Roman" w:hAnsi="Times New Roman"/>
+          <w:kern w:val="0"/>
+        </w:rPr>
+      </w:pPr>
+      <w:r>
+        <w:rPr>
+          <w:rFonts w:ascii="Times New Roman" w:hAnsi="Times New Roman"/>
+          <w:kern w:val="0"/>
+        </w:rPr>
+        <w:t xml:space="preserve">The biggest takeaway was using </w:t>
+      </w:r>
+      <w:r>
+        <w:rPr>
+          <w:rFonts w:ascii="Times New Roman" w:hAnsi="Times New Roman"/>
+          <w:bCs/>
+          <w:kern w:val="0"/>
+        </w:rPr>
+        <w:t>CSS Grid</w:t>
+      </w:r>
+      <w:r>
+        <w:rPr>
+          <w:rFonts w:ascii="Times New Roman" w:hAnsi="Times New Roman"/>
+          <w:kern w:val="0"/>
+        </w:rPr>
+        <w:t xml:space="preserve"> to control the product layout </w:t>
+      </w:r>
+      <w:bookmarkStart w:id="37" w:name="_GoBack"/>
+      <w:bookmarkEnd w:id="37"/>
+      <w:r>
+        <w:rPr>
+          <w:rFonts w:ascii="Times New Roman" w:hAnsi="Times New Roman"/>
+          <w:kern w:val="0"/>
+        </w:rPr>
+        <w:t xml:space="preserve"> one column on mobile, two on tablet, and four on desktop. I also used </w:t>
+      </w:r>
+      <w:r>
+        <w:rPr>
+          <w:rFonts w:ascii="Courier New" w:hAnsi="Courier New" w:cs="Courier New"/>
+          <w:kern w:val="0"/>
+          <w:sz w:val="20"/>
+          <w:szCs w:val="20"/>
+        </w:rPr>
+        <w:t>object-fit: cover</w:t>
+      </w:r>
+      <w:r>
+        <w:rPr>
+          <w:rFonts w:ascii="Times New Roman" w:hAnsi="Times New Roman"/>
+          <w:kern w:val="0"/>
+        </w:rPr>
+        <w:t xml:space="preserve"> and </w:t>
+      </w:r>
+      <w:r>
+        <w:rPr>
+          <w:rFonts w:ascii="Courier New" w:hAnsi="Courier New" w:cs="Courier New"/>
+          <w:kern w:val="0"/>
+          <w:sz w:val="20"/>
+          <w:szCs w:val="20"/>
+        </w:rPr>
+        <w:t>aspect-ratio</w:t>
+      </w:r>
+      <w:r>
+        <w:rPr>
+          <w:rFonts w:ascii="Times New Roman" w:hAnsi="Times New Roman"/>
+          <w:kern w:val="0"/>
+        </w:rPr>
+        <w:t xml:space="preserve"> to keep product images responsive and consistent across all screen sizes.</w:t>
+      </w:r>
+    </w:p>
+    <w:p>
+      <w:pPr>
+        <w:spacing w:after="100" w:afterAutospacing="1" w:line="240" w:lineRule="auto"/>
+        <w:rPr>
+          <w:rFonts w:ascii="Times New Roman" w:hAnsi="Times New Roman"/>
+          <w:kern w:val="0"/>
+        </w:rPr>
+      </w:pPr>
+      <w:r>
+        <w:rPr>
+          <w:rFonts w:ascii="Times New Roman" w:hAnsi="Times New Roman"/>
+          <w:kern w:val="0"/>
+        </w:rPr>
+        <w:t>This task gave me a practical understanding of how real e-commerce pages are built to work on any device.</w:t>
       </w:r>
     </w:p>
     <w:p>
@@ -7437,6 +8825,164 @@
       </w:pPr>
       <w:rPr>
         <w:rFonts w:ascii="Times New Roman" w:hAnsi="Times New Roman" w:cs="Times New Roman" w:hint="default"/>
+      </w:rPr>
+    </w:lvl>
+  </w:abstractNum>
+  <w:abstractNum w:abstractNumId="4" w15:restartNumberingAfterBreak="0">
+    <w:nsid w:val="73874BCE"/>
+    <w:multiLevelType w:val="multilevel"/>
+    <w:tmpl w:val="B6EC2D02"/>
+    <w:lvl w:ilvl="0">
+      <w:start w:val="1"/>
+      <w:numFmt w:val="bullet"/>
+      <w:lvlText w:val=""/>
+      <w:lvlJc w:val="left"/>
+      <w:pPr>
+        <w:tabs>
+          <w:tab w:val="num" w:pos="720"/>
+        </w:tabs>
+        <w:ind w:left="720" w:hanging="360"/>
+      </w:pPr>
+      <w:rPr>
+        <w:rFonts w:ascii="Symbol" w:hAnsi="Symbol" w:hint="default"/>
+        <w:sz w:val="20"/>
+        <w:szCs w:val="20"/>
+      </w:rPr>
+    </w:lvl>
+    <w:lvl w:ilvl="1">
+      <w:start w:val="1"/>
+      <w:numFmt w:val="bullet"/>
+      <w:lvlText w:val="o"/>
+      <w:lvlJc w:val="left"/>
+      <w:pPr>
+        <w:tabs>
+          <w:tab w:val="num" w:pos="1440"/>
+        </w:tabs>
+        <w:ind w:left="1440" w:hanging="360"/>
+      </w:pPr>
+      <w:rPr>
+        <w:rFonts w:ascii="Courier New" w:hAnsi="Courier New" w:cs="Courier New" w:hint="default"/>
+        <w:sz w:val="20"/>
+        <w:szCs w:val="20"/>
+      </w:rPr>
+    </w:lvl>
+    <w:lvl w:ilvl="2">
+      <w:start w:val="1"/>
+      <w:numFmt w:val="bullet"/>
+      <w:lvlText w:val=""/>
+      <w:lvlJc w:val="left"/>
+      <w:pPr>
+        <w:tabs>
+          <w:tab w:val="num" w:pos="2160"/>
+        </w:tabs>
+        <w:ind w:left="2160" w:hanging="360"/>
+      </w:pPr>
+      <w:rPr>
+        <w:rFonts w:ascii="Wingdings" w:hAnsi="Wingdings" w:hint="default"/>
+        <w:sz w:val="20"/>
+        <w:szCs w:val="20"/>
+      </w:rPr>
+    </w:lvl>
+    <w:lvl w:ilvl="3">
+      <w:start w:val="1"/>
+      <w:numFmt w:val="bullet"/>
+      <w:lvlText w:val=""/>
+      <w:lvlJc w:val="left"/>
+      <w:pPr>
+        <w:tabs>
+          <w:tab w:val="num" w:pos="2880"/>
+        </w:tabs>
+        <w:ind w:left="2880" w:hanging="360"/>
+      </w:pPr>
+      <w:rPr>
+        <w:rFonts w:ascii="Wingdings" w:hAnsi="Wingdings" w:hint="default"/>
+        <w:sz w:val="20"/>
+        <w:szCs w:val="20"/>
+      </w:rPr>
+    </w:lvl>
+    <w:lvl w:ilvl="4">
+      <w:start w:val="1"/>
+      <w:numFmt w:val="bullet"/>
+      <w:lvlText w:val=""/>
+      <w:lvlJc w:val="left"/>
+      <w:pPr>
+        <w:tabs>
+          <w:tab w:val="num" w:pos="3600"/>
+        </w:tabs>
+        <w:ind w:left="3600" w:hanging="360"/>
+      </w:pPr>
+      <w:rPr>
+        <w:rFonts w:ascii="Wingdings" w:hAnsi="Wingdings" w:hint="default"/>
+        <w:sz w:val="20"/>
+        <w:szCs w:val="20"/>
+      </w:rPr>
+    </w:lvl>
+    <w:lvl w:ilvl="5">
+      <w:start w:val="1"/>
+      <w:numFmt w:val="bullet"/>
+      <w:lvlText w:val=""/>
+      <w:lvlJc w:val="left"/>
+      <w:pPr>
+        <w:tabs>
+          <w:tab w:val="num" w:pos="4320"/>
+        </w:tabs>
+        <w:ind w:left="4320" w:hanging="360"/>
+      </w:pPr>
+      <w:rPr>
+        <w:rFonts w:ascii="Wingdings" w:hAnsi="Wingdings" w:hint="default"/>
+        <w:sz w:val="20"/>
+        <w:szCs w:val="20"/>
+      </w:rPr>
+    </w:lvl>
+    <w:lvl w:ilvl="6">
+      <w:start w:val="1"/>
+      <w:numFmt w:val="bullet"/>
+      <w:lvlText w:val=""/>
+      <w:lvlJc w:val="left"/>
+      <w:pPr>
+        <w:tabs>
+          <w:tab w:val="num" w:pos="5040"/>
+        </w:tabs>
+        <w:ind w:left="5040" w:hanging="360"/>
+      </w:pPr>
+      <w:rPr>
+        <w:rFonts w:ascii="Wingdings" w:hAnsi="Wingdings" w:hint="default"/>
+        <w:sz w:val="20"/>
+        <w:szCs w:val="20"/>
+      </w:rPr>
+    </w:lvl>
+    <w:lvl w:ilvl="7">
+      <w:start w:val="1"/>
+      <w:numFmt w:val="bullet"/>
+      <w:lvlText w:val=""/>
+      <w:lvlJc w:val="left"/>
+      <w:pPr>
+        <w:tabs>
+          <w:tab w:val="num" w:pos="5760"/>
+        </w:tabs>
+        <w:ind w:left="5760" w:hanging="360"/>
+      </w:pPr>
+      <w:rPr>
+        <w:rFonts w:ascii="Wingdings" w:hAnsi="Wingdings" w:hint="default"/>
+        <w:sz w:val="20"/>
+        <w:szCs w:val="20"/>
+      </w:rPr>
+    </w:lvl>
+    <w:lvl w:ilvl="8">
+      <w:start w:val="1"/>
+      <w:numFmt w:val="bullet"/>
+      <w:lvlText w:val=""/>
+      <w:lvlJc w:val="left"/>
+      <w:pPr>
+        <w:tabs>
+          <w:tab w:val="num" w:pos="6480"/>
+        </w:tabs>
+        <w:ind w:left="6480" w:hanging="360"/>
+      </w:pPr>
+      <w:rPr>
+        <w:rFonts w:ascii="Wingdings" w:hAnsi="Wingdings" w:hint="default"/>
+        <w:sz w:val="20"/>
+        <w:szCs w:val="20"/>
       </w:rPr>
     </w:lvl>
   </w:abstractNum>
@@ -7475,18 +9021,12 @@
   </w:num>
   <w:num w:numId="3">
     <w:abstractNumId w:val="1"/>
-    <w:lvlOverride w:ilvl="0"/>
-    <w:lvlOverride w:ilvl="1"/>
-    <w:lvlOverride w:ilvl="2"/>
-    <w:lvlOverride w:ilvl="3"/>
-    <w:lvlOverride w:ilvl="4"/>
-    <w:lvlOverride w:ilvl="5"/>
-    <w:lvlOverride w:ilvl="6"/>
-    <w:lvlOverride w:ilvl="7"/>
-    <w:lvlOverride w:ilvl="8"/>
   </w:num>
   <w:num w:numId="4">
     <w:abstractNumId w:val="2"/>
+  </w:num>
+  <w:num w:numId="5">
+    <w:abstractNumId w:val="4"/>
     <w:lvlOverride w:ilvl="0"/>
     <w:lvlOverride w:ilvl="1"/>
     <w:lvlOverride w:ilvl="2"/>
@@ -8544,7 +10084,7 @@
 </file>
 
 <file path=customXml/itemProps1.xml><?xml version="1.0" encoding="utf-8"?>
-<ds:datastoreItem xmlns:ds="http://schemas.openxmlformats.org/officeDocument/2006/customXml" ds:itemID="{BE414B2F-4AE2-4198-95D5-C8579D8DD01F}">
+<ds:datastoreItem xmlns:ds="http://schemas.openxmlformats.org/officeDocument/2006/customXml" ds:itemID="{73AF82CF-2621-4317-9C20-CABA350B0554}">
   <ds:schemaRefs>
     <ds:schemaRef ds:uri="http://schemas.openxmlformats.org/officeDocument/2006/bibliography"/>
   </ds:schemaRefs>

</xml_diff>